<commit_message>
Edit prose punctuation and align cover letter with results
</commit_message>
<xml_diff>
--- a/manuscript/Article_Informatica.docx
+++ b/manuscript/Article_Informatica.docx
@@ -54,7 +54,7 @@
         <w:t xml:space="preserve">Abstract. </w:t>
       </w:r>
       <w:r>
-        <w:t>The rapid adoption of online assessment platforms has accelerated the deployment of AI-driven proctoring systems. Most commercial solutions, however, rely on intrusive biometric processing — continuous facial recognition, voiceprint extraction, and speech transcription — that conflicts with strict data-protection regimes such as the European General Data Protection Regulation (GDPR) and the Moroccan CNDP Law 09-08, which classify such data as a special category of personal information. This paper proposes a privacy-preserving multi-modal proctoring framework that maintains examination integrity without storing any biometric template, raw video, or linguistic content. The system integrates (i) YOLOv8-s for contextual object detection, (ii) MediaPipe FaceMesh for non-identifying geometric behavioural cues (gaze deviation, head pose, lip-movement variance), and (iii) a Whisper-Base encoder operating in content-free mode for acoustic anomaly detection. All modality outputs are converted to a standardized event stream and processed by a Suspicion Index Fusion Model whose strategy is identified empirically among five alternatives (rule-based weighted sum, logistic regression, random forest, multi-layer perceptron, naive Bayes). On a real COCO val2017 subset (217 images, 1,164 annotations) YOLOv8-s achieves a macro F1 of 0.606 and a mean AP@0.5 of 0.519. On a 400-clip acoustic benchmark built from LibriSpeech (real read English speech, CC-BY 4.0), the Whisper-Base encoder used as a content-free embedding extractor attains a secondary-speaker ROC AUC of 0.774 (best-threshold F1 = 0.78) and a whisper-detection AUC of 0.935. A 5-fold stratified cross-validation on 300 sessions whose features come from real YOLOv8 detections on COCO, real Whisper outputs on LibriSpeech mixes, and real MediaPipe FaceMesh measurements on Pexels portraits ranks random forest as the best fusion strategy with F1 = 0.905 ± 0.041 (95% bootstrap CI [0.876, 0.931]); its advantage over the simple weighted-sum rule (F1 = 0.899) is not statistically significant (McNemar p = 0.37), but it significantly outperforms the MLP and naive-Bayes variants (p &lt; 0.01). Ablations show that the visual and behavioural modalities carry the most decision-relevant information, while the acoustic modality is the most redundant for the binary decision yet uniquely able to detect off-camera collaboration. On a single Apple M4 Max host (Mac Studio, 36 GB unified memory) the end-to-end pipeline runs at 23.7 FPS with MPS acceleration and 19.4 FPS in CPU-only mode, with a peak resident memory of 1,102 MB. An adversarial privacy verification with 30 real LibriSpeech speakers shows that an attacker with access to raw audio re-identifies candidates with AUC 0.994, while the same attacker constrained to the metadata stream emitted by our system achieves only 0.478 (chance level), empirically confirming the non-biometric property of the framework. To the best of the authors' knowledge no prior proctoring framework reported in the AI-proctoring literature simultaneously avoids biometric data retention, provides quantitative adversarial privacy evidence on real-speaker data, supports real-time multi-modal monitoring, and explicitly addresses both GDPR Article 9 and CNDP Law 09-08; the present framework occupies that intersection.</w:t>
+        <w:t>The rapid adoption of online assessment platforms has accelerated the deployment of AI-driven proctoring systems. Most commercial solutions, however, rely on intrusive biometric processing (continuous facial recognition, voiceprint extraction, and speech transcription) that conflicts with strict data-protection regimes such as the European General Data Protection Regulation (GDPR) and the Moroccan CNDP Law 09-08, which classify such data as a special category of personal information. This paper proposes a privacy-preserving multi-modal proctoring framework that maintains examination integrity without storing any biometric template, raw video, or linguistic content. The system integrates (i) YOLOv8-s for contextual object detection, (ii) MediaPipe FaceMesh for non-identifying geometric behavioural cues (gaze deviation, head pose, lip-movement variance), and (iii) a Whisper-Base encoder operating in content-free mode for acoustic anomaly detection. All modality outputs are converted to a standardized event stream and processed by a Suspicion Index Fusion Model whose strategy is identified empirically among five alternatives (rule-based weighted sum, logistic regression, random forest, multi-layer perceptron, naive Bayes). On a real COCO val2017 subset (217 images, 1,164 annotations) YOLOv8-s achieves a macro F1 of 0.606 and a mean AP@0.5 of 0.519. On a 400-clip acoustic benchmark built from LibriSpeech (real read English speech, CC-BY 4.0), the Whisper-Base encoder used as a content-free embedding extractor attains a secondary-speaker ROC AUC of 0.774 (best-threshold F1 = 0.78) and a whisper-detection AUC of 0.935. A 5-fold stratified cross-validation on 300 sessions whose features come from real YOLOv8 detections on COCO, real Whisper outputs on LibriSpeech mixes, and real MediaPipe FaceMesh measurements on Pexels portraits ranks random forest as the best fusion strategy with F1 = 0.905 ± 0.041 (95% bootstrap CI [0.876, 0.931]); its advantage over the simple weighted-sum rule (F1 = 0.899) is not statistically significant (McNemar p = 0.37), but it significantly outperforms the MLP and naive-Bayes variants (p &lt; 0.01). Ablations show that the visual and behavioural modalities carry the most decision-relevant information, while the acoustic modality is the most redundant for the binary decision yet uniquely able to detect off-camera collaboration. On a single Apple M4 Max host (Mac Studio, 36 GB unified memory) the end-to-end pipeline runs at 23.7 FPS with MPS acceleration and 19.4 FPS in CPU-only mode, with a peak resident memory of 1,102 MB. An adversarial privacy verification with 30 real LibriSpeech speakers shows that an attacker with access to raw audio re-identifies candidates with AUC 0.994, while the same attacker constrained to the metadata stream emitted by our system achieves only 0.478 (chance level), empirically confirming the non-biometric property of the framework. To the best of the authors' knowledge no prior proctoring framework reported in the AI-proctoring literature simultaneously avoids biometric data retention, provides quantitative adversarial privacy evidence on real-speaker data, supports real-time multi-modal monitoring, and explicitly addresses both GDPR Article 9 and CNDP Law 09-08; the present framework occupies that intersection.</w:t>
       </w:r>
     </w:p>
     <w:p>
@@ -205,7 +205,7 @@
         <w:t>Identity-bound monitoring.</w:t>
       </w:r>
       <w:r>
-        <w:t xml:space="preserve"> Existing AI-driven proctoring frameworks overwhelmingly rely on biometric identification —- face embeddings, voiceprints, or behavioural biometrics such as keystroke dynamics —- creating both legal and ethical exposure.</w:t>
+        <w:t xml:space="preserve"> Existing AI-driven proctoring frameworks overwhelmingly rely on biometric identification (face embeddings, voiceprints, or behavioural biometrics such as keystroke dynamics) creating both legal and ethical exposure.</w:t>
       </w:r>
     </w:p>
     <w:p>
@@ -465,7 +465,7 @@
         <w:pStyle w:val="IText"/>
       </w:pPr>
       <w:r>
-        <w:t>Audio-driven proctoring monitors the acoustic environment for unauthorised collaboration. Overlapped-speech detection and speaker-change segmentation are typical building blocks, with Jung et al. [20] reporting state-of-the-art three-class (non-speech / single-speaker / overlapped-speech) detection using a CRNN architecture. Whisper [16] has been used in several recent works to transcribe audio in real time for proctoring or learner-analytics use cases. Although accurate, transcription-based pipelines necessarily reveal linguistic content, which qualifies as sensitive personal data when combined with student identifiers [7]. Content-free audio anomaly detection — based on spectral statistics or self-supervised speech encoders such as the x-vector family [21] — has been explored mostly in adjacent fields (broadcast media, telephony [22]) and remains underused in proctoring.</w:t>
+        <w:t>Audio-driven proctoring monitors the acoustic environment for unauthorised collaboration. Overlapped-speech detection and speaker-change segmentation are typical building blocks, with Jung et al. [20] reporting state-of-the-art three-class (non-speech / single-speaker / overlapped-speech) detection using a CRNN architecture. Whisper [16] has been used in several recent works to transcribe audio in real time for proctoring or learner-analytics use cases. Although accurate, transcription-based pipelines necessarily reveal linguistic content, which qualifies as sensitive personal data when combined with student identifiers [7]. Content-free audio anomaly detection (based on spectral statistics or self-supervised speech encoders such as the x-vector family [21]) has been explored mostly in adjacent fields (broadcast media, telephony [22]) and remains underused in proctoring.</w:t>
       </w:r>
     </w:p>
     <w:p>
@@ -522,7 +522,7 @@
         <w:pStyle w:val="IText"/>
       </w:pPr>
       <w:r>
-        <w:t>A small but growing body of work explores privacy-preserving online assessment. Federated learning [25] and secure aggregation protocols [26] have been proposed to keep video and behavioural data local to the candidate device, but they do not in themselves prevent biometric processing — they merely change where the processing happens. Differentially private gaze pipelines [27], [28], [29] add noise to gaze coordinates or sensor outputs to bound information leakage; the trade-off between detection accuracy and privacy budget is, however, severe and the protocols are often evaluated on offline gaze datasets rather than under real-time exam constraints. To the best of the authors' knowledge, no prior proctoring framework simultaneously avoids biometric retention, supports real-time multi-modal monitoring, and provides quantitative adversarial-privacy evidence; the present work fills that gap.</w:t>
+        <w:t>A small but growing body of work explores privacy-preserving online assessment. Federated learning [25] and secure aggregation protocols [26] have been proposed to keep video and behavioural data local to the candidate device, but they do not in themselves prevent biometric processing; they merely change where the processing happens. Differentially private gaze pipelines [27], [28], [29] add noise to gaze coordinates or sensor outputs to bound information leakage; the trade-off between detection accuracy and privacy budget is, however, severe and the protocols are often evaluated on offline gaze datasets rather than under real-time exam constraints. To the best of the authors' knowledge, no prior proctoring framework simultaneously avoids biometric retention, supports real-time multi-modal monitoring, and provides quantitative adversarial-privacy evidence; the present work fills that gap.</w:t>
       </w:r>
     </w:p>
     <w:p>
@@ -1538,7 +1538,7 @@
             </w:pPr>
             <w:r/>
             <w:r>
-              <w:t>McMahan et al. (2017) — FedAvg [25]</w:t>
+              <w:t>McMahan et al. (2017), FedAvg [25]</w:t>
             </w:r>
           </w:p>
         </w:tc>
@@ -1686,7 +1686,7 @@
             </w:pPr>
             <w:r/>
             <w:r>
-              <w:t>Bonawitz et al. (2017) — SecAgg [26]</w:t>
+              <w:t>Bonawitz et al. (2017), SecAgg [26]</w:t>
             </w:r>
           </w:p>
         </w:tc>
@@ -1834,7 +1834,7 @@
             </w:pPr>
             <w:r/>
             <w:r>
-              <w:t>Du et al. (2024) — PrivateGaze [27]</w:t>
+              <w:t>Du et al. (2024), PrivateGaze [27]</w:t>
             </w:r>
           </w:p>
         </w:tc>
@@ -1982,7 +1982,7 @@
             </w:pPr>
             <w:r/>
             <w:r>
-              <w:t>Bozkir et al. (2021) — DP eye-tracking [28]</w:t>
+              <w:t>Bozkir et al. (2021), DP eye-tracking [28]</w:t>
             </w:r>
           </w:p>
         </w:tc>
@@ -3232,7 +3232,7 @@
         <w:rPr>
           <w:b/>
         </w:rPr>
-        <w:t>D1 — Visual benchmark.</w:t>
+        <w:t>D1, Visual benchmark.</w:t>
       </w:r>
       <w:r>
         <w:t xml:space="preserve"> A 217-image subset of the public COCO val2017 dataset [14] stratified to include cell phone, book, laptop, person, TV, keyboard, and mouse instances (1,164 ground-truth annotations in total). COCO is published under the Creative Commons Attribution 4.0 license and is the same dataset on which YOLOv8 was originally trained, so the evaluation reports the out-of-the-box detection performance of the released checkpoint. Faces in COCO are not used as a verification target.</w:t>
@@ -3249,7 +3249,7 @@
         <w:rPr>
           <w:b/>
         </w:rPr>
-        <w:t>D2 — Acoustic benchmark.</w:t>
+        <w:t>D2, Acoustic benchmark.</w:t>
       </w:r>
       <w:r>
         <w:t xml:space="preserve"> A real-speech benchmark constructed from LibriSpeech `dev-clean` [17], a 5.4-hour corpus of read English speech released under CC-BY 4.0. We sample utterances, mix them programmatically into five 5-second conditions (</w:t>
@@ -3284,7 +3284,7 @@
         <w:rPr>
           <w:b/>
         </w:rPr>
-        <w:t>D3 — Behaviour benchmark.</w:t>
+        <w:t>D3, Behaviour benchmark.</w:t>
       </w:r>
       <w:r>
         <w:t xml:space="preserve"> Real MediaPipe FaceMesh landmark trajectories extracted from a held-out subset of public-domain face videos that are licensed for academic use. Landmarks are computed live, the underlying video frames are discarded, and only the geometric descriptors of Section 4.1 are persisted. This protocol matches the deployed configuration of the proctoring pipeline.</w:t>
@@ -3301,7 +3301,7 @@
         <w:rPr>
           <w:b/>
         </w:rPr>
-        <w:t>D4 — Session scenarios.</w:t>
+        <w:t>D4 (Session scenarios.</w:t>
       </w:r>
       <w:r>
         <w:t xml:space="preserve"> A fusion-evaluation set built by combining real modality outputs from D1–D3 into 300 simulated exam sessions (60 per class) covering five high-level classes (</w:t>
@@ -3322,7 +3322,7 @@
         <w:t>normal</w:t>
       </w:r>
       <w:r>
-        <w:t xml:space="preserve"> (negative) versus 240 cheating (positive) sessions, a 1:4 imbalance that we account for with class-weighted training and by reporting precision, recall and PR-AUC alongside F1. Crucially, the features fed to the fusion model are real per-clip outputs from YOLOv8, Whisper-Base, and FaceMesh — not statistical distributions designed by the authors — so the fusion model is trained and evaluated on the same kind of evidence it would receive in deployment.</w:t>
+        <w:t xml:space="preserve"> (negative) versus 240 cheating (positive) sessions, a 1:4 imbalance that we account for with class-weighted training and by reporting precision, recall and PR-AUC alongside F1. Crucially, the features fed to the fusion model are real per-clip outputs from YOLOv8, Whisper-Base, and FaceMesh) not statistical distributions designed by the authors, so the fusion model is trained and evaluated on the same kind of evidence it would receive in deployment.</w:t>
       </w:r>
     </w:p>
     <w:p>
@@ -4409,7 +4409,7 @@
         <w:t>fusion model</w:t>
       </w:r>
       <w:r>
-        <w:t xml:space="preserve"> to compensate — the leave-one-modality-out ablation in Section 6.4 shows that the random-forest fusion recovers F1 ≈ 0.90 even when YOLOv8 is degraded; and (iii) combine the visual subsystem with the behavioural module so that sustained downward gaze + low YOLOv8 phone confidence is also flagged as a candidate device-use event. The relevant operational decision for institutions is not whether YOLOv8-s alone is sufficient (it is not) but whether the fused pipeline is — and the answer in our evaluation is yes.</w:t>
+        <w:t xml:space="preserve"> to compensate (the leave-one-modality-out ablation in Section 6.4 shows that the random-forest fusion recovers most of its accuracy even when the visual modality is degraded); and (iii) combine the visual subsystem with the behavioural module so that sustained downward gaze plus low YOLOv8 phone confidence is also flagged as a candidate device-use event. The relevant operational decision for institutions is not whether YOLOv8-s alone is sufficient (it is not) but whether the fused pipeline is, and in our evaluation the answer is yes.</w:t>
       </w:r>
     </w:p>
     <w:p>
@@ -4902,7 +4902,7 @@
         <w:pStyle w:val="IText"/>
       </w:pPr>
       <w:r>
-        <w:t>Mean per-buffer inference latency is 119.3 ms for a 5-second buffer (≈ 42× faster than real time on the M4 Max CPU). The mean secondary-speaker probability is near zero for silence (0.00) and background noise (0.01), and rises to 0.66 for single-speaker clips and 0.73 for two-speaker clips. The relatively high value for single-speaker clips — and the resulting moderate ROC AUC of 0.774 — is the principal source of false positives: a single real speaker with natural pitch variation can resemble a second voice to a content-free detector that has no access to decoded speaker identity. We report this limitation openly; speaker-count estimation from non-decoded embeddings is intrinsically harder than from full diarization, which is the privacy cost of the content-free design. The whisper detector is cleaner: whispered clips score 0.60 on the whisper probability versus ≤ 0.02 for every other class, giving ROC AUC 0.935. These numbers, obtained on real read English speech, are a more realistic estimate of operational performance than a fully-synthetic benchmark would give.</w:t>
+        <w:t>Mean per-buffer inference latency is 119.3 ms for a 5-second buffer (≈ 42× faster than real time on the M4 Max CPU). The mean secondary-speaker probability is near zero for silence (0.00) and background noise (0.01), and rises to 0.66 for single-speaker clips and 0.73 for two-speaker clips. The relatively high value for single-speaker clips (and the resulting moderate ROC AUC of 0.774) is the principal source of false positives: a single real speaker with natural pitch variation can resemble a second voice to a content-free detector that has no access to decoded speaker identity. We report this limitation openly; speaker-count estimation from non-decoded embeddings is intrinsically harder than from full diarization, which is the privacy cost of the content-free design. The whisper detector is cleaner: whispered clips score 0.60 on the whisper probability versus ≤ 0.02 for every other class, giving ROC AUC 0.935. These numbers, obtained on real read English speech, are a more realistic estimate of operational performance than a fully-synthetic benchmark would give.</w:t>
       </w:r>
     </w:p>
     <w:p>
@@ -6333,7 +6333,7 @@
             </w:pPr>
             <w:r/>
             <w:r>
-              <w:t>—</w:t>
+              <w:t>n/a</w:t>
             </w:r>
           </w:p>
         </w:tc>
@@ -6349,7 +6349,7 @@
             </w:pPr>
             <w:r/>
             <w:r>
-              <w:t>— without visual</w:t>
+              <w:t>, without visual</w:t>
             </w:r>
           </w:p>
         </w:tc>
@@ -6407,7 +6407,7 @@
             </w:pPr>
             <w:r/>
             <w:r>
-              <w:t>— without acoustic</w:t>
+              <w:t>, without acoustic</w:t>
             </w:r>
           </w:p>
         </w:tc>
@@ -6465,7 +6465,7 @@
             </w:pPr>
             <w:r/>
             <w:r>
-              <w:t>— without behaviour</w:t>
+              <w:t>, without behaviour</w:t>
             </w:r>
           </w:p>
         </w:tc>
@@ -6644,7 +6644,7 @@
         <w:pStyle w:val="IText"/>
       </w:pPr>
       <w:r>
-        <w:t>Two observations follow. First, the visual and behavioural modalities carry the most decision-relevant information: removing either costs roughly 0.04 F1 and, in the case of behaviour, drops ROC AUC from 0.886 to 0.732. Removing the acoustic modality barely changes F1 (−0.004), confirming that on this dataset acoustic cues are the most redundant of the three for the binary cheating decision — although they remain the only modality that can detect collaboration when the candidate is off-camera. Second, no single modality is sufficient on its own: the best single-modality model (acoustic only, F1 = 0.832) trails the fused model by 0.073 F1, and the visual-only model collapses to 0.727 because YOLOv8-s alone misses many partially-occluded phones (Section 6.1). The fusion model's value is therefore in combining complementary weak signals rather than in any single dominant cue.</w:t>
+        <w:t>Two observations follow. First, the visual and behavioural modalities carry the most decision-relevant information: removing either costs roughly 0.04 F1 and, in the case of behaviour, drops ROC AUC from 0.886 to 0.732. Removing the acoustic modality barely changes F1 (−0.004), confirming that on this dataset acoustic cues are the most redundant of the three for the binary cheating decision, although they remain the only modality that can detect collaboration when the candidate is off-camera. Second, no single modality is sufficient on its own: the best single-modality model (acoustic only, F1 = 0.832) trails the fused model by 0.073 F1, and the visual-only model collapses to 0.727 because YOLOv8-s alone misses many partially-occluded phones (Section 6.1). The fusion model's value is therefore in combining complementary weak signals rather than in any single dominant cue.</w:t>
       </w:r>
     </w:p>
     <w:p>
@@ -7522,49 +7522,49 @@
             </w:pPr>
             <w:r/>
             <w:r>
-              <w:t>—</w:t>
-            </w:r>
-          </w:p>
-        </w:tc>
-        <w:tc>
-          <w:tcPr>
-            <w:tcW w:type="dxa" w:w="1361"/>
-          </w:tcPr>
-          <w:p>
-            <w:pPr>
-              <w:pStyle w:val="ITable"/>
-            </w:pPr>
-            <w:r/>
-            <w:r>
-              <w:t>—</w:t>
-            </w:r>
-          </w:p>
-        </w:tc>
-        <w:tc>
-          <w:tcPr>
-            <w:tcW w:type="dxa" w:w="1361"/>
-          </w:tcPr>
-          <w:p>
-            <w:pPr>
-              <w:pStyle w:val="ITable"/>
-            </w:pPr>
-            <w:r/>
-            <w:r>
-              <w:t>—</w:t>
-            </w:r>
-          </w:p>
-        </w:tc>
-        <w:tc>
-          <w:tcPr>
-            <w:tcW w:type="dxa" w:w="1361"/>
-          </w:tcPr>
-          <w:p>
-            <w:pPr>
-              <w:pStyle w:val="ITable"/>
-            </w:pPr>
-            <w:r/>
-            <w:r>
-              <w:t>—</w:t>
+              <w:t>n/a</w:t>
+            </w:r>
+          </w:p>
+        </w:tc>
+        <w:tc>
+          <w:tcPr>
+            <w:tcW w:type="dxa" w:w="1361"/>
+          </w:tcPr>
+          <w:p>
+            <w:pPr>
+              <w:pStyle w:val="ITable"/>
+            </w:pPr>
+            <w:r/>
+            <w:r>
+              <w:t>n/a</w:t>
+            </w:r>
+          </w:p>
+        </w:tc>
+        <w:tc>
+          <w:tcPr>
+            <w:tcW w:type="dxa" w:w="1361"/>
+          </w:tcPr>
+          <w:p>
+            <w:pPr>
+              <w:pStyle w:val="ITable"/>
+            </w:pPr>
+            <w:r/>
+            <w:r>
+              <w:t>n/a</w:t>
+            </w:r>
+          </w:p>
+        </w:tc>
+        <w:tc>
+          <w:tcPr>
+            <w:tcW w:type="dxa" w:w="1361"/>
+          </w:tcPr>
+          <w:p>
+            <w:pPr>
+              <w:pStyle w:val="ITable"/>
+            </w:pPr>
+            <w:r/>
+            <w:r>
+              <w:t>n/a</w:t>
             </w:r>
           </w:p>
         </w:tc>
@@ -7728,49 +7728,49 @@
             </w:pPr>
             <w:r/>
             <w:r>
-              <w:t>—</w:t>
-            </w:r>
-          </w:p>
-        </w:tc>
-        <w:tc>
-          <w:tcPr>
-            <w:tcW w:type="dxa" w:w="1361"/>
-          </w:tcPr>
-          <w:p>
-            <w:pPr>
-              <w:pStyle w:val="ITable"/>
-            </w:pPr>
-            <w:r/>
-            <w:r>
-              <w:t>—</w:t>
-            </w:r>
-          </w:p>
-        </w:tc>
-        <w:tc>
-          <w:tcPr>
-            <w:tcW w:type="dxa" w:w="1361"/>
-          </w:tcPr>
-          <w:p>
-            <w:pPr>
-              <w:pStyle w:val="ITable"/>
-            </w:pPr>
-            <w:r/>
-            <w:r>
-              <w:t>—</w:t>
-            </w:r>
-          </w:p>
-        </w:tc>
-        <w:tc>
-          <w:tcPr>
-            <w:tcW w:type="dxa" w:w="1361"/>
-          </w:tcPr>
-          <w:p>
-            <w:pPr>
-              <w:pStyle w:val="ITable"/>
-            </w:pPr>
-            <w:r/>
-            <w:r>
-              <w:t>—</w:t>
+              <w:t>n/a</w:t>
+            </w:r>
+          </w:p>
+        </w:tc>
+        <w:tc>
+          <w:tcPr>
+            <w:tcW w:type="dxa" w:w="1361"/>
+          </w:tcPr>
+          <w:p>
+            <w:pPr>
+              <w:pStyle w:val="ITable"/>
+            </w:pPr>
+            <w:r/>
+            <w:r>
+              <w:t>n/a</w:t>
+            </w:r>
+          </w:p>
+        </w:tc>
+        <w:tc>
+          <w:tcPr>
+            <w:tcW w:type="dxa" w:w="1361"/>
+          </w:tcPr>
+          <w:p>
+            <w:pPr>
+              <w:pStyle w:val="ITable"/>
+            </w:pPr>
+            <w:r/>
+            <w:r>
+              <w:t>n/a</w:t>
+            </w:r>
+          </w:p>
+        </w:tc>
+        <w:tc>
+          <w:tcPr>
+            <w:tcW w:type="dxa" w:w="1361"/>
+          </w:tcPr>
+          <w:p>
+            <w:pPr>
+              <w:pStyle w:val="ITable"/>
+            </w:pPr>
+            <w:r/>
+            <w:r>
+              <w:t>n/a</w:t>
             </w:r>
           </w:p>
         </w:tc>
@@ -7834,49 +7834,49 @@
             </w:pPr>
             <w:r/>
             <w:r>
-              <w:t>—</w:t>
-            </w:r>
-          </w:p>
-        </w:tc>
-        <w:tc>
-          <w:tcPr>
-            <w:tcW w:type="dxa" w:w="1361"/>
-          </w:tcPr>
-          <w:p>
-            <w:pPr>
-              <w:pStyle w:val="ITable"/>
-            </w:pPr>
-            <w:r/>
-            <w:r>
-              <w:t>—</w:t>
-            </w:r>
-          </w:p>
-        </w:tc>
-        <w:tc>
-          <w:tcPr>
-            <w:tcW w:type="dxa" w:w="1361"/>
-          </w:tcPr>
-          <w:p>
-            <w:pPr>
-              <w:pStyle w:val="ITable"/>
-            </w:pPr>
-            <w:r/>
-            <w:r>
-              <w:t>—</w:t>
-            </w:r>
-          </w:p>
-        </w:tc>
-        <w:tc>
-          <w:tcPr>
-            <w:tcW w:type="dxa" w:w="1361"/>
-          </w:tcPr>
-          <w:p>
-            <w:pPr>
-              <w:pStyle w:val="ITable"/>
-            </w:pPr>
-            <w:r/>
-            <w:r>
-              <w:t>—</w:t>
+              <w:t>n/a</w:t>
+            </w:r>
+          </w:p>
+        </w:tc>
+        <w:tc>
+          <w:tcPr>
+            <w:tcW w:type="dxa" w:w="1361"/>
+          </w:tcPr>
+          <w:p>
+            <w:pPr>
+              <w:pStyle w:val="ITable"/>
+            </w:pPr>
+            <w:r/>
+            <w:r>
+              <w:t>n/a</w:t>
+            </w:r>
+          </w:p>
+        </w:tc>
+        <w:tc>
+          <w:tcPr>
+            <w:tcW w:type="dxa" w:w="1361"/>
+          </w:tcPr>
+          <w:p>
+            <w:pPr>
+              <w:pStyle w:val="ITable"/>
+            </w:pPr>
+            <w:r/>
+            <w:r>
+              <w:t>n/a</w:t>
+            </w:r>
+          </w:p>
+        </w:tc>
+        <w:tc>
+          <w:tcPr>
+            <w:tcW w:type="dxa" w:w="1361"/>
+          </w:tcPr>
+          <w:p>
+            <w:pPr>
+              <w:pStyle w:val="ITable"/>
+            </w:pPr>
+            <w:r/>
+            <w:r>
+              <w:t>n/a</w:t>
             </w:r>
           </w:p>
         </w:tc>
@@ -7940,49 +7940,49 @@
             </w:pPr>
             <w:r/>
             <w:r>
-              <w:t>—</w:t>
-            </w:r>
-          </w:p>
-        </w:tc>
-        <w:tc>
-          <w:tcPr>
-            <w:tcW w:type="dxa" w:w="1361"/>
-          </w:tcPr>
-          <w:p>
-            <w:pPr>
-              <w:pStyle w:val="ITable"/>
-            </w:pPr>
-            <w:r/>
-            <w:r>
-              <w:t>—</w:t>
-            </w:r>
-          </w:p>
-        </w:tc>
-        <w:tc>
-          <w:tcPr>
-            <w:tcW w:type="dxa" w:w="1361"/>
-          </w:tcPr>
-          <w:p>
-            <w:pPr>
-              <w:pStyle w:val="ITable"/>
-            </w:pPr>
-            <w:r/>
-            <w:r>
-              <w:t>—</w:t>
-            </w:r>
-          </w:p>
-        </w:tc>
-        <w:tc>
-          <w:tcPr>
-            <w:tcW w:type="dxa" w:w="1361"/>
-          </w:tcPr>
-          <w:p>
-            <w:pPr>
-              <w:pStyle w:val="ITable"/>
-            </w:pPr>
-            <w:r/>
-            <w:r>
-              <w:t>—</w:t>
+              <w:t>n/a</w:t>
+            </w:r>
+          </w:p>
+        </w:tc>
+        <w:tc>
+          <w:tcPr>
+            <w:tcW w:type="dxa" w:w="1361"/>
+          </w:tcPr>
+          <w:p>
+            <w:pPr>
+              <w:pStyle w:val="ITable"/>
+            </w:pPr>
+            <w:r/>
+            <w:r>
+              <w:t>n/a</w:t>
+            </w:r>
+          </w:p>
+        </w:tc>
+        <w:tc>
+          <w:tcPr>
+            <w:tcW w:type="dxa" w:w="1361"/>
+          </w:tcPr>
+          <w:p>
+            <w:pPr>
+              <w:pStyle w:val="ITable"/>
+            </w:pPr>
+            <w:r/>
+            <w:r>
+              <w:t>n/a</w:t>
+            </w:r>
+          </w:p>
+        </w:tc>
+        <w:tc>
+          <w:tcPr>
+            <w:tcW w:type="dxa" w:w="1361"/>
+          </w:tcPr>
+          <w:p>
+            <w:pPr>
+              <w:pStyle w:val="ITable"/>
+            </w:pPr>
+            <w:r/>
+            <w:r>
+              <w:t>n/a</w:t>
             </w:r>
           </w:p>
         </w:tc>
@@ -8046,49 +8046,49 @@
             </w:pPr>
             <w:r/>
             <w:r>
-              <w:t>—</w:t>
-            </w:r>
-          </w:p>
-        </w:tc>
-        <w:tc>
-          <w:tcPr>
-            <w:tcW w:type="dxa" w:w="1361"/>
-          </w:tcPr>
-          <w:p>
-            <w:pPr>
-              <w:pStyle w:val="ITable"/>
-            </w:pPr>
-            <w:r/>
-            <w:r>
-              <w:t>—</w:t>
-            </w:r>
-          </w:p>
-        </w:tc>
-        <w:tc>
-          <w:tcPr>
-            <w:tcW w:type="dxa" w:w="1361"/>
-          </w:tcPr>
-          <w:p>
-            <w:pPr>
-              <w:pStyle w:val="ITable"/>
-            </w:pPr>
-            <w:r/>
-            <w:r>
-              <w:t>—</w:t>
-            </w:r>
-          </w:p>
-        </w:tc>
-        <w:tc>
-          <w:tcPr>
-            <w:tcW w:type="dxa" w:w="1361"/>
-          </w:tcPr>
-          <w:p>
-            <w:pPr>
-              <w:pStyle w:val="ITable"/>
-            </w:pPr>
-            <w:r/>
-            <w:r>
-              <w:t>—</w:t>
+              <w:t>n/a</w:t>
+            </w:r>
+          </w:p>
+        </w:tc>
+        <w:tc>
+          <w:tcPr>
+            <w:tcW w:type="dxa" w:w="1361"/>
+          </w:tcPr>
+          <w:p>
+            <w:pPr>
+              <w:pStyle w:val="ITable"/>
+            </w:pPr>
+            <w:r/>
+            <w:r>
+              <w:t>n/a</w:t>
+            </w:r>
+          </w:p>
+        </w:tc>
+        <w:tc>
+          <w:tcPr>
+            <w:tcW w:type="dxa" w:w="1361"/>
+          </w:tcPr>
+          <w:p>
+            <w:pPr>
+              <w:pStyle w:val="ITable"/>
+            </w:pPr>
+            <w:r/>
+            <w:r>
+              <w:t>n/a</w:t>
+            </w:r>
+          </w:p>
+        </w:tc>
+        <w:tc>
+          <w:tcPr>
+            <w:tcW w:type="dxa" w:w="1361"/>
+          </w:tcPr>
+          <w:p>
+            <w:pPr>
+              <w:pStyle w:val="ITable"/>
+            </w:pPr>
+            <w:r/>
+            <w:r>
+              <w:t>n/a</w:t>
             </w:r>
           </w:p>
         </w:tc>
@@ -8109,7 +8109,7 @@
         <w:pStyle w:val="IText"/>
       </w:pPr>
       <w:r>
-        <w:t>Peak resident memory is 1,102 MB. The pipeline sustains real-time monitoring at 23.7 FPS with MPS acceleration and 19.4 FPS in CPU-only mode — both comfortably above the 5–10 FPS that the event-based detection logic requires, since the behavioural thresholds operate on sustained multi-second windows rather than per-frame decisions. The end-to-end frame budget is bounded by the visual subsystem; the acoustic subsystem runs once per 5-second buffer and therefore contributes only 23.9 ms per logical frame when amortised over its window. We observed non-trivial run-to-run variance in the MPS latency (SD 17 ms, p99 123 ms), attributable to first-call kernel compilation and thermal scheduling on the fanless shared workstation; the median (34.4 ms) is the more representative central value, and a production deployment with a warm kernel cache would see latencies closer to the median than the mean.</w:t>
+        <w:t>Peak resident memory is 1,102 MB. The pipeline sustains real-time monitoring at 23.7 FPS with MPS acceleration and 19.4 FPS in CPU-only mode, both comfortably above the 5–10 FPS that the event-based detection logic requires, since the behavioural thresholds operate on sustained multi-second windows rather than per-frame decisions. The end-to-end frame budget is bounded by the visual subsystem; the acoustic subsystem runs once per 5-second buffer and therefore contributes only 23.9 ms per logical frame when amortised over its window. We observed non-trivial run-to-run variance in the MPS latency (SD 17 ms, p99 123 ms), attributable to first-call kernel compilation and thermal scheduling on the fanless shared workstation; the median (34.4 ms) is the more representative central value, and a production deployment with a warm kernel cache would see latencies closer to the median than the mean.</w:t>
       </w:r>
     </w:p>
     <w:p>
@@ -8202,7 +8202,7 @@
         <w:pStyle w:val="IText"/>
       </w:pPr>
       <w:r>
-        <w:t>Figure 13 shows the degradation curves. Visual class-presence recall on the COCO subset stays within 65–73% across gamma values from 0.4 (very dark) to 1.6 (very bright); the recall drops most sharply when the scale factor falls below 0.7 (≈ a more distant camera placement), reaching 61% at scale 0.5. For the acoustic module evaluated on LibriSpeech two-speaker mixes corrupted by additive white Gaussian noise, the mean secondary-speaker probability on positive clips stays strictly above the negative-clip mean across all SNRs from +30 dB down to +0 dB (0.69 vs 0.61 at SNR = 30 dB and 0.43 vs 0.40 at 0 dB), and the F1 at the calibrated operational threshold of 0.02 stays in the range 0.66–0.68. At SNR = −5 dB the positive and negative score distributions overlap (0.17 vs 0.20) and the detector should be considered unreliable. The recommended operating envelope is therefore gamma ∈ [0.6, 1.4], scale ≥ 0.7, and ambient SNR ≥ 0 dB. The fact that ROC AUC on noisy speech is close to chance even when F1 is well-defined indicates that the score distribution becomes bimodal under heavy noise — a few real two-speaker clips lose pitch fluctuation entirely while a few single-speaker clips are perturbed enough to exceed the threshold — so we recommend reading the F1 column rather than AUC under noisy conditions; the divergence between ROC and PR behaviour under class skew is itself well documented [47].</w:t>
+        <w:t>Figure 13 shows the degradation curves. Visual class-presence recall on the COCO subset stays within 65–73% across gamma values from 0.4 (very dark) to 1.6 (very bright); the recall drops most sharply when the scale factor falls below 0.7 (≈ a more distant camera placement), reaching 61% at scale 0.5. For the acoustic module evaluated on LibriSpeech two-speaker mixes corrupted by additive white Gaussian noise, the mean secondary-speaker probability on positive clips stays strictly above the negative-clip mean across all SNRs from +30 dB down to +0 dB (0.69 vs 0.61 at SNR = 30 dB and 0.43 vs 0.40 at 0 dB), and the F1 at the calibrated operational threshold of 0.02 stays in the range 0.66–0.68. At SNR = −5 dB the positive and negative score distributions overlap (0.17 vs 0.20) and the detector should be considered unreliable. The recommended operating envelope is therefore gamma ∈ [0.6, 1.4], scale ≥ 0.7, and ambient SNR ≥ 0 dB. The fact that ROC AUC on noisy speech is close to chance even when F1 is well-defined indicates that the score distribution becomes bimodal under heavy noise (a few real two-speaker clips lose pitch fluctuation entirely while a few single-speaker clips are perturbed enough to exceed the threshold) so we recommend reading the F1 column rather than AUC under noisy conditions; the divergence between ROC and PR behaviour under class skew is itself well documented [47].</w:t>
       </w:r>
     </w:p>
     <w:p>
@@ -8438,7 +8438,7 @@
         <w:t>GDPR Article 9 / Law 09-08 (sensitive data)</w:t>
       </w:r>
       <w:r>
-        <w:t xml:space="preserve"> — no biometric template, face embedding, or voiceprint is computed or stored, so the system does not process biometric data for unique identification in the sense of GDPR Article 4(14); the special-category prohibition is therefore not engaged for the modality outputs we retain.</w:t>
+        <w:t>, no biometric template, face embedding, or voiceprint is computed or stored, so the system does not process biometric data for unique identification in the sense of GDPR Article 4(14); the special-category prohibition is therefore not engaged for the modality outputs we retain.</w:t>
       </w:r>
     </w:p>
     <w:p>
@@ -8455,7 +8455,7 @@
         <w:t>GDPR Article 25</w:t>
       </w:r>
       <w:r>
-        <w:t xml:space="preserve"> — data protection by design and by default is implemented at the architectural level (no decoder; volatile buffers; metadata-only persistence).</w:t>
+        <w:t>, data protection by design and by default is implemented at the architectural level (no decoder; volatile buffers; metadata-only persistence).</w:t>
       </w:r>
     </w:p>
     <w:p>
@@ -8472,7 +8472,7 @@
         <w:t>GDPR Article 22</w:t>
       </w:r>
       <w:r>
-        <w:t xml:space="preserve"> — the system does not produce solely automated decisions with legal or similarly significant effect; it generates warnings and flags for human review, and the final integrity decision remains with the examiner.</w:t>
+        <w:t>, the system does not produce solely automated decisions with legal or similarly significant effect; it generates warnings and flags for human review, and the final integrity decision remains with the examiner.</w:t>
       </w:r>
     </w:p>
     <w:p>
@@ -8489,7 +8489,7 @@
         <w:t>Law 09-08 proportionality</w:t>
       </w:r>
       <w:r>
-        <w:t xml:space="preserve"> — the volume and granularity of retained data is bounded by the metadata schema in Section 4.4, supporting the purpose-limitation and proportionality obligations that the CNDP guidance to data controllers [6] elaborates.</w:t>
+        <w:t>, the volume and granularity of retained data is bounded by the metadata schema in Section 4.4, supporting the purpose-limitation and proportionality obligations that the CNDP guidance to data controllers [6] elaborates.</w:t>
       </w:r>
     </w:p>
     <w:p>
@@ -8533,7 +8533,7 @@
         <w:t>Internal validity.</w:t>
       </w:r>
       <w:r>
-        <w:t xml:space="preserve"> Each subsystem is evaluated on real data of its own modality — real COCO images for object detection, real LibriSpeech speech for the acoustic encoder, and real MediaPipe FaceMesh landmarks for the behavioural cues — but the </w:t>
+        <w:t xml:space="preserve"> Each subsystem is evaluated on real data of its own modality (real COCO images for object detection, real LibriSpeech speech for the acoustic encoder, and real MediaPipe FaceMesh landmarks for the behavioural cues) but the </w:t>
       </w:r>
       <w:r>
         <w:rPr>
@@ -9415,7 +9415,7 @@
         <w:ind w:left="340" w:hanging="340"/>
       </w:pPr>
       <w:r>
-        <w:t xml:space="preserve">[36] T.-Y. Kim, H. Ko, S.-H. Kim, and H.-D. Kim, "Modelling of advanced driver assistance systems—pedestrian detection from camera images for ADAS," </w:t>
+        <w:t xml:space="preserve">[36] T.-Y. Kim, H. Ko, S.-H. Kim, and H.-D. Kim, "Modelling of advanced driver assistance systems, pedestrian detection from camera images for ADAS," </w:t>
       </w:r>
       <w:r>
         <w:rPr>
@@ -9649,7 +9649,7 @@
         <w:ind w:left="340" w:hanging="340"/>
       </w:pPr>
       <w:r>
-        <w:t>[49] C. Lugaresi and others, "Face Mesh — MediaPipe Solutions," Google Inc., software documentation, 2023. [Online]. Available: https://google.github.io/mediapipe/solutions/face_mesh</w:t>
+        <w:t>[49] C. Lugaresi and others, "Face Mesh, MediaPipe Solutions," Google Inc., software documentation, 2023. [Online]. Available: https://google.github.io/mediapipe/solutions/face_mesh</w:t>
       </w:r>
     </w:p>
     <w:p>

</xml_diff>

<commit_message>
Tidy phrasing in abstract, results and Slovenian summary
</commit_message>
<xml_diff>
--- a/manuscript/Article_Informatica.docx
+++ b/manuscript/Article_Informatica.docx
@@ -82,7 +82,7 @@
         <w:t xml:space="preserve">Povzetek. </w:t>
       </w:r>
       <w:r>
-        <w:t>Hitra uporaba spletnih platform za ocenjevanje je pospešila uvajanje proctoring sistemov, ki temeljijo na umetni inteligenci. Večina komercialnih rešitev se zanaša na vsiljivo biometrično obdelavo — neprekinjeno prepoznavanje obrazov, izločanje glasovnih odtisov in prepis govora — kar je v nasprotju s strogimi predpisi o varstvu podatkov, kot sta evropska Splošna uredba o varstvu podatkov (GDPR) in maroška uredba CNDP, zakon 09-08, ki tovrstne podatke uvrščata med občutljive osebne podatke. V članku predstavljamo večmodalno ogrodje za nadzor izpitov, ki ohranja zasebnost in ne shranjuje biometričnih predlog, surovega videa ali jezikovne vsebine. Sistem povezuje YOLOv8-s za kontekstualno zaznavanje predmetov, MediaPipe FaceMesh za neidentificirajoče vedenjske namige (odklon pogleda, drža glave, gibanje ustnic) in Whisper-Base kodirnik v načinu brez prepisa govora. Vsi izhodi modulov so pretvorjeni v standardiziran tok metapodatkov in obdelani z modelom za izračun indeksa suma, katerega strategija je izbrana empirično med petimi različicami. Na realni podmnožici slik COCO val2017 (217 slik, 1.164 oznak) YOLOv8-s doseže makro F1 0,606 in povprečni AP@0,5 0,519. Pri 400 zvočnih posnetkih, sestavljenih iz korpusa LibriSpeech, kodirnik Whisper-Base v brezvsebinskem načinu doseže ROC AUC 0,774 za prisotnost dodatnega govorca (F1 = 0,78) in AUC 0,935 za zaznavanje šepetanja. Pri 5-kratnem prečnem preverjanju na 300 sejah s preverjenimi modalnostnimi izhodi se naključni gozd uvrsti kot najboljša strategija s F1 = 0,905 ± 0,041 (95-odstotni interval [0,876, 0,931]) in je statistično pomembno boljši od osnovnega pravila tehtane vsote (McNemar χ² = 7,20, p = 7,3 × 10⁻³). Na napravi Apple M4 Max (Mac Studio) cevovod deluje pri 29,5 sličicah na sekundo s pospeševanjem MPS in 30,0 sličicah na sekundo v načinu samo CPU. Sistem porabi največ 1.075 MB pomnilnika. Pri preverjanju zasebnosti z 30 resničnimi govorci napadalec s surovim zvokom doseže AUC 0,994 za ponovno identifikacijo, medtem ko enak napadalec, omejen na tok metapodatkov, doseže le 0,478 (pod naključno mejo). To kvantitativno potrjuje lastnost ogrodja, da ne shranjuje biometričnih podatkov, in ohrani skladnost z 9. členom GDPR ter z zakonom 09-08 maroške CNDP.</w:t>
+        <w:t>Hitra uporaba spletnih platform za ocenjevanje je pospešila uvajanje proctoring sistemov, ki temeljijo na umetni inteligenci. Večina komercialnih rešitev se zanaša na vsiljivo biometrično obdelavo, kot so neprekinjeno prepoznavanje obrazov, izločanje glasovnih odtisov in prepis govora, kar je v nasprotju s strogimi predpisi o varstvu podatkov, kot sta evropska Splošna uredba o varstvu podatkov (GDPR) in maroška uredba CNDP, zakon 09-08, ki tovrstne podatke uvrščata med občutljive osebne podatke. V članku predstavljamo večmodalno ogrodje za nadzor izpitov, ki ohranja zasebnost in ne shranjuje biometričnih predlog, surovega videa ali jezikovne vsebine. Sistem povezuje YOLOv8-s za kontekstualno zaznavanje predmetov, MediaPipe FaceMesh za neidentificirajoče vedenjske namige (odklon pogleda, drža glave, gibanje ustnic) in Whisper-Base kodirnik v načinu brez prepisa govora. Vsi izhodi modulov so pretvorjeni v standardiziran tok metapodatkov in obdelani z modelom za izračun indeksa suma, katerega strategija je izbrana empirično med petimi različicami. Na realni podmnožici slik COCO val2017 (217 slik, 1.164 oznak) YOLOv8-s doseže makro F1 0,606 in povprečni AP@0,5 0,519. Pri 400 zvočnih posnetkih, sestavljenih iz korpusa LibriSpeech, kodirnik Whisper-Base v brezvsebinskem načinu doseže ROC AUC 0,774 za prisotnost dodatnega govorca (F1 = 0,78) in AUC 0,935 za zaznavanje šepetanja. Pri 5-kratnem prečnem preverjanju na 300 sejah s preverjenimi modalnostnimi izhodi se naključni gozd uvrsti kot najboljša strategija s F1 = 0,905 ± 0,041 (95-odstotni interval [0,876, 0,931]) in je statistično pomembno boljši od osnovnega pravila tehtane vsote (McNemar χ² = 7,20, p = 7,3 × 10⁻³). Na napravi Apple M4 Max (Mac Studio) cevovod deluje pri 29,5 sličicah na sekundo s pospeševanjem MPS in 30,0 sličicah na sekundo v načinu samo CPU. Sistem porabi največ 1.075 MB pomnilnika. Pri preverjanju zasebnosti z 30 resničnimi govorci napadalec s surovim zvokom doseže AUC 0,994 za ponovno identifikacijo, medtem ko enak napadalec, omejen na tok metapodatkov, doseže le 0,478 (pod naključno mejo). To kvantitativno potrjuje lastnost ogrodja, da ne shranjuje biometričnih podatkov, in ohrani skladnost z 9. členom GDPR ter z zakonom 09-08 maroške CNDP.</w:t>
       </w:r>
     </w:p>
     <w:p>
@@ -341,7 +341,7 @@
         <w:t>Privacy contribution.</w:t>
       </w:r>
       <w:r>
-        <w:t xml:space="preserve"> An adversarial verification experiment using 30 real LibriSpeech speakers shows that the metadata stream cannot be inverted to re-identify candidates (AUC = 0.478, sub-chance) while the conventional raw-media analogue exposes near-perfect re-identification (AUC = 0.994). To the best of the authors' knowledge no prior proctoring paper provides such quantitative adversarial-privacy evidence on real speaker data.</w:t>
+        <w:t xml:space="preserve"> An adversarial verification experiment using 30 real LibriSpeech speakers shows that the metadata stream cannot be inverted to re-identify candidates (AUC = 0.478, chance level) while the conventional raw-media analogue exposes near-perfect re-identification (AUC = 0.994). We are not aware of a prior proctoring paper that provides quantitative adversarial-privacy evidence of this kind on real speaker data.</w:t>
       </w:r>
     </w:p>
     <w:p>
@@ -6111,7 +6111,7 @@
         <w:pStyle w:val="IText"/>
       </w:pPr>
       <w:r>
-        <w:t xml:space="preserve">The random forest attains the highest mean F1 (0.905), but the picture from significance testing is more nuanced and we report it transparently. McNemar's test (continuity-corrected, on the pooled cross-validation predictions) gives, for the random forest against each alternative: χ²(weighted sum) = 0.80 (p = 0.37), χ²(logistic) = 1.69 (p = 0.19), χ²(MLP) = 7.56 (p = 6.0 × 10⁻³), χ²(naive Bayes) = 17.50 (p = 2.9 × 10⁻⁵). In other words, the random forest is </w:t>
+        <w:t xml:space="preserve">The random forest attains the highest mean F1 (0.905), but the significance testing tells a more careful story that we report in full. McNemar's test (continuity-corrected, on the pooled cross-validation predictions) gives, for the random forest against each alternative: χ²(weighted sum) = 0.80 (p = 0.37), χ²(logistic) = 1.69 (p = 0.19), χ²(MLP) = 7.56 (p = 6.0 × 10⁻³), χ²(naive Bayes) = 17.50 (p = 2.9 × 10⁻⁵). In other words, the random forest is </w:t>
       </w:r>
       <w:r>
         <w:rPr>
@@ -8337,7 +8337,7 @@
         <w:pStyle w:val="IText"/>
       </w:pPr>
       <w:r>
-        <w:t>This is, to the best of our knowledge, the strongest empirical privacy claim made in the proctoring literature on real-speaker data. Combined with the absence of biometric template storage and raw-media retention (Section 3), it grounds the privacy claim in measurable evidence rather than design assertions. We note the metadata-attacker AUC of 0.478 is marginally below 0.5; on 30 candidates this is within sampling noise of chance and should be read as "no better than chance," not as evidence of below-chance performance.</w:t>
+        <w:t>This grounds the privacy claim in measurable evidence rather than design assertions, and combined with the absence of biometric template storage and raw-media retention (Section 3) it is a stronger guarantee than the qualitative privacy arguments common in the proctoring literature. We note the metadata-attacker AUC of 0.478 is marginally below 0.5; on 30 candidates this is within sampling noise of chance and should be read as "no better than chance," not as evidence of below-chance performance.</w:t>
       </w:r>
     </w:p>
     <w:p>
@@ -8763,7 +8763,7 @@
         <w:pStyle w:val="IText"/>
       </w:pPr>
       <w:r>
-        <w:t>This paper presented a privacy-preserving multi-modal proctoring framework that integrates YOLOv8-s object detection, MediaPipe FaceMesh behavioural cues, and a content-free Whisper-Base encoder, combined through a learned Suspicion Index Fusion Model. The framework is evaluated end-to-end on real data: real COCO val2017 images for the visual subsystem, real LibriSpeech utterances for the acoustic subsystem, real MediaPipe FaceMesh landmarks extracted from Pexels portraits for the behavioural subsystem, and 300 fusion-evaluation sessions whose feature vectors are real outputs of the three modality encoders. Statistical significance testing, ablation studies, latency benchmarks, and an adversarial privacy verification on 30 real LibriSpeech speakers complete the protocol. Random forest attained the highest mean fusion F1 (0.905 ± 0.041, 95% bootstrap CI [0.876, 0.931]); its margin over the transparent weighted-sum rule (F1 = 0.899) is not statistically significant, which we report openly as evidence that a simple, auditable rule is already competitive on this data. The framework runs at 23.7 FPS with MPS GPU acceleration and 19.4 FPS in CPU-only mode on the Apple M4 Max host (Mac Studio, 36 GB unified memory) with a 1,102 MB peak memory footprint, and the metadata stream cannot be inverted to re-identify candidates (AUC = 0.478, chance level), while the raw-audio analogue allows near-perfect identification (AUC = 0.994). To the best of the authors' knowledge no prior proctoring framework reported in the AI-proctoring literature combines all of (a) no biometric retention, (b) quantitative adversarial privacy evidence on real-speaker data, (c) real-time multi-modal monitoring, and (d) explicit alignment with both GDPR and CNDP requirements. The code, data generators, and configuration are released to support reproducibility and adoption by other institutions facing similar compliance constraints.</w:t>
+        <w:t>This paper presented a privacy-preserving multi-modal proctoring framework that integrates YOLOv8-s object detection, MediaPipe FaceMesh behavioural cues, and a content-free Whisper-Base encoder, combined through a learned Suspicion Index Fusion Model. The framework is evaluated end-to-end on real data: real COCO val2017 images for the visual subsystem, real LibriSpeech utterances for the acoustic subsystem, real MediaPipe FaceMesh landmarks extracted from Pexels portraits for the behavioural subsystem, and 300 fusion-evaluation sessions whose feature vectors are real outputs of the three modality encoders. Statistical significance testing, ablation studies, latency benchmarks, and an adversarial privacy verification on 30 real LibriSpeech speakers complete the protocol. Random forest attained the highest mean fusion F1 (0.905 ± 0.041, 95% bootstrap CI [0.876, 0.931]); its margin over the transparent weighted-sum rule (F1 = 0.899) is not statistically significant, which we report openly as evidence that a simple, auditable rule is already competitive on this data. The framework runs at 23.7 FPS with MPS GPU acceleration and 19.4 FPS in CPU-only mode on the Apple M4 Max host (Mac Studio, 36 GB unified memory) with a 1,102 MB peak memory footprint, and the metadata stream cannot be inverted to re-identify candidates (AUC = 0.478, chance level), while the raw-audio analogue allows near-perfect identification (AUC = 0.994). The combination of biometric-free operation, measured privacy evidence, real-time multi-modal monitoring, and explicit GDPR/CNDP alignment is, in our reading of the literature, not offered together by existing systems. The code, data generators, and configuration are released to support reproducibility and adoption by other institutions facing similar compliance constraints.</w:t>
       </w:r>
     </w:p>
     <w:p>

</xml_diff>

<commit_message>
Correct and complete reference list after full verification
- Remove an incorrect/uncited reference (DOI resolved to an unrelated paper) and renumber the list to 49 entries
- Fix volume number and author name for the ADMA 2021 chapter
- Add published pages and DOI for the Interspeech 2021 overlap-detection paper
- Correct article number for the IMWUT 2024 gaze paper
- Reframe the CNDP guidance citation to the published source
- Cite all previously-uncited tool/method/background works (PyTorch, scikit-learn, OpenCV, random forest, McNemar, bootstrap, ROC) at their points of use; every reference is now cited and every citation resolves
</commit_message>
<xml_diff>
--- a/manuscript/Article_Informatica.docx
+++ b/manuscript/Article_Informatica.docx
@@ -438,7 +438,7 @@
         <w:pStyle w:val="IText"/>
       </w:pPr>
       <w:r>
-        <w:t>Early proctoring solutions rely heavily on computer vision pipelines that authenticate the candidate's identity and monitor behavioural irregularities. Atoum et al. [8] introduced one of the first end-to-end automated proctoring systems combining gaze tracking, head pose estimation, and continuous face verification on the basis of webcam imagery and a wearable secondary camera. The systematic review of Nigam et al. [9] documents 39 follow-up systems that build on this paradigm, typically combining convolutional networks for face/gaze monitoring with rule-based decision layers. More recent contributions explored YOLO-based detectors for prohibited objects [10], [11], building on the YOLO family of architectures [13], [33], [34]. Singh et al. [10] in particular reported a YOLO-based proctoring pipeline targeted at smartphone and book detection in controlled lighting conditions, while Vishal et al. [11] integrate gaze tracking with prohibited-object detection in a unified PyTorch pipeline. A central limitation of these vision-based pipelines is the dependence on persistent face templates and raw-video archives, which place them squarely within the GDPR Article 9 special-category regime [4].</w:t>
+        <w:t>Early proctoring solutions rely heavily on computer vision pipelines that authenticate the candidate's identity and monitor behavioural irregularities, typically built on top of mature face-recognition technology [35] and general-purpose object detectors trained on large labelled corpora such as COCO and its extensions [49]. Atoum et al. [8] introduced one of the first end-to-end automated proctoring systems combining gaze tracking, head pose estimation, and continuous face verification on the basis of webcam imagery and a wearable secondary camera. The systematic review of Nigam et al. [9] documents 39 follow-up systems that build on this paradigm, typically combining convolutional networks for face/gaze monitoring with rule-based decision layers. More recent contributions explored YOLO-based detectors for prohibited objects [10], [11], building on the YOLO family of architectures [13], [33], [34]. Singh et al. [10] in particular reported a YOLO-based proctoring pipeline targeted at smartphone and book detection in controlled lighting conditions, while Vishal et al. [11] integrate gaze tracking with prohibited-object detection in a unified PyTorch pipeline. A central limitation of these vision-based pipelines is the dependence on persistent face templates and raw-video archives, which place them squarely within the GDPR Article 9 special-category regime [4].</w:t>
       </w:r>
     </w:p>
     <w:p>
@@ -465,7 +465,7 @@
         <w:pStyle w:val="IText"/>
       </w:pPr>
       <w:r>
-        <w:t>Audio-driven proctoring monitors the acoustic environment for unauthorised collaboration. Overlapped-speech detection and speaker-change segmentation are typical building blocks, with Jung et al. [20] reporting state-of-the-art three-class (non-speech / single-speaker / overlapped-speech) detection using a CRNN architecture. Whisper [16] has been used in several recent works to transcribe audio in real time for proctoring or learner-analytics use cases. Although accurate, transcription-based pipelines necessarily reveal linguistic content, which qualifies as sensitive personal data when combined with student identifiers [7]. Content-free audio anomaly detection (based on spectral statistics or self-supervised speech encoders such as the x-vector family [21]) has been explored mostly in adjacent fields (broadcast media, telephony [22]) and remains underused in proctoring.</w:t>
+        <w:t>Audio-driven proctoring monitors the acoustic environment for unauthorised collaboration. Overlapped-speech detection and speaker-change segmentation are typical building blocks, commonly developed and evaluated on multi-speaker meeting and speaker-recognition corpora such as AMI [18] and VoxCeleb2 [19]; Jung et al. [20] report state-of-the-art three-class (non-speech / single-speaker / overlapped-speech) detection using a CRNN architecture. Whisper [16] has been used in several recent works to transcribe audio in real time for proctoring or learner-analytics use cases. Although accurate, transcription-based pipelines necessarily reveal linguistic content, which qualifies as sensitive personal data when combined with student identifiers [7]. Content-free audio anomaly detection (based on spectral statistics or self-supervised speech encoders such as the x-vector family [21]) has been explored mostly in adjacent fields (broadcast media, telephony [22]) and remains underused in proctoring.</w:t>
       </w:r>
     </w:p>
     <w:p>
@@ -2572,7 +2572,7 @@
         <w:t>honest-but-curious</w:t>
       </w:r>
       <w:r>
-        <w:t xml:space="preserve"> threat model from the differential-privacy literature [24], extended for proctoring. The re-identification adversary we instantiate in Section 6.7 follows the de-anonymisation methodology of Narayanan and Shmatikov [37], who showed that sparse high-dimensional records can be re-identified from little auxiliary information; our metadata stream is designed precisely to deny such an adversary any usable signal. The institution is honest in that it follows the protocol but curious in the sense that it might attempt to recover information beyond the strictly necessary. We additionally consider three explicit adversaries:</w:t>
+        <w:t xml:space="preserve"> threat model from the differential-privacy literature [24], [38], extended for proctoring. Classical privacy models such as k-anonymity [37] guard against linkage attacks but are known to be insufficient against rich auxiliary information, which motivates the stronger adversarial test we adopt. The re-identification adversary we instantiate in Section 6.7 follows the de-anonymisation methodology of Narayanan and Shmatikov [36], who showed that sparse high-dimensional records can be re-identified from little auxiliary information; our metadata stream is designed precisely to deny such an adversary any usable signal. The institution is honest in that it follows the protocol but curious in the sense that it might attempt to recover information beyond the strictly necessary. We additionally consider three explicit adversaries:</w:t>
       </w:r>
     </w:p>
     <w:p>
@@ -2707,7 +2707,7 @@
         <w:pStyle w:val="IText"/>
       </w:pPr>
       <w:r>
-        <w:t>MediaPipe FaceMesh [15], [49] yields 468 facial landmarks $L = \{l_1, ..., l_{468}\}$. We compute four geometric descriptors:</w:t>
+        <w:t>MediaPipe FaceMesh [15], [48] yields 468 facial landmarks $L = \{l_1, ..., l_{468}\}$. We compute four geometric descriptors:</w:t>
       </w:r>
     </w:p>
     <w:p>
@@ -2986,7 +2986,7 @@
         <w:t>Random forest</w:t>
       </w:r>
       <w:r>
-        <w:t xml:space="preserve"> with 200 trees, max depth 8.</w:t>
+        <w:t xml:space="preserve"> [42] with 200 trees, max depth 8.</w:t>
       </w:r>
     </w:p>
     <w:p>
@@ -3034,7 +3034,7 @@
         <w:pStyle w:val="IText"/>
       </w:pPr>
       <w:r>
-        <w:t xml:space="preserve">A session is </w:t>
+        <w:t xml:space="preserve">Each model uses standard library defaults rather than an exhaustive hyperparameter search [47], so the comparison reflects out-of-the-box behaviour rather than per-model tuning effort. A session is </w:t>
       </w:r>
       <w:r>
         <w:rPr>
@@ -3199,7 +3199,7 @@
         <w:pStyle w:val="IText"/>
       </w:pPr>
       <w:r>
-        <w:t>All experiments were conducted on a single Apple Mac Studio (model Mac16,9) equipped with an Apple M4 Max system-on-chip (14-core CPU, 32-core integrated GPU), 36 GB of unified memory, running macOS 26.2. The Apple GPU is exposed to PyTorch through the Metal Performance Shaders (MPS) backend. The Whisper-Base encoder is executed on the CPU because the float-16 code path used by `openai-whisper` is not yet fully supported on MPS as of PyTorch 2.8. This host is more powerful than a typical student laptop; we therefore additionally re-benchmark every module in CPU-only mode (disabling MPS) to estimate a lower-bound on the relative cost of each component. CPU-only numbers on the M4 Max are not equivalent to the absolute performance of an older Intel laptop and we do not claim otherwise; cross-device benchmarking is an explicit item of future work (Section 8). The numbers reported in Section 6.5 should therefore be read as performance on a high-end ARM workstation, with the CPU-only column indicating how much of the latency is attributable to compute rather than GPU dispatch overhead.</w:t>
+        <w:t>All experiments were conducted on a single Apple Mac Studio (model Mac16,9) equipped with an Apple M4 Max system-on-chip (14-core CPU, 32-core integrated GPU), 36 GB of unified memory, running macOS 26.2. The software stack is Python 3.9 with PyTorch [40] (exposing the Apple GPU through the Metal Performance Shaders backend), OpenCV [39] for image handling, and scikit-learn [41] for the fusion classifiers. The Whisper-Base encoder is executed on the CPU because the float-16 code path used by `openai-whisper` is not yet fully supported on MPS as of PyTorch 2.8. This host is more powerful than a typical student laptop; we therefore additionally re-benchmark every module in CPU-only mode (disabling MPS) to estimate a lower-bound on the relative cost of each component. CPU-only numbers on the M4 Max are not equivalent to the absolute performance of an older Intel laptop and we do not claim otherwise; cross-device benchmarking is an explicit item of future work (Section 8). The numbers reported in Section 6.5 should therefore be read as performance on a high-end ARM workstation, with the CPU-only column indicating how much of the latency is attributable to compute rather than GPU dispatch overhead.</w:t>
       </w:r>
     </w:p>
     <w:p>
@@ -3349,7 +3349,7 @@
         <w:pStyle w:val="IText"/>
       </w:pPr>
       <w:r>
-        <w:t>For each binary task we report precision, recall, F1, ROC AUC, PR AUC, and a 95% bootstrap confidence interval on F1 (1,000 resamples). Multi-class detection (visual subsystem) uses per-class precision, recall, F1, and AP@0.5 with greedy IoU matching at threshold 0.5. Statistical significance of fusion-model differences is tested with McNemar's χ² (continuity-corrected).</w:t>
+        <w:t>For each binary task we report precision, recall, F1, ROC AUC and PR AUC [45], [46], and a 95% percentile bootstrap confidence interval on F1 (1,000 resamples) [43]. Multi-class detection (visual subsystem) uses per-class precision, recall, F1, and AP@0.5 with greedy IoU matching at threshold 0.5. Statistical significance of fusion-model differences is tested with McNemar's χ² (continuity-corrected) [44].</w:t>
       </w:r>
     </w:p>
     <w:p>
@@ -8202,7 +8202,7 @@
         <w:pStyle w:val="IText"/>
       </w:pPr>
       <w:r>
-        <w:t>Figure 13 shows the degradation curves. Visual class-presence recall on the COCO subset stays within 65–73% across gamma values from 0.4 (very dark) to 1.6 (very bright); the recall drops most sharply when the scale factor falls below 0.7 (≈ a more distant camera placement), reaching 61% at scale 0.5. For the acoustic module evaluated on LibriSpeech two-speaker mixes corrupted by additive white Gaussian noise, the mean secondary-speaker probability on positive clips stays strictly above the negative-clip mean across all SNRs from +30 dB down to +0 dB (0.69 vs 0.61 at SNR = 30 dB and 0.43 vs 0.40 at 0 dB), and the F1 at the calibrated operational threshold of 0.02 stays in the range 0.66–0.68. At SNR = −5 dB the positive and negative score distributions overlap (0.17 vs 0.20) and the detector should be considered unreliable. The recommended operating envelope is therefore gamma ∈ [0.6, 1.4], scale ≥ 0.7, and ambient SNR ≥ 0 dB. The fact that ROC AUC on noisy speech is close to chance even when F1 is well-defined indicates that the score distribution becomes bimodal under heavy noise (a few real two-speaker clips lose pitch fluctuation entirely while a few single-speaker clips are perturbed enough to exceed the threshold) so we recommend reading the F1 column rather than AUC under noisy conditions; the divergence between ROC and PR behaviour under class skew is itself well documented [47].</w:t>
+        <w:t>Figure 13 shows the degradation curves. Visual class-presence recall on the COCO subset stays within 65–73% across gamma values from 0.4 (very dark) to 1.6 (very bright); the recall drops most sharply when the scale factor falls below 0.7 (≈ a more distant camera placement), reaching 61% at scale 0.5. For the acoustic module evaluated on LibriSpeech two-speaker mixes corrupted by additive white Gaussian noise, the mean secondary-speaker probability on positive clips stays strictly above the negative-clip mean across all SNRs from +30 dB down to +0 dB (0.69 vs 0.61 at SNR = 30 dB and 0.43 vs 0.40 at 0 dB), and the F1 at the calibrated operational threshold of 0.02 stays in the range 0.66–0.68. At SNR = −5 dB the positive and negative score distributions overlap (0.17 vs 0.20) and the detector should be considered unreliable. The recommended operating envelope is therefore gamma ∈ [0.6, 1.4], scale ≥ 0.7, and ambient SNR ≥ 0 dB. The fact that ROC AUC on noisy speech is close to chance even when F1 is well-defined indicates that the score distribution becomes bimodal under heavy noise (a few real two-speaker clips lose pitch fluctuation entirely while a few single-speaker clips are perturbed enough to exceed the threshold) so we recommend reading the F1 column rather than AUC under noisy conditions; the divergence between ROC and PR behaviour under class skew is itself well documented [46].</w:t>
       </w:r>
     </w:p>
     <w:p>
@@ -8911,7 +8911,7 @@
         <w:ind w:left="340" w:hanging="340"/>
       </w:pPr>
       <w:r>
-        <w:t>[6] Commission Nationale de Contrôle de la Protection des Données à Caractère Personnel (CNDP), "Conditions et obligations du responsable de traitement au titre de la loi 09-08," CNDP, Rabat, Morocco, guidance note, 2022.</w:t>
+        <w:t>[6] Commission Nationale de Contrôle de la Protection des Données à Caractère Personnel (CNDP), "Conditions et obligations du responsable de traitement," CNDP, Rabat, Morocco. [Online]. Available: https://www.cndp.ma/</w:t>
       </w:r>
     </w:p>
     <w:p>
@@ -9001,7 +9001,7 @@
         <w:ind w:left="340" w:hanging="340"/>
       </w:pPr>
       <w:r>
-        <w:t xml:space="preserve">[12] M. M. Masud, K. Hayawi, S. S. Mathew, T. Michael, and M. E. Barachi, "Smart online exam proctoring assist for cheating detection," in </w:t>
+        <w:t xml:space="preserve">[12] M. M. Masud, K. Hayawi, S. S. Mathew, T. Michael, and M. El Barachi, "Smart online exam proctoring assist for cheating detection," in </w:t>
       </w:r>
       <w:r>
         <w:rPr>
@@ -9010,7 +9010,7 @@
         <w:t>Advanced Data Mining and Applications (ADMA 2021)</w:t>
       </w:r>
       <w:r>
-        <w:t>, vol. 13088 of LNAI, Cham: Springer, 2022, pp. 118–132, doi: 10.1007/978-3-030-95405-5_9.</w:t>
+        <w:t>, vol. 13087 of LNAI, Cham: Springer, 2022, pp. 118–132, doi: 10.1007/978-3-030-95405-5_9.</w:t>
       </w:r>
     </w:p>
     <w:p>
@@ -9145,7 +9145,7 @@
         <w:t>Proc. Interspeech</w:t>
       </w:r>
       <w:r>
-        <w:t>, 2021. arXiv:2104.02878.</w:t>
+        <w:t>, 2021, pp. 3086–3090, doi: 10.21437/Interspeech.2021-149.</w:t>
       </w:r>
     </w:p>
     <w:p>
@@ -9271,7 +9271,7 @@
         <w:t>Proceedings of the ACM on Interactive, Mobile, Wearable and Ubiquitous Technologies (IMWUT)</w:t>
       </w:r>
       <w:r>
-        <w:t>, vol. 8, no. 3, art. 102, 2024, doi: 10.1145/3678595.</w:t>
+        <w:t>, vol. 8, no. 3, art. 99, 2024, doi: 10.1145/3678595.</w:t>
       </w:r>
     </w:p>
     <w:p>
@@ -9415,16 +9415,16 @@
         <w:ind w:left="340" w:hanging="340"/>
       </w:pPr>
       <w:r>
-        <w:t xml:space="preserve">[36] T.-Y. Kim, H. Ko, S.-H. Kim, and H.-D. Kim, "Modelling of advanced driver assistance systems, pedestrian detection from camera images for ADAS," </w:t>
+        <w:t xml:space="preserve">[36] A. Narayanan and V. Shmatikov, "Robust de-anonymization of large sparse datasets," in </w:t>
       </w:r>
       <w:r>
         <w:rPr>
           <w:i/>
         </w:rPr>
-        <w:t>Sensors</w:t>
-      </w:r>
-      <w:r>
-        <w:t>, vol. 20, no. 11, p. 3122, 2020, doi: 10.3390/s20113122.</w:t>
+        <w:t>Proc. 2008 IEEE Symposium on Security and Privacy (S&amp;P)</w:t>
+      </w:r>
+      <w:r>
+        <w:t>, 2008, pp. 111–125, doi: 10.1109/SP.2008.33.</w:t>
       </w:r>
     </w:p>
     <w:p>
@@ -9433,16 +9433,16 @@
         <w:ind w:left="340" w:hanging="340"/>
       </w:pPr>
       <w:r>
-        <w:t xml:space="preserve">[37] A. Narayanan and V. Shmatikov, "Robust de-anonymization of large sparse datasets," in </w:t>
+        <w:t xml:space="preserve">[37] L. Sweeney, "k-Anonymity: a model for protecting privacy," </w:t>
       </w:r>
       <w:r>
         <w:rPr>
           <w:i/>
         </w:rPr>
-        <w:t>Proc. 2008 IEEE Symposium on Security and Privacy (S&amp;P)</w:t>
-      </w:r>
-      <w:r>
-        <w:t>, 2008, pp. 111–125, doi: 10.1109/SP.2008.33.</w:t>
+        <w:t>International Journal of Uncertainty, Fuzziness and Knowledge-Based Systems</w:t>
+      </w:r>
+      <w:r>
+        <w:t>, vol. 10, no. 5, pp. 557–570, 2002, doi: 10.1142/S0218488502001648.</w:t>
       </w:r>
     </w:p>
     <w:p>
@@ -9451,16 +9451,16 @@
         <w:ind w:left="340" w:hanging="340"/>
       </w:pPr>
       <w:r>
-        <w:t xml:space="preserve">[38] L. Sweeney, "k-Anonymity: a model for protecting privacy," </w:t>
+        <w:t xml:space="preserve">[38] C. Dwork, F. McSherry, K. Nissim, and A. Smith, "Calibrating noise to sensitivity in private data analysis," in </w:t>
       </w:r>
       <w:r>
         <w:rPr>
           <w:i/>
         </w:rPr>
-        <w:t>International Journal of Uncertainty, Fuzziness and Knowledge-Based Systems</w:t>
-      </w:r>
-      <w:r>
-        <w:t>, vol. 10, no. 5, pp. 557–570, 2002, doi: 10.1142/S0218488502001648.</w:t>
+        <w:t>Proc. Theory of Cryptography Conference (TCC)</w:t>
+      </w:r>
+      <w:r>
+        <w:t>, LNCS vol. 3876, Springer, 2006, pp. 265–284, doi: 10.1007/11681878_14.</w:t>
       </w:r>
     </w:p>
     <w:p>
@@ -9469,16 +9469,16 @@
         <w:ind w:left="340" w:hanging="340"/>
       </w:pPr>
       <w:r>
-        <w:t xml:space="preserve">[39] C. Dwork, F. McSherry, K. Nissim, and A. Smith, "Calibrating noise to sensitivity in private data analysis," in </w:t>
+        <w:t xml:space="preserve">[39] G. Bradski, "The OpenCV library," </w:t>
       </w:r>
       <w:r>
         <w:rPr>
           <w:i/>
         </w:rPr>
-        <w:t>Proc. Theory of Cryptography Conference (TCC)</w:t>
-      </w:r>
-      <w:r>
-        <w:t>, LNCS vol. 3876, Springer, 2006, pp. 265–284, doi: 10.1007/11681878_14.</w:t>
+        <w:t>Dr. Dobb's Journal of Software Tools</w:t>
+      </w:r>
+      <w:r>
+        <w:t>, vol. 25, no. 11, pp. 120–125, 2000.</w:t>
       </w:r>
     </w:p>
     <w:p>
@@ -9487,16 +9487,16 @@
         <w:ind w:left="340" w:hanging="340"/>
       </w:pPr>
       <w:r>
-        <w:t xml:space="preserve">[40] G. Bradski, "The OpenCV library," </w:t>
+        <w:t xml:space="preserve">[40] A. Paszke, S. Gross, F. Massa, A. Lerer, J. Bradbury, G. Chanan, et al., "PyTorch: an imperative style, high-performance deep learning library," in </w:t>
       </w:r>
       <w:r>
         <w:rPr>
           <w:i/>
         </w:rPr>
-        <w:t>Dr. Dobb's Journal of Software Tools</w:t>
-      </w:r>
-      <w:r>
-        <w:t>, vol. 25, no. 11, pp. 120–125, 2000.</w:t>
+        <w:t>Advances in Neural Information Processing Systems (NeurIPS)</w:t>
+      </w:r>
+      <w:r>
+        <w:t>, 2019, pp. 8024–8035.</w:t>
       </w:r>
     </w:p>
     <w:p>
@@ -9505,16 +9505,16 @@
         <w:ind w:left="340" w:hanging="340"/>
       </w:pPr>
       <w:r>
-        <w:t xml:space="preserve">[41] A. Paszke, S. Gross, F. Massa, A. Lerer, J. Bradbury, G. Chanan, et al., "PyTorch: an imperative style, high-performance deep learning library," in </w:t>
+        <w:t xml:space="preserve">[41] F. Pedregosa, G. Varoquaux, A. Gramfort, V. Michel, B. Thirion, et al., "Scikit-learn: machine learning in Python," </w:t>
       </w:r>
       <w:r>
         <w:rPr>
           <w:i/>
         </w:rPr>
-        <w:t>Advances in Neural Information Processing Systems (NeurIPS)</w:t>
-      </w:r>
-      <w:r>
-        <w:t>, 2019, pp. 8024–8035.</w:t>
+        <w:t>Journal of Machine Learning Research</w:t>
+      </w:r>
+      <w:r>
+        <w:t>, vol. 12, pp. 2825–2830, 2011.</w:t>
       </w:r>
     </w:p>
     <w:p>
@@ -9523,16 +9523,106 @@
         <w:ind w:left="340" w:hanging="340"/>
       </w:pPr>
       <w:r>
-        <w:t xml:space="preserve">[42] F. Pedregosa, G. Varoquaux, A. Gramfort, V. Michel, B. Thirion, et al., "Scikit-learn: machine learning in Python," </w:t>
+        <w:t xml:space="preserve">[42] L. Breiman, "Random forests," </w:t>
       </w:r>
       <w:r>
         <w:rPr>
           <w:i/>
         </w:rPr>
+        <w:t>Machine Learning</w:t>
+      </w:r>
+      <w:r>
+        <w:t>, vol. 45, no. 1, pp. 5–32, 2001, doi: 10.1023/A:1010933404324.</w:t>
+      </w:r>
+    </w:p>
+    <w:p>
+      <w:pPr>
+        <w:pStyle w:val="IText"/>
+        <w:ind w:left="340" w:hanging="340"/>
+      </w:pPr>
+      <w:r>
+        <w:t xml:space="preserve">[43] B. Efron and R. Tibshirani, </w:t>
+      </w:r>
+      <w:r>
+        <w:rPr>
+          <w:i/>
+        </w:rPr>
+        <w:t>An Introduction to the Bootstrap</w:t>
+      </w:r>
+      <w:r>
+        <w:t>. New York, NY, USA: Chapman &amp; Hall/CRC, 1993.</w:t>
+      </w:r>
+    </w:p>
+    <w:p>
+      <w:pPr>
+        <w:pStyle w:val="IText"/>
+        <w:ind w:left="340" w:hanging="340"/>
+      </w:pPr>
+      <w:r>
+        <w:t xml:space="preserve">[44] Q. McNemar, "Note on the sampling error of the difference between correlated proportions or percentages," </w:t>
+      </w:r>
+      <w:r>
+        <w:rPr>
+          <w:i/>
+        </w:rPr>
+        <w:t>Psychometrika</w:t>
+      </w:r>
+      <w:r>
+        <w:t>, vol. 12, no. 2, pp. 153–157, 1947, doi: 10.1007/BF02295996.</w:t>
+      </w:r>
+    </w:p>
+    <w:p>
+      <w:pPr>
+        <w:pStyle w:val="IText"/>
+        <w:ind w:left="340" w:hanging="340"/>
+      </w:pPr>
+      <w:r>
+        <w:t xml:space="preserve">[45] T. Fawcett, "An introduction to ROC analysis," </w:t>
+      </w:r>
+      <w:r>
+        <w:rPr>
+          <w:i/>
+        </w:rPr>
+        <w:t>Pattern Recognition Letters</w:t>
+      </w:r>
+      <w:r>
+        <w:t>, vol. 27, no. 8, pp. 861–874, 2006, doi: 10.1016/j.patrec.2005.10.010.</w:t>
+      </w:r>
+    </w:p>
+    <w:p>
+      <w:pPr>
+        <w:pStyle w:val="IText"/>
+        <w:ind w:left="340" w:hanging="340"/>
+      </w:pPr>
+      <w:r>
+        <w:t xml:space="preserve">[46] J. Davis and M. Goadrich, "The relationship between precision-recall and ROC curves," in </w:t>
+      </w:r>
+      <w:r>
+        <w:rPr>
+          <w:i/>
+        </w:rPr>
+        <w:t>Proc. 23rd International Conference on Machine Learning (ICML)</w:t>
+      </w:r>
+      <w:r>
+        <w:t>, 2006, pp. 233–240, doi: 10.1145/1143844.1143874.</w:t>
+      </w:r>
+    </w:p>
+    <w:p>
+      <w:pPr>
+        <w:pStyle w:val="IText"/>
+        <w:ind w:left="340" w:hanging="340"/>
+      </w:pPr>
+      <w:r>
+        <w:t xml:space="preserve">[47] J. Bergstra and Y. Bengio, "Random search for hyper-parameter optimization," </w:t>
+      </w:r>
+      <w:r>
+        <w:rPr>
+          <w:i/>
+        </w:rPr>
         <w:t>Journal of Machine Learning Research</w:t>
       </w:r>
       <w:r>
-        <w:t>, vol. 12, pp. 2825–2830, 2011.</w:t>
+        <w:t>, vol. 13, pp. 281–305, 2012.</w:t>
       </w:r>
     </w:p>
     <w:p>
@@ -9541,16 +9631,7 @@
         <w:ind w:left="340" w:hanging="340"/>
       </w:pPr>
       <w:r>
-        <w:t xml:space="preserve">[43] L. Breiman, "Random forests," </w:t>
-      </w:r>
-      <w:r>
-        <w:rPr>
-          <w:i/>
-        </w:rPr>
-        <w:t>Machine Learning</w:t>
-      </w:r>
-      <w:r>
-        <w:t>, vol. 45, no. 1, pp. 5–32, 2001, doi: 10.1023/A:1010933404324.</w:t>
+        <w:t>[48] C. Lugaresi et al., "MediaPipe Face Mesh," MediaPipe Legacy Solutions, Google Inc., software documentation, 2023. [Online]. Available: https://google.github.io/mediapipe/solutions/face_mesh</w:t>
       </w:r>
     </w:p>
     <w:p>
@@ -9559,106 +9640,7 @@
         <w:ind w:left="340" w:hanging="340"/>
       </w:pPr>
       <w:r>
-        <w:t xml:space="preserve">[44] B. Efron and R. Tibshirani, </w:t>
-      </w:r>
-      <w:r>
-        <w:rPr>
-          <w:i/>
-        </w:rPr>
-        <w:t>An Introduction to the Bootstrap</w:t>
-      </w:r>
-      <w:r>
-        <w:t>. New York, NY, USA: Chapman &amp; Hall/CRC, 1993.</w:t>
-      </w:r>
-    </w:p>
-    <w:p>
-      <w:pPr>
-        <w:pStyle w:val="IText"/>
-        <w:ind w:left="340" w:hanging="340"/>
-      </w:pPr>
-      <w:r>
-        <w:t xml:space="preserve">[45] Q. McNemar, "Note on the sampling error of the difference between correlated proportions or percentages," </w:t>
-      </w:r>
-      <w:r>
-        <w:rPr>
-          <w:i/>
-        </w:rPr>
-        <w:t>Psychometrika</w:t>
-      </w:r>
-      <w:r>
-        <w:t>, vol. 12, no. 2, pp. 153–157, 1947, doi: 10.1007/BF02295996.</w:t>
-      </w:r>
-    </w:p>
-    <w:p>
-      <w:pPr>
-        <w:pStyle w:val="IText"/>
-        <w:ind w:left="340" w:hanging="340"/>
-      </w:pPr>
-      <w:r>
-        <w:t xml:space="preserve">[46] T. Fawcett, "An introduction to ROC analysis," </w:t>
-      </w:r>
-      <w:r>
-        <w:rPr>
-          <w:i/>
-        </w:rPr>
-        <w:t>Pattern Recognition Letters</w:t>
-      </w:r>
-      <w:r>
-        <w:t>, vol. 27, no. 8, pp. 861–874, 2006, doi: 10.1016/j.patrec.2005.10.010.</w:t>
-      </w:r>
-    </w:p>
-    <w:p>
-      <w:pPr>
-        <w:pStyle w:val="IText"/>
-        <w:ind w:left="340" w:hanging="340"/>
-      </w:pPr>
-      <w:r>
-        <w:t xml:space="preserve">[47] J. Davis and M. Goadrich, "The relationship between precision-recall and ROC curves," in </w:t>
-      </w:r>
-      <w:r>
-        <w:rPr>
-          <w:i/>
-        </w:rPr>
-        <w:t>Proc. 23rd International Conference on Machine Learning (ICML)</w:t>
-      </w:r>
-      <w:r>
-        <w:t>, 2006, pp. 233–240, doi: 10.1145/1143844.1143874.</w:t>
-      </w:r>
-    </w:p>
-    <w:p>
-      <w:pPr>
-        <w:pStyle w:val="IText"/>
-        <w:ind w:left="340" w:hanging="340"/>
-      </w:pPr>
-      <w:r>
-        <w:t xml:space="preserve">[48] J. Bergstra and Y. Bengio, "Random search for hyper-parameter optimization," </w:t>
-      </w:r>
-      <w:r>
-        <w:rPr>
-          <w:i/>
-        </w:rPr>
-        <w:t>Journal of Machine Learning Research</w:t>
-      </w:r>
-      <w:r>
-        <w:t>, vol. 13, pp. 281–305, 2012.</w:t>
-      </w:r>
-    </w:p>
-    <w:p>
-      <w:pPr>
-        <w:pStyle w:val="IText"/>
-        <w:ind w:left="340" w:hanging="340"/>
-      </w:pPr>
-      <w:r>
-        <w:t>[49] C. Lugaresi and others, "Face Mesh, MediaPipe Solutions," Google Inc., software documentation, 2023. [Online]. Available: https://google.github.io/mediapipe/solutions/face_mesh</w:t>
-      </w:r>
-    </w:p>
-    <w:p>
-      <w:pPr>
-        <w:pStyle w:val="IText"/>
-        <w:ind w:left="340" w:hanging="340"/>
-      </w:pPr>
-      <w:r>
-        <w:t xml:space="preserve">[50] H. Caesar, J. Uijlings, and V. Ferrari, "COCO-Stuff: thing and stuff classes in context," in </w:t>
+        <w:t xml:space="preserve">[49] H. Caesar, J. Uijlings, and V. Ferrari, "COCO-Stuff: thing and stuff classes in context," in </w:t>
       </w:r>
       <w:r>
         <w:rPr>

</xml_diff>

<commit_message>
Label corresponding author in manuscript author block
</commit_message>
<xml_diff>
--- a/manuscript/Article_Informatica.docx
+++ b/manuscript/Article_Informatica.docx
@@ -18,7 +18,7 @@
         <w:pStyle w:val="IAuthors"/>
       </w:pPr>
       <w:r>
-        <w:t>Radid Ali, Ghazouani Mohamed and El habib Benlahmar</w:t>
+        <w:t>Radid Ali*, Ghazouani Mohamed and El habib Benlahmar</w:t>
       </w:r>
     </w:p>
     <w:p>
@@ -41,6 +41,17 @@
           <w:i/>
         </w:rPr>
         <w:t>E-mail: ali.radid-etu@etu.univh2c.ma, ghazouani.fsbm@gmail.com, h.benlahmer@gmail.com</w:t>
+      </w:r>
+    </w:p>
+    <w:p>
+      <w:pPr>
+        <w:pStyle w:val="IText"/>
+      </w:pPr>
+      <w:r>
+        <w:rPr>
+          <w:i/>
+        </w:rPr>
+        <w:t>* Corresponding author: Radid Ali (ali.radid-etu@etu.univh2c.ma)</w:t>
       </w:r>
     </w:p>
     <w:p>

</xml_diff>

<commit_message>
Match Informatica front-matter order: keywords and received before abstract
- Place Keywords and a Received line before the abstract (template order)
- Remove the non-standard bold 'Abstract.' label; abstract uses the italic I_Abstract style as in published papers
- Use 'Povzetek:' label and the I_Received style for the received line
- Update the Slovenian Povzetek figures to match the corrected English numbers (significance, FPS, memory)
</commit_message>
<xml_diff>
--- a/manuscript/Article_Informatica.docx
+++ b/manuscript/Article_Informatica.docx
@@ -18,7 +18,7 @@
         <w:pStyle w:val="IAuthors"/>
       </w:pPr>
       <w:r>
-        <w:t>Radid Ali*, Ghazouani Mohamed and El habib Benlahmar</w:t>
+        <w:t>Radid Ali, Ghazouani Mohamed and El habib Benlahmar</w:t>
       </w:r>
     </w:p>
     <w:p>
@@ -51,7 +51,29 @@
         <w:rPr>
           <w:i/>
         </w:rPr>
-        <w:t>* Corresponding author: Radid Ali (ali.radid-etu@etu.univh2c.ma)</w:t>
+        <w:t>Corresponding author: Radid Ali (ali.radid-etu@etu.univh2c.ma)</w:t>
+      </w:r>
+    </w:p>
+    <w:p>
+      <w:pPr>
+        <w:pStyle w:val="IKeywords"/>
+      </w:pPr>
+      <w:r>
+        <w:rPr>
+          <w:b/>
+        </w:rPr>
+        <w:t xml:space="preserve">Keywords: </w:t>
+      </w:r>
+      <w:r>
+        <w:t>privacy-preserving proctoring; non-biometric monitoring; YOLOv8; MediaPipe FaceMesh; Whisper; suspicion index; online examinations; GDPR; CNDP; adversarial privacy verification.</w:t>
+      </w:r>
+    </w:p>
+    <w:p>
+      <w:pPr>
+        <w:pStyle w:val="IReceived"/>
+      </w:pPr>
+      <w:r>
+        <w:t xml:space="preserve">Received: </w:t>
       </w:r>
     </w:p>
     <w:p>
@@ -59,41 +81,21 @@
         <w:pStyle w:val="IAbstract"/>
       </w:pPr>
       <w:r>
+        <w:t>The rapid adoption of online assessment platforms has accelerated the deployment of AI-driven proctoring systems. Most commercial solutions, however, rely on intrusive biometric processing (continuous facial recognition, voiceprint extraction, and speech transcription) that conflicts with strict data-protection regimes such as the European General Data Protection Regulation (GDPR) and the Moroccan CNDP Law 09-08, which classify such data as a special category of personal information. This paper proposes a privacy-preserving multi-modal proctoring framework that maintains examination integrity without storing any biometric template, raw video, or linguistic content. The system integrates (i) YOLOv8-s for contextual object detection, (ii) MediaPipe FaceMesh for non-identifying geometric behavioural cues (gaze deviation, head pose, lip-movement variance), and (iii) a Whisper-Base encoder operating in content-free mode for acoustic anomaly detection. All modality outputs are converted to a standardized event stream and processed by a Suspicion Index Fusion Model whose strategy is identified empirically among five alternatives (rule-based weighted sum, logistic regression, random forest, multi-layer perceptron, naive Bayes). On a real COCO val2017 subset (217 images, 1,164 annotations) YOLOv8-s achieves a macro F1 of 0.606 and a mean AP@0.5 of 0.519. On a 400-clip acoustic benchmark built from LibriSpeech (real read English speech, CC-BY 4.0), the Whisper-Base encoder used as a content-free embedding extractor attains a secondary-speaker ROC AUC of 0.774 (best-threshold F1 = 0.78) and a whisper-detection AUC of 0.935. A 5-fold stratified cross-validation on 300 sessions whose features come from real YOLOv8 detections on COCO, real Whisper outputs on LibriSpeech mixes, and real MediaPipe FaceMesh measurements on Pexels portraits ranks random forest as the best fusion strategy with F1 = 0.905 ± 0.041 (95% bootstrap CI [0.876, 0.931]); its advantage over the simple weighted-sum rule (F1 = 0.899) is not statistically significant (McNemar p = 0.37), but it significantly outperforms the MLP and naive-Bayes variants (p &lt; 0.01). Ablations show that the visual and behavioural modalities carry the most decision-relevant information, while the acoustic modality is the most redundant for the binary decision yet uniquely able to detect off-camera collaboration. On a single Apple M4 Max host (Mac Studio, 36 GB unified memory) the end-to-end pipeline runs at 23.7 FPS with MPS acceleration and 19.4 FPS in CPU-only mode, with a peak resident memory of 1,102 MB. An adversarial privacy verification with 30 real LibriSpeech speakers shows that an attacker with access to raw audio re-identifies candidates with AUC 0.994, while the same attacker constrained to the metadata stream emitted by our system achieves only 0.478 (chance level), empirically confirming the non-biometric property of the framework. To the best of the authors' knowledge no prior proctoring framework reported in the AI-proctoring literature simultaneously avoids biometric data retention, provides quantitative adversarial privacy evidence on real-speaker data, supports real-time multi-modal monitoring, and explicitly addresses both GDPR Article 9 and CNDP Law 09-08; the present framework occupies that intersection.</w:t>
+      </w:r>
+    </w:p>
+    <w:p>
+      <w:pPr>
+        <w:pStyle w:val="IAbstractSI"/>
+      </w:pPr>
+      <w:r>
         <w:rPr>
           <w:b/>
         </w:rPr>
-        <w:t xml:space="preserve">Abstract. </w:t>
-      </w:r>
-      <w:r>
-        <w:t>The rapid adoption of online assessment platforms has accelerated the deployment of AI-driven proctoring systems. Most commercial solutions, however, rely on intrusive biometric processing (continuous facial recognition, voiceprint extraction, and speech transcription) that conflicts with strict data-protection regimes such as the European General Data Protection Regulation (GDPR) and the Moroccan CNDP Law 09-08, which classify such data as a special category of personal information. This paper proposes a privacy-preserving multi-modal proctoring framework that maintains examination integrity without storing any biometric template, raw video, or linguistic content. The system integrates (i) YOLOv8-s for contextual object detection, (ii) MediaPipe FaceMesh for non-identifying geometric behavioural cues (gaze deviation, head pose, lip-movement variance), and (iii) a Whisper-Base encoder operating in content-free mode for acoustic anomaly detection. All modality outputs are converted to a standardized event stream and processed by a Suspicion Index Fusion Model whose strategy is identified empirically among five alternatives (rule-based weighted sum, logistic regression, random forest, multi-layer perceptron, naive Bayes). On a real COCO val2017 subset (217 images, 1,164 annotations) YOLOv8-s achieves a macro F1 of 0.606 and a mean AP@0.5 of 0.519. On a 400-clip acoustic benchmark built from LibriSpeech (real read English speech, CC-BY 4.0), the Whisper-Base encoder used as a content-free embedding extractor attains a secondary-speaker ROC AUC of 0.774 (best-threshold F1 = 0.78) and a whisper-detection AUC of 0.935. A 5-fold stratified cross-validation on 300 sessions whose features come from real YOLOv8 detections on COCO, real Whisper outputs on LibriSpeech mixes, and real MediaPipe FaceMesh measurements on Pexels portraits ranks random forest as the best fusion strategy with F1 = 0.905 ± 0.041 (95% bootstrap CI [0.876, 0.931]); its advantage over the simple weighted-sum rule (F1 = 0.899) is not statistically significant (McNemar p = 0.37), but it significantly outperforms the MLP and naive-Bayes variants (p &lt; 0.01). Ablations show that the visual and behavioural modalities carry the most decision-relevant information, while the acoustic modality is the most redundant for the binary decision yet uniquely able to detect off-camera collaboration. On a single Apple M4 Max host (Mac Studio, 36 GB unified memory) the end-to-end pipeline runs at 23.7 FPS with MPS acceleration and 19.4 FPS in CPU-only mode, with a peak resident memory of 1,102 MB. An adversarial privacy verification with 30 real LibriSpeech speakers shows that an attacker with access to raw audio re-identifies candidates with AUC 0.994, while the same attacker constrained to the metadata stream emitted by our system achieves only 0.478 (chance level), empirically confirming the non-biometric property of the framework. To the best of the authors' knowledge no prior proctoring framework reported in the AI-proctoring literature simultaneously avoids biometric data retention, provides quantitative adversarial privacy evidence on real-speaker data, supports real-time multi-modal monitoring, and explicitly addresses both GDPR Article 9 and CNDP Law 09-08; the present framework occupies that intersection.</w:t>
-      </w:r>
-    </w:p>
-    <w:p>
-      <w:pPr>
-        <w:pStyle w:val="IKeywords"/>
-      </w:pPr>
-      <w:r>
-        <w:rPr>
-          <w:b/>
-        </w:rPr>
-        <w:t xml:space="preserve">Keywords: </w:t>
-      </w:r>
-      <w:r>
-        <w:t>privacy-preserving proctoring; non-biometric monitoring; YOLOv8; MediaPipe FaceMesh; Whisper; suspicion index; online examinations; GDPR; CNDP; adversarial privacy verification.</w:t>
-      </w:r>
-    </w:p>
-    <w:p>
-      <w:pPr>
-        <w:pStyle w:val="IAbstractSI"/>
-      </w:pPr>
-      <w:r>
-        <w:rPr>
-          <w:b/>
-        </w:rPr>
-        <w:t xml:space="preserve">Povzetek. </w:t>
-      </w:r>
-      <w:r>
-        <w:t>Hitra uporaba spletnih platform za ocenjevanje je pospešila uvajanje proctoring sistemov, ki temeljijo na umetni inteligenci. Večina komercialnih rešitev se zanaša na vsiljivo biometrično obdelavo, kot so neprekinjeno prepoznavanje obrazov, izločanje glasovnih odtisov in prepis govora, kar je v nasprotju s strogimi predpisi o varstvu podatkov, kot sta evropska Splošna uredba o varstvu podatkov (GDPR) in maroška uredba CNDP, zakon 09-08, ki tovrstne podatke uvrščata med občutljive osebne podatke. V članku predstavljamo večmodalno ogrodje za nadzor izpitov, ki ohranja zasebnost in ne shranjuje biometričnih predlog, surovega videa ali jezikovne vsebine. Sistem povezuje YOLOv8-s za kontekstualno zaznavanje predmetov, MediaPipe FaceMesh za neidentificirajoče vedenjske namige (odklon pogleda, drža glave, gibanje ustnic) in Whisper-Base kodirnik v načinu brez prepisa govora. Vsi izhodi modulov so pretvorjeni v standardiziran tok metapodatkov in obdelani z modelom za izračun indeksa suma, katerega strategija je izbrana empirično med petimi različicami. Na realni podmnožici slik COCO val2017 (217 slik, 1.164 oznak) YOLOv8-s doseže makro F1 0,606 in povprečni AP@0,5 0,519. Pri 400 zvočnih posnetkih, sestavljenih iz korpusa LibriSpeech, kodirnik Whisper-Base v brezvsebinskem načinu doseže ROC AUC 0,774 za prisotnost dodatnega govorca (F1 = 0,78) in AUC 0,935 za zaznavanje šepetanja. Pri 5-kratnem prečnem preverjanju na 300 sejah s preverjenimi modalnostnimi izhodi se naključni gozd uvrsti kot najboljša strategija s F1 = 0,905 ± 0,041 (95-odstotni interval [0,876, 0,931]) in je statistično pomembno boljši od osnovnega pravila tehtane vsote (McNemar χ² = 7,20, p = 7,3 × 10⁻³). Na napravi Apple M4 Max (Mac Studio) cevovod deluje pri 29,5 sličicah na sekundo s pospeševanjem MPS in 30,0 sličicah na sekundo v načinu samo CPU. Sistem porabi največ 1.075 MB pomnilnika. Pri preverjanju zasebnosti z 30 resničnimi govorci napadalec s surovim zvokom doseže AUC 0,994 za ponovno identifikacijo, medtem ko enak napadalec, omejen na tok metapodatkov, doseže le 0,478 (pod naključno mejo). To kvantitativno potrjuje lastnost ogrodja, da ne shranjuje biometričnih podatkov, in ohrani skladnost z 9. členom GDPR ter z zakonom 09-08 maroške CNDP.</w:t>
+        <w:t xml:space="preserve">Povzetek: </w:t>
+      </w:r>
+      <w:r>
+        <w:t>Hitra uporaba spletnih platform za ocenjevanje je pospešila uvajanje proctoring sistemov, ki temeljijo na umetni inteligenci. Večina komercialnih rešitev se zanaša na vsiljivo biometrično obdelavo, kot so neprekinjeno prepoznavanje obrazov, izločanje glasovnih odtisov in prepis govora, kar je v nasprotju s strogimi predpisi o varstvu podatkov, kot sta evropska Splošna uredba o varstvu podatkov (GDPR) in maroška uredba CNDP, zakon 09-08, ki tovrstne podatke uvrščata med občutljive osebne podatke. V članku predstavljamo večmodalno ogrodje za nadzor izpitov, ki ohranja zasebnost in ne shranjuje biometričnih predlog, surovega videa ali jezikovne vsebine. Sistem povezuje YOLOv8-s za kontekstualno zaznavanje predmetov, MediaPipe FaceMesh za neidentificirajoče vedenjske namige (odklon pogleda, drža glave, gibanje ustnic) in Whisper-Base kodirnik v načinu brez prepisa govora. Vsi izhodi modulov so pretvorjeni v standardiziran tok metapodatkov in obdelani z modelom za izračun indeksa suma, katerega strategija je izbrana empirično med petimi različicami. Na realni podmnožici slik COCO val2017 (217 slik, 1.164 oznak) YOLOv8-s doseže makro F1 0,606 in povprečni AP@0,5 0,519. Pri 400 zvočnih posnetkih, sestavljenih iz korpusa LibriSpeech, kodirnik Whisper-Base v brezvsebinskem načinu doseže ROC AUC 0,774 za prisotnost dodatnega govorca (F1 = 0,78) in AUC 0,935 za zaznavanje šepetanja. Pri 5-kratnem prečnem preverjanju na 300 sejah s preverjenimi modalnostnimi izhodi se naključni gozd uvrsti kot najboljša strategija s F1 = 0,905 ± 0,041 (95-odstotni interval [0,876, 0,931]); njegova prednost pred preprostim pravilom tehtane vsote (F1 = 0,899) ni statistično značilna (McNemar p = 0,37), je pa značilno boljši od različic MLP in naivnega Bayesa. Na napravi Apple M4 Max (Mac Studio) cevovod deluje pri 23,7 sličicah na sekundo s pospeševanjem MPS in 19,4 sličicah na sekundo v načinu samo CPU. Sistem porabi največ 1.102 MB pomnilnika. Pri preverjanju zasebnosti z 30 resničnimi govorci napadalec s surovim zvokom doseže AUC 0,994 za ponovno identifikacijo, medtem ko enak napadalec, omejen na tok metapodatkov, doseže le 0,478 (pod naključno mejo). To kvantitativno potrjuje lastnost ogrodja, da ne shranjuje biometričnih podatkov, in ohrani skladnost z 9. členom GDPR ter z zakonom 09-08 maroške CNDP.</w:t>
       </w:r>
     </w:p>
     <w:p>

</xml_diff>

<commit_message>
Render math instead of raw LaTeX in the Word build
The builder was emitting inline ($...$) and display ($$...$$) LaTeX
verbatim, so Word showed literal source such as $\mathrm{SI}$ and
$\theta_g$. Added a LaTeX-to-Word converter that maps Greek letters and
operators to Unicode and renders _ / ^ as real subscript/superscript runs,
applied to all paragraphs, list items, the abstract and both display
equations. No raw LaTeX or dollar signs remain in the output.
</commit_message>
<xml_diff>
--- a/manuscript/Article_Informatica.docx
+++ b/manuscript/Article_Informatica.docx
@@ -400,39 +400,54 @@
         <w:pStyle w:val="IText"/>
       </w:pPr>
       <w:r>
-        <w:t>• (V) Vision-based proctoring,</w:t>
-      </w:r>
-    </w:p>
-    <w:p>
-      <w:pPr>
-        <w:pStyle w:val="IText"/>
-      </w:pPr>
-      <w:r>
-        <w:t>• (A) Audio-based proctoring,</w:t>
-      </w:r>
-    </w:p>
-    <w:p>
-      <w:pPr>
-        <w:pStyle w:val="IText"/>
-      </w:pPr>
-      <w:r>
-        <w:t>• (M) Multi-modal proctoring,</w:t>
-      </w:r>
-    </w:p>
-    <w:p>
-      <w:pPr>
-        <w:pStyle w:val="IText"/>
-      </w:pPr>
-      <w:r>
-        <w:t>• (B) Behavioural biometrics (keystroke, mouse dynamics),</w:t>
-      </w:r>
-    </w:p>
-    <w:p>
-      <w:pPr>
-        <w:pStyle w:val="IText"/>
-      </w:pPr>
-      <w:r>
-        <w:t>• (P) Privacy-preserving and federated approaches.</w:t>
+        <w:t xml:space="preserve">• </w:t>
+      </w:r>
+      <w:r>
+        <w:t>(V) Vision-based proctoring,</w:t>
+      </w:r>
+    </w:p>
+    <w:p>
+      <w:pPr>
+        <w:pStyle w:val="IText"/>
+      </w:pPr>
+      <w:r>
+        <w:t xml:space="preserve">• </w:t>
+      </w:r>
+      <w:r>
+        <w:t>(A) Audio-based proctoring,</w:t>
+      </w:r>
+    </w:p>
+    <w:p>
+      <w:pPr>
+        <w:pStyle w:val="IText"/>
+      </w:pPr>
+      <w:r>
+        <w:t xml:space="preserve">• </w:t>
+      </w:r>
+      <w:r>
+        <w:t>(M) Multi-modal proctoring,</w:t>
+      </w:r>
+    </w:p>
+    <w:p>
+      <w:pPr>
+        <w:pStyle w:val="IText"/>
+      </w:pPr>
+      <w:r>
+        <w:t xml:space="preserve">• </w:t>
+      </w:r>
+      <w:r>
+        <w:t>(B) Behavioural biometrics (keystroke, mouse dynamics),</w:t>
+      </w:r>
+    </w:p>
+    <w:p>
+      <w:pPr>
+        <w:pStyle w:val="IText"/>
+      </w:pPr>
+      <w:r>
+        <w:t xml:space="preserve">• </w:t>
+      </w:r>
+      <w:r>
+        <w:t>(P) Privacy-preserving and federated approaches.</w:t>
       </w:r>
     </w:p>
     <w:p>
@@ -2692,380 +2707,944 @@
         <w:jc w:val="center"/>
       </w:pPr>
       <w:r>
+        <w:t>C = {cell phone, book, laptop, tv, keyboard, mouse, person}</w:t>
+      </w:r>
+    </w:p>
+    <w:p>
+      <w:pPr>
+        <w:pStyle w:val="IText"/>
+      </w:pPr>
+      <w:r>
+        <w:t xml:space="preserve">For each detection </w:t>
+      </w:r>
+      <w:r>
+        <w:t>d</w:t>
+      </w:r>
+      <w:r>
+        <w:rPr>
+          <w:vertAlign w:val="subscript"/>
+        </w:rPr>
+        <w:t>i</w:t>
+      </w:r>
+      <w:r>
+        <w:t xml:space="preserve"> = (c</w:t>
+      </w:r>
+      <w:r>
+        <w:rPr>
+          <w:vertAlign w:val="subscript"/>
+        </w:rPr>
+        <w:t>i</w:t>
+      </w:r>
+      <w:r>
+        <w:t>, p</w:t>
+      </w:r>
+      <w:r>
+        <w:rPr>
+          <w:vertAlign w:val="subscript"/>
+        </w:rPr>
+        <w:t>i</w:t>
+      </w:r>
+      <w:r>
+        <w:t>, b</w:t>
+      </w:r>
+      <w:r>
+        <w:rPr>
+          <w:vertAlign w:val="subscript"/>
+        </w:rPr>
+        <w:t>i</w:t>
+      </w:r>
+      <w:r>
+        <w:t>, t</w:t>
+      </w:r>
+      <w:r>
+        <w:rPr>
+          <w:vertAlign w:val="subscript"/>
+        </w:rPr>
+        <w:t>i</w:t>
+      </w:r>
+      <w:r>
+        <w:t>)</w:t>
+      </w:r>
+      <w:r>
+        <w:t xml:space="preserve"> with class </w:t>
+      </w:r>
+      <w:r>
+        <w:t>c</w:t>
+      </w:r>
+      <w:r>
+        <w:rPr>
+          <w:vertAlign w:val="subscript"/>
+        </w:rPr>
+        <w:t>i</w:t>
+      </w:r>
+      <w:r>
+        <w:t xml:space="preserve"> ∈ C</w:t>
+      </w:r>
+      <w:r>
+        <w:t xml:space="preserve">, confidence </w:t>
+      </w:r>
+      <w:r>
+        <w:t>p</w:t>
+      </w:r>
+      <w:r>
+        <w:rPr>
+          <w:vertAlign w:val="subscript"/>
+        </w:rPr>
+        <w:t>i</w:t>
+      </w:r>
+      <w:r>
+        <w:t xml:space="preserve">, bounding box </w:t>
+      </w:r>
+      <w:r>
+        <w:t>b</w:t>
+      </w:r>
+      <w:r>
+        <w:rPr>
+          <w:vertAlign w:val="subscript"/>
+        </w:rPr>
+        <w:t>i</w:t>
+      </w:r>
+      <w:r>
+        <w:t xml:space="preserve">, and timestamp </w:t>
+      </w:r>
+      <w:r>
+        <w:t>t</w:t>
+      </w:r>
+      <w:r>
+        <w:rPr>
+          <w:vertAlign w:val="subscript"/>
+        </w:rPr>
+        <w:t>i</w:t>
+      </w:r>
+      <w:r>
+        <w:t xml:space="preserve">, the visual subsystem outputs </w:t>
+      </w:r>
+      <w:r>
         <w:rPr>
           <w:i/>
         </w:rPr>
-        <w:t>\mathcal{C} = \{cell phone, book, laptop, tv, keyboard, mouse, person\}</w:t>
-      </w:r>
-    </w:p>
-    <w:p>
-      <w:pPr>
-        <w:pStyle w:val="IText"/>
-      </w:pPr>
-      <w:r>
-        <w:t xml:space="preserve">For each detection $d_i = (c_i, p_i, b_i, t_i)$ with class $c_i \in \mathcal{C}$, confidence $p_i$, bounding box $b_i$, and timestamp $t_i$, the visual subsystem outputs </w:t>
+        <w:t>only</w:t>
+      </w:r>
+      <w:r>
+        <w:t xml:space="preserve"> the tuple </w:t>
+      </w:r>
+      <w:r>
+        <w:t>(c</w:t>
+      </w:r>
+      <w:r>
+        <w:rPr>
+          <w:vertAlign w:val="subscript"/>
+        </w:rPr>
+        <w:t>i</w:t>
+      </w:r>
+      <w:r>
+        <w:t>, p</w:t>
+      </w:r>
+      <w:r>
+        <w:rPr>
+          <w:vertAlign w:val="subscript"/>
+        </w:rPr>
+        <w:t>i</w:t>
+      </w:r>
+      <w:r>
+        <w:t>, t</w:t>
+      </w:r>
+      <w:r>
+        <w:rPr>
+          <w:vertAlign w:val="subscript"/>
+        </w:rPr>
+        <w:t>i</w:t>
+      </w:r>
+      <w:r>
+        <w:t>)</w:t>
+      </w:r>
+      <w:r>
+        <w:t>. No frame is stored.</w:t>
+      </w:r>
+    </w:p>
+    <w:p>
+      <w:pPr>
+        <w:pStyle w:val="IText"/>
+      </w:pPr>
+      <w:r>
+        <w:t xml:space="preserve">MediaPipe FaceMesh [15], [48] yields 468 facial landmarks </w:t>
+      </w:r>
+      <w:r>
+        <w:t>L = {l</w:t>
+      </w:r>
+      <w:r>
+        <w:rPr>
+          <w:vertAlign w:val="subscript"/>
+        </w:rPr>
+        <w:t>1</w:t>
+      </w:r>
+      <w:r>
+        <w:t>, ..., l</w:t>
+      </w:r>
+      <w:r>
+        <w:rPr>
+          <w:vertAlign w:val="subscript"/>
+        </w:rPr>
+        <w:t>468</w:t>
+      </w:r>
+      <w:r>
+        <w:t>}</w:t>
+      </w:r>
+      <w:r>
+        <w:t>. We compute four geometric descriptors:</w:t>
+      </w:r>
+    </w:p>
+    <w:p>
+      <w:pPr>
+        <w:pStyle w:val="IText"/>
+      </w:pPr>
+      <w:r>
+        <w:t xml:space="preserve">• </w:t>
+      </w:r>
+      <w:r>
+        <w:rPr>
+          <w:b/>
+        </w:rPr>
+        <w:t>Gaze deviation angle</w:t>
+      </w:r>
+      <w:r>
+        <w:t xml:space="preserve"> </w:t>
+      </w:r>
+      <w:r>
+        <w:t>θ</w:t>
+      </w:r>
+      <w:r>
+        <w:rPr>
+          <w:vertAlign w:val="subscript"/>
+        </w:rPr>
+        <w:t>g</w:t>
+      </w:r>
+      <w:r>
+        <w:t>: derived from the angular position of the nose tip relative to the eye-centre axis.</w:t>
+      </w:r>
+    </w:p>
+    <w:p>
+      <w:pPr>
+        <w:pStyle w:val="IText"/>
+      </w:pPr>
+      <w:r>
+        <w:t xml:space="preserve">• </w:t>
+      </w:r>
+      <w:r>
+        <w:rPr>
+          <w:b/>
+        </w:rPr>
+        <w:t>Head yaw</w:t>
+      </w:r>
+      <w:r>
+        <w:t xml:space="preserve"> </w:t>
+      </w:r>
+      <w:r>
+        <w:t>φ</w:t>
+      </w:r>
+      <w:r>
+        <w:rPr>
+          <w:vertAlign w:val="subscript"/>
+        </w:rPr>
+        <w:t>y</w:t>
+      </w:r>
+      <w:r>
+        <w:t xml:space="preserve"> and </w:t>
+      </w:r>
+      <w:r>
+        <w:rPr>
+          <w:b/>
+        </w:rPr>
+        <w:t>pitch</w:t>
+      </w:r>
+      <w:r>
+        <w:t xml:space="preserve"> </w:t>
+      </w:r>
+      <w:r>
+        <w:t>φ</w:t>
+      </w:r>
+      <w:r>
+        <w:rPr>
+          <w:vertAlign w:val="subscript"/>
+        </w:rPr>
+        <w:t>p</w:t>
+      </w:r>
+      <w:r>
+        <w:t>: computed from the relative position of ears, nose tip, and chin.</w:t>
+      </w:r>
+    </w:p>
+    <w:p>
+      <w:pPr>
+        <w:pStyle w:val="IText"/>
+      </w:pPr>
+      <w:r>
+        <w:t xml:space="preserve">• </w:t>
+      </w:r>
+      <w:r>
+        <w:rPr>
+          <w:b/>
+        </w:rPr>
+        <w:t>Lip variance</w:t>
+      </w:r>
+      <w:r>
+        <w:t xml:space="preserve"> </w:t>
+      </w:r>
+      <w:r>
+        <w:t>σ</w:t>
+      </w:r>
+      <w:r>
+        <w:rPr>
+          <w:vertAlign w:val="subscript"/>
+        </w:rPr>
+        <w:t>l</w:t>
+      </w:r>
+      <w:r>
+        <w:rPr>
+          <w:vertAlign w:val="superscript"/>
+        </w:rPr>
+        <w:t>2</w:t>
+      </w:r>
+      <w:r>
+        <w:t>: variance of the upper-lower lip distance over a 30-frame sliding window.</w:t>
+      </w:r>
+    </w:p>
+    <w:p>
+      <w:pPr>
+        <w:pStyle w:val="IText"/>
+      </w:pPr>
+      <w:r>
+        <w:t xml:space="preserve">Sustained off-screen gaze is flagged when </w:t>
+      </w:r>
+      <w:r>
+        <w:t>θ</w:t>
+      </w:r>
+      <w:r>
+        <w:rPr>
+          <w:vertAlign w:val="subscript"/>
+        </w:rPr>
+        <w:t>g</w:t>
+      </w:r>
+      <w:r>
+        <w:t xml:space="preserve"> &gt; 18°</w:t>
+      </w:r>
+      <w:r>
+        <w:t xml:space="preserve"> or </w:t>
+      </w:r>
+      <w:r>
+        <w:t>|φ</w:t>
+      </w:r>
+      <w:r>
+        <w:rPr>
+          <w:vertAlign w:val="subscript"/>
+        </w:rPr>
+        <w:t>y</w:t>
+      </w:r>
+      <w:r>
+        <w:t>| &gt; 25°</w:t>
+      </w:r>
+      <w:r>
+        <w:t xml:space="preserve"> for at least 2.5 s.</w:t>
+      </w:r>
+    </w:p>
+    <w:p>
+      <w:pPr>
+        <w:pStyle w:val="ISubSectionTitle"/>
+      </w:pPr>
+      <w:r>
+        <w:rPr>
+          <w:b/>
+        </w:rPr>
+        <w:t>Acoustic Subsystem (Content-Free Whisper)</w:t>
+      </w:r>
+    </w:p>
+    <w:p>
+      <w:pPr>
+        <w:pStyle w:val="IText"/>
+      </w:pPr>
+      <w:r>
+        <w:t xml:space="preserve">We use Whisper-Base [16] (74 M parameters) with the decoder disabled. The encoder maps a 30-second log-mel spectrogram to a hidden state </w:t>
+      </w:r>
+      <w:r>
+        <w:t>H ∈ ℝ</w:t>
+      </w:r>
+      <w:r>
+        <w:rPr>
+          <w:vertAlign w:val="superscript"/>
+        </w:rPr>
+        <w:t>T × d</w:t>
+      </w:r>
+      <w:r>
+        <w:t xml:space="preserve">, where </w:t>
+      </w:r>
+      <w:r>
+        <w:t>T = 1500</w:t>
+      </w:r>
+      <w:r>
+        <w:t xml:space="preserve"> and </w:t>
+      </w:r>
+      <w:r>
+        <w:t>d = 512</w:t>
+      </w:r>
+      <w:r>
+        <w:t xml:space="preserve">. For each 5-second buffer </w:t>
+      </w:r>
+      <w:r>
+        <w:t>a</w:t>
+      </w:r>
+      <w:r>
+        <w:t>, we compute:</w:t>
+      </w:r>
+    </w:p>
+    <w:p>
+      <w:pPr>
+        <w:pStyle w:val="IText"/>
+      </w:pPr>
+      <w:r>
+        <w:t xml:space="preserve">• </w:t>
+      </w:r>
+      <w:r>
+        <w:rPr>
+          <w:b/>
+        </w:rPr>
+        <w:t>Voice Activity Ratio</w:t>
+      </w:r>
+      <w:r>
+        <w:t xml:space="preserve"> </w:t>
+      </w:r>
+      <w:r>
+        <w:t>VAR(a)</w:t>
+      </w:r>
+      <w:r>
+        <w:t>: fraction of short-time frames whose energy exceeds 1.4× the median.</w:t>
+      </w:r>
+    </w:p>
+    <w:p>
+      <w:pPr>
+        <w:pStyle w:val="IText"/>
+      </w:pPr>
+      <w:r>
+        <w:t xml:space="preserve">• </w:t>
+      </w:r>
+      <w:r>
+        <w:rPr>
+          <w:b/>
+        </w:rPr>
+        <w:t>Pitch fluctuation</w:t>
+      </w:r>
+      <w:r>
+        <w:t xml:space="preserve"> </w:t>
+      </w:r>
+      <w:r>
+        <w:t>PFV(a)</w:t>
+      </w:r>
+      <w:r>
+        <w:t>: median absolute deviation of the auto-correlation-based pitch estimate across active frames, normalised by the median.</w:t>
+      </w:r>
+    </w:p>
+    <w:p>
+      <w:pPr>
+        <w:pStyle w:val="IText"/>
+      </w:pPr>
+      <w:r>
+        <w:t xml:space="preserve">• </w:t>
+      </w:r>
+      <w:r>
+        <w:rPr>
+          <w:b/>
+        </w:rPr>
+        <w:t>Spectral centroid fluctuation</w:t>
+      </w:r>
+      <w:r>
+        <w:t xml:space="preserve"> </w:t>
+      </w:r>
+      <w:r>
+        <w:t>CFV(a)</w:t>
+      </w:r>
+      <w:r>
+        <w:t>: same as PFV but over the spectral centroid.</w:t>
+      </w:r>
+    </w:p>
+    <w:p>
+      <w:pPr>
+        <w:pStyle w:val="IText"/>
+      </w:pPr>
+      <w:r>
+        <w:t xml:space="preserve">• </w:t>
+      </w:r>
+      <w:r>
+        <w:rPr>
+          <w:b/>
+        </w:rPr>
+        <w:t>High-band ratio</w:t>
+      </w:r>
+      <w:r>
+        <w:t xml:space="preserve"> </w:t>
+      </w:r>
+      <w:r>
+        <w:t>HBR(a)</w:t>
+      </w:r>
+      <w:r>
+        <w:t>: ratio of energy in [1.5–6.5 kHz] over [60–1500 Hz].</w:t>
+      </w:r>
+    </w:p>
+    <w:p>
+      <w:pPr>
+        <w:pStyle w:val="IText"/>
+      </w:pPr>
+      <w:r>
+        <w:t>The secondary-speaker probability is then computed by an empirically calibrated logistic mapping:</w:t>
+      </w:r>
+    </w:p>
+    <w:p>
+      <w:pPr>
+        <w:pStyle w:val="IText"/>
+        <w:jc w:val="center"/>
+      </w:pPr>
+      <w:r>
+        <w:t>P</w:t>
+      </w:r>
+      <w:r>
+        <w:rPr>
+          <w:vertAlign w:val="subscript"/>
+        </w:rPr>
+        <w:t>sec</w:t>
+      </w:r>
+      <w:r>
+        <w:t>(a) = σ(β</w:t>
+      </w:r>
+      <w:r>
+        <w:rPr>
+          <w:vertAlign w:val="subscript"/>
+        </w:rPr>
+        <w:t>0</w:t>
+      </w:r>
+      <w:r>
+        <w:t xml:space="preserve"> + β</w:t>
+      </w:r>
+      <w:r>
+        <w:rPr>
+          <w:vertAlign w:val="subscript"/>
+        </w:rPr>
+        <w:t>1</w:t>
+      </w:r>
+      <w:r>
+        <w:t xml:space="preserve"> PFV + β</w:t>
+      </w:r>
+      <w:r>
+        <w:rPr>
+          <w:vertAlign w:val="subscript"/>
+        </w:rPr>
+        <w:t>2</w:t>
+      </w:r>
+      <w:r>
+        <w:t xml:space="preserve"> CFV) · gate(a)</w:t>
+      </w:r>
+    </w:p>
+    <w:p>
+      <w:pPr>
+        <w:pStyle w:val="IText"/>
+      </w:pPr>
+      <w:r>
+        <w:t xml:space="preserve">where </w:t>
+      </w:r>
+      <w:r>
+        <w:t>gate(a)</w:t>
+      </w:r>
+      <w:r>
+        <w:t xml:space="preserve"> is an activity gate that is near zero for silent buffers (built from a clipped function of the RMS in dBFS and VAR). Overlap and whisper probabilities follow analogous logistic mappings with their own coefficient set. Crucially, no decoder is ever called, so the linguistic content of the audio cannot be recovered.</w:t>
+      </w:r>
+    </w:p>
+    <w:p>
+      <w:pPr>
+        <w:pStyle w:val="ISubSectionTitle"/>
+      </w:pPr>
+      <w:r>
+        <w:rPr>
+          <w:b/>
+        </w:rPr>
+        <w:t>Suspicion Index Fusion Model</w:t>
+      </w:r>
+    </w:p>
+    <w:p>
+      <w:pPr>
+        <w:pStyle w:val="IText"/>
+      </w:pPr>
+      <w:r>
+        <w:t xml:space="preserve">For each session we summarise the metadata stream into a 12-dimensional feature vector </w:t>
+      </w:r>
+      <w:r>
+        <w:t>x ∈ ℝ</w:t>
+      </w:r>
+      <w:r>
+        <w:rPr>
+          <w:vertAlign w:val="superscript"/>
+        </w:rPr>
+        <w:t>12</w:t>
+      </w:r>
+      <w:r>
+        <w:t>:</w:t>
+      </w:r>
+    </w:p>
+    <w:p>
+      <w:pPr>
+        <w:pStyle w:val="IText"/>
+        <w:jc w:val="center"/>
+      </w:pPr>
+      <w:r>
+        <w:t>x = [p</w:t>
+      </w:r>
+      <w:r>
+        <w:rPr>
+          <w:vertAlign w:val="superscript"/>
+        </w:rPr>
+        <w:t>max</w:t>
+      </w:r>
+      <w:r>
+        <w:rPr>
+          <w:vertAlign w:val="subscript"/>
+        </w:rPr>
+        <w:t>phone</w:t>
+      </w:r>
+      <w:r>
+        <w:t>, r</w:t>
+      </w:r>
+      <w:r>
+        <w:rPr>
+          <w:vertAlign w:val="superscript"/>
+        </w:rPr>
+        <w:t>dur</w:t>
+      </w:r>
+      <w:r>
+        <w:rPr>
+          <w:vertAlign w:val="subscript"/>
+        </w:rPr>
+        <w:t>phone</w:t>
+      </w:r>
+      <w:r>
+        <w:t>, p</w:t>
+      </w:r>
+      <w:r>
+        <w:rPr>
+          <w:vertAlign w:val="superscript"/>
+        </w:rPr>
+        <w:t>max</w:t>
+      </w:r>
+      <w:r>
+        <w:rPr>
+          <w:vertAlign w:val="subscript"/>
+        </w:rPr>
+        <w:t>book</w:t>
+      </w:r>
+      <w:r>
+        <w:t>, n</w:t>
+      </w:r>
+      <w:r>
+        <w:rPr>
+          <w:vertAlign w:val="superscript"/>
+        </w:rPr>
+        <w:t>max</w:t>
+      </w:r>
+      <w:r>
+        <w:rPr>
+          <w:vertAlign w:val="subscript"/>
+        </w:rPr>
+        <w:t>persons</w:t>
+      </w:r>
+      <w:r>
+        <w:t>, θ</w:t>
+      </w:r>
+      <w:r>
+        <w:rPr>
+          <w:vertAlign w:val="superscript"/>
+        </w:rPr>
+        <w:t>max</w:t>
+      </w:r>
+      <w:r>
+        <w:rPr>
+          <w:vertAlign w:val="subscript"/>
+        </w:rPr>
+        <w:t>g</w:t>
+      </w:r>
+      <w:r>
+        <w:t>, r</w:t>
+      </w:r>
+      <w:r>
+        <w:rPr>
+          <w:vertAlign w:val="subscript"/>
+        </w:rPr>
+        <w:t>off</w:t>
+      </w:r>
+      <w:r>
+        <w:t>, |φ</w:t>
+      </w:r>
+      <w:r>
+        <w:rPr>
+          <w:vertAlign w:val="subscript"/>
+        </w:rPr>
+        <w:t>y</w:t>
+      </w:r>
+      <w:r>
+        <w:t>|</w:t>
+      </w:r>
+      <w:r>
+        <w:rPr>
+          <w:vertAlign w:val="superscript"/>
+        </w:rPr>
+        <w:t>max</w:t>
+      </w:r>
+      <w:r>
+        <w:t>, σ̅</w:t>
+      </w:r>
+      <w:r>
+        <w:rPr>
+          <w:vertAlign w:val="subscript"/>
+        </w:rPr>
+        <w:t>l</w:t>
+      </w:r>
+      <w:r>
+        <w:rPr>
+          <w:vertAlign w:val="superscript"/>
+        </w:rPr>
+        <w:t>2</w:t>
+      </w:r>
+      <w:r>
+        <w:t>, P</w:t>
+      </w:r>
+      <w:r>
+        <w:rPr>
+          <w:vertAlign w:val="superscript"/>
+        </w:rPr>
+        <w:t>max</w:t>
+      </w:r>
+      <w:r>
+        <w:rPr>
+          <w:vertAlign w:val="subscript"/>
+        </w:rPr>
+        <w:t>sec</w:t>
+      </w:r>
+      <w:r>
+        <w:t>, r</w:t>
+      </w:r>
+      <w:r>
+        <w:rPr>
+          <w:vertAlign w:val="subscript"/>
+        </w:rPr>
+        <w:t>sec</w:t>
+      </w:r>
+      <w:r>
+        <w:t>, P</w:t>
+      </w:r>
+      <w:r>
+        <w:rPr>
+          <w:vertAlign w:val="superscript"/>
+        </w:rPr>
+        <w:t>max</w:t>
+      </w:r>
+      <w:r>
+        <w:rPr>
+          <w:vertAlign w:val="subscript"/>
+        </w:rPr>
+        <w:t>ovl</w:t>
+      </w:r>
+      <w:r>
+        <w:t>, P</w:t>
+      </w:r>
+      <w:r>
+        <w:rPr>
+          <w:vertAlign w:val="superscript"/>
+        </w:rPr>
+        <w:t>max</w:t>
+      </w:r>
+      <w:r>
+        <w:rPr>
+          <w:vertAlign w:val="subscript"/>
+        </w:rPr>
+        <w:t>whisp</w:t>
+      </w:r>
+      <w:r>
+        <w:t>]</w:t>
+      </w:r>
+    </w:p>
+    <w:p>
+      <w:pPr>
+        <w:pStyle w:val="IText"/>
+      </w:pPr>
+      <w:r>
+        <w:t xml:space="preserve">The Suspicion Index </w:t>
+      </w:r>
+      <w:r>
+        <w:t>SI ∈ [0, 1]</w:t>
+      </w:r>
+      <w:r>
+        <w:t xml:space="preserve"> is produced by a fusion model </w:t>
+      </w:r>
+      <w:r>
+        <w:t>f</w:t>
+      </w:r>
+      <w:r>
+        <w:rPr>
+          <w:vertAlign w:val="subscript"/>
+        </w:rPr>
+        <w:t>θ</w:t>
+      </w:r>
+      <w:r>
+        <w:t>(x)</w:t>
+      </w:r>
+      <w:r>
+        <w:t xml:space="preserve"> identified empirically (Section 6.3) among five candidates:</w:t>
+      </w:r>
+    </w:p>
+    <w:p>
+      <w:pPr>
+        <w:pStyle w:val="IText"/>
+      </w:pPr>
+      <w:r>
+        <w:rPr>
+          <w:b/>
+        </w:rPr>
+        <w:t xml:space="preserve">1. </w:t>
+      </w:r>
+      <w:r>
+        <w:rPr>
+          <w:b/>
+        </w:rPr>
+        <w:t>Weighted sum.</w:t>
+      </w:r>
+      <w:r>
+        <w:t xml:space="preserve"> The original rule from the conference draft: </w:t>
+      </w:r>
+      <w:r>
+        <w:t>SI = α V + β A + γ B</w:t>
+      </w:r>
+      <w:r>
+        <w:t xml:space="preserve"> with </w:t>
+      </w:r>
+      <w:r>
+        <w:t>α = 0.45, β = 0.30, γ = 0.25</w:t>
+      </w:r>
+      <w:r>
+        <w:t xml:space="preserve"> where </w:t>
+      </w:r>
+      <w:r>
+        <w:t>V, A, B</w:t>
+      </w:r>
+      <w:r>
+        <w:t xml:space="preserve"> are normalised visual, acoustic, and behavioural scores.</w:t>
+      </w:r>
+    </w:p>
+    <w:p>
+      <w:pPr>
+        <w:pStyle w:val="IText"/>
+      </w:pPr>
+      <w:r>
+        <w:rPr>
+          <w:b/>
+        </w:rPr>
+        <w:t xml:space="preserve">2. </w:t>
+      </w:r>
+      <w:r>
+        <w:rPr>
+          <w:b/>
+        </w:rPr>
+        <w:t>L2-regularised logistic regression.</w:t>
+      </w:r>
+    </w:p>
+    <w:p>
+      <w:pPr>
+        <w:pStyle w:val="IText"/>
+      </w:pPr>
+      <w:r>
+        <w:rPr>
+          <w:b/>
+        </w:rPr>
+        <w:t xml:space="preserve">3. </w:t>
+      </w:r>
+      <w:r>
+        <w:rPr>
+          <w:b/>
+        </w:rPr>
+        <w:t>Random forest</w:t>
+      </w:r>
+      <w:r>
+        <w:t xml:space="preserve"> [42] with 200 trees, max depth 8.</w:t>
+      </w:r>
+    </w:p>
+    <w:p>
+      <w:pPr>
+        <w:pStyle w:val="IText"/>
+      </w:pPr>
+      <w:r>
+        <w:rPr>
+          <w:b/>
+        </w:rPr>
+        <w:t xml:space="preserve">4. </w:t>
+      </w:r>
+      <w:r>
+        <w:rPr>
+          <w:b/>
+        </w:rPr>
+        <w:t>Multi-layer perceptron</w:t>
+      </w:r>
+      <w:r>
+        <w:t xml:space="preserve"> (32, 16) with StandardScaler preprocessing.</w:t>
+      </w:r>
+    </w:p>
+    <w:p>
+      <w:pPr>
+        <w:pStyle w:val="IText"/>
+      </w:pPr>
+      <w:r>
+        <w:rPr>
+          <w:b/>
+        </w:rPr>
+        <w:t xml:space="preserve">5. </w:t>
+      </w:r>
+      <w:r>
+        <w:rPr>
+          <w:b/>
+        </w:rPr>
+        <w:t>Gaussian naive Bayes</w:t>
+      </w:r>
+      <w:r>
+        <w:t>.</w:t>
+      </w:r>
+    </w:p>
+    <w:p>
+      <w:pPr>
+        <w:pStyle w:val="IText"/>
+      </w:pPr>
+      <w:r>
+        <w:t xml:space="preserve">Each model uses standard library defaults rather than an exhaustive hyperparameter search [47], so the comparison reflects out-of-the-box behaviour rather than per-model tuning effort. A session is </w:t>
       </w:r>
       <w:r>
         <w:rPr>
           <w:i/>
         </w:rPr>
-        <w:t>only</w:t>
-      </w:r>
-      <w:r>
-        <w:t xml:space="preserve"> the tuple $(c_i, p_i, t_i)$. No frame is stored.</w:t>
-      </w:r>
-    </w:p>
-    <w:p>
-      <w:pPr>
-        <w:pStyle w:val="IText"/>
-      </w:pPr>
-      <w:r>
-        <w:t>MediaPipe FaceMesh [15], [48] yields 468 facial landmarks $L = \{l_1, ..., l_{468}\}$. We compute four geometric descriptors:</w:t>
-      </w:r>
-    </w:p>
-    <w:p>
-      <w:pPr>
-        <w:pStyle w:val="IText"/>
-      </w:pPr>
-      <w:r>
-        <w:t xml:space="preserve">• </w:t>
-      </w:r>
-      <w:r>
-        <w:rPr>
-          <w:b/>
-        </w:rPr>
-        <w:t>Gaze deviation angle</w:t>
-      </w:r>
-      <w:r>
-        <w:t xml:space="preserve"> $\theta_g$: derived from the angular position of the nose tip relative to the eye-centre axis.</w:t>
-      </w:r>
-    </w:p>
-    <w:p>
-      <w:pPr>
-        <w:pStyle w:val="IText"/>
-      </w:pPr>
-      <w:r>
-        <w:t xml:space="preserve">• </w:t>
-      </w:r>
-      <w:r>
-        <w:rPr>
-          <w:b/>
-        </w:rPr>
-        <w:t>Head yaw</w:t>
-      </w:r>
-      <w:r>
-        <w:t xml:space="preserve"> $\phi_y$ and </w:t>
-      </w:r>
-      <w:r>
-        <w:rPr>
-          <w:b/>
-        </w:rPr>
-        <w:t>pitch</w:t>
-      </w:r>
-      <w:r>
-        <w:t xml:space="preserve"> $\phi_p$: computed from the relative position of ears, nose tip, and chin.</w:t>
-      </w:r>
-    </w:p>
-    <w:p>
-      <w:pPr>
-        <w:pStyle w:val="IText"/>
-      </w:pPr>
-      <w:r>
-        <w:t xml:space="preserve">• </w:t>
-      </w:r>
-      <w:r>
-        <w:rPr>
-          <w:b/>
-        </w:rPr>
-        <w:t>Lip variance</w:t>
-      </w:r>
-      <w:r>
-        <w:t xml:space="preserve"> $\sigma_l^2$: variance of the upper-lower lip distance over a 30-frame sliding window.</w:t>
-      </w:r>
-    </w:p>
-    <w:p>
-      <w:pPr>
-        <w:pStyle w:val="IText"/>
-      </w:pPr>
-      <w:r>
-        <w:t>Sustained off-screen gaze is flagged when $\theta_g &gt; 18°$ or $|\phi_y| &gt; 25°$ for at least 2.5 s.</w:t>
-      </w:r>
-    </w:p>
-    <w:p>
-      <w:pPr>
-        <w:pStyle w:val="ISubSectionTitle"/>
-      </w:pPr>
-      <w:r>
-        <w:rPr>
-          <w:b/>
-        </w:rPr>
-        <w:t>Acoustic Subsystem (Content-Free Whisper)</w:t>
-      </w:r>
-    </w:p>
-    <w:p>
-      <w:pPr>
-        <w:pStyle w:val="IText"/>
-      </w:pPr>
-      <w:r>
-        <w:t>We use Whisper-Base [16] (74 M parameters) with the decoder disabled. The encoder maps a 30-second log-mel spectrogram to a hidden state $H \in \mathbb{R}^{T \times d}$, where $T = 1500$ and $d = 512$. For each 5-second buffer $a$, we compute:</w:t>
-      </w:r>
-    </w:p>
-    <w:p>
-      <w:pPr>
-        <w:pStyle w:val="IText"/>
-      </w:pPr>
-      <w:r>
-        <w:t xml:space="preserve">• </w:t>
-      </w:r>
-      <w:r>
-        <w:rPr>
-          <w:b/>
-        </w:rPr>
-        <w:t>Voice Activity Ratio</w:t>
-      </w:r>
-      <w:r>
-        <w:t xml:space="preserve"> $\mathrm{VAR}(a)$: fraction of short-time frames whose energy exceeds 1.4× the median.</w:t>
-      </w:r>
-    </w:p>
-    <w:p>
-      <w:pPr>
-        <w:pStyle w:val="IText"/>
-      </w:pPr>
-      <w:r>
-        <w:t xml:space="preserve">• </w:t>
-      </w:r>
-      <w:r>
-        <w:rPr>
-          <w:b/>
-        </w:rPr>
-        <w:t>Pitch fluctuation</w:t>
-      </w:r>
-      <w:r>
-        <w:t xml:space="preserve"> $\mathrm{PFV}(a)$: median absolute deviation of the auto-correlation-based pitch estimate across active frames, normalised by the median.</w:t>
-      </w:r>
-    </w:p>
-    <w:p>
-      <w:pPr>
-        <w:pStyle w:val="IText"/>
-      </w:pPr>
-      <w:r>
-        <w:t xml:space="preserve">• </w:t>
-      </w:r>
-      <w:r>
-        <w:rPr>
-          <w:b/>
-        </w:rPr>
-        <w:t>Spectral centroid fluctuation</w:t>
-      </w:r>
-      <w:r>
-        <w:t xml:space="preserve"> $\mathrm{CFV}(a)$: same as PFV but over the spectral centroid.</w:t>
-      </w:r>
-    </w:p>
-    <w:p>
-      <w:pPr>
-        <w:pStyle w:val="IText"/>
-      </w:pPr>
-      <w:r>
-        <w:t xml:space="preserve">• </w:t>
-      </w:r>
-      <w:r>
-        <w:rPr>
-          <w:b/>
-        </w:rPr>
-        <w:t>High-band ratio</w:t>
-      </w:r>
-      <w:r>
-        <w:t xml:space="preserve"> $\mathrm{HBR}(a)$: ratio of energy in [1.5–6.5 kHz] over [60–1500 Hz].</w:t>
-      </w:r>
-    </w:p>
-    <w:p>
-      <w:pPr>
-        <w:pStyle w:val="IText"/>
-      </w:pPr>
-      <w:r>
-        <w:t>The secondary-speaker probability is then computed by an empirically calibrated logistic mapping:</w:t>
-      </w:r>
-    </w:p>
-    <w:p>
-      <w:pPr>
-        <w:pStyle w:val="IText"/>
-        <w:jc w:val="center"/>
-      </w:pPr>
+        <w:t>warned</w:t>
+      </w:r>
+      <w:r>
+        <w:t xml:space="preserve"> if </w:t>
+      </w:r>
+      <w:r>
+        <w:t>SI ≥ 0.35</w:t>
+      </w:r>
+      <w:r>
+        <w:t xml:space="preserve"> and </w:t>
+      </w:r>
       <w:r>
         <w:rPr>
           <w:i/>
         </w:rPr>
-        <w:t>P_\mathrm{sec}(a) = \sigma\big(\beta_0 + \beta_1 \mathrm{PFV} + \beta_2 \mathrm{CFV}\big) \cdot \mathrm{gate}(a)</w:t>
-      </w:r>
-    </w:p>
-    <w:p>
-      <w:pPr>
-        <w:pStyle w:val="IText"/>
-      </w:pPr>
-      <w:r>
-        <w:t>where $\mathrm{gate}(a)$ is an activity gate that is near zero for silent buffers (built from a clipped function of the RMS in dBFS and VAR). Overlap and whisper probabilities follow analogous logistic mappings with their own coefficient set. Crucially, no decoder is ever called, so the linguistic content of the audio cannot be recovered.</w:t>
-      </w:r>
-    </w:p>
-    <w:p>
-      <w:pPr>
-        <w:pStyle w:val="ISubSectionTitle"/>
-      </w:pPr>
-      <w:r>
-        <w:rPr>
-          <w:b/>
-        </w:rPr>
-        <w:t>Suspicion Index Fusion Model</w:t>
-      </w:r>
-    </w:p>
-    <w:p>
-      <w:pPr>
-        <w:pStyle w:val="IText"/>
-      </w:pPr>
-      <w:r>
-        <w:t>For each session we summarise the metadata stream into a 12-dimensional feature vector $\mathbf{x} \in \mathbb{R}^{12}$:</w:t>
-      </w:r>
-    </w:p>
-    <w:p>
-      <w:pPr>
-        <w:pStyle w:val="IText"/>
-        <w:jc w:val="center"/>
-      </w:pPr>
-      <w:r>
-        <w:rPr>
-          <w:i/>
-        </w:rPr>
-        <w:t>\mathbf{x} = [p^\max_\text{phone}, r^\text{dur}_\text{phone}, p^\max_\text{book}, n^\text{max}_\text{persons}, \theta^\max_g, r_\text{off}, |\phi_y|^\max, \bar\sigma_l^2, P^\max_\text{sec}, r_\text{sec}, P^\max_\text{ovl}, P^\max_\text{whisp}]</w:t>
-      </w:r>
-    </w:p>
-    <w:p>
-      <w:pPr>
-        <w:pStyle w:val="IText"/>
-      </w:pPr>
-      <w:r>
-        <w:t>The Suspicion Index $\mathrm{SI} \in [0, 1]$ is produced by a fusion model $f_\theta(\mathbf{x})$ identified empirically (Section 6.3) among five candidates:</w:t>
-      </w:r>
-    </w:p>
-    <w:p>
-      <w:pPr>
-        <w:pStyle w:val="IText"/>
-      </w:pPr>
-      <w:r>
-        <w:rPr>
-          <w:b/>
-        </w:rPr>
-        <w:t xml:space="preserve">1. </w:t>
-      </w:r>
-      <w:r>
-        <w:rPr>
-          <w:b/>
-        </w:rPr>
-        <w:t>Weighted sum.</w:t>
-      </w:r>
-      <w:r>
-        <w:t xml:space="preserve"> The original rule from the conference draft: $\mathrm{SI} = \alpha V + \beta A + \gamma B$ with $\alpha = 0.45, \beta = 0.30, \gamma = 0.25$ where $V, A, B$ are normalised visual, acoustic, and behavioural scores.</w:t>
-      </w:r>
-    </w:p>
-    <w:p>
-      <w:pPr>
-        <w:pStyle w:val="IText"/>
-      </w:pPr>
-      <w:r>
-        <w:rPr>
-          <w:b/>
-        </w:rPr>
-        <w:t xml:space="preserve">2. </w:t>
-      </w:r>
-      <w:r>
-        <w:rPr>
-          <w:b/>
-        </w:rPr>
-        <w:t>L2-regularised logistic regression.</w:t>
-      </w:r>
-    </w:p>
-    <w:p>
-      <w:pPr>
-        <w:pStyle w:val="IText"/>
-      </w:pPr>
-      <w:r>
-        <w:rPr>
-          <w:b/>
-        </w:rPr>
-        <w:t xml:space="preserve">3. </w:t>
-      </w:r>
-      <w:r>
-        <w:rPr>
-          <w:b/>
-        </w:rPr>
-        <w:t>Random forest</w:t>
-      </w:r>
-      <w:r>
-        <w:t xml:space="preserve"> [42] with 200 trees, max depth 8.</w:t>
-      </w:r>
-    </w:p>
-    <w:p>
-      <w:pPr>
-        <w:pStyle w:val="IText"/>
-      </w:pPr>
-      <w:r>
-        <w:rPr>
-          <w:b/>
-        </w:rPr>
-        <w:t xml:space="preserve">4. </w:t>
-      </w:r>
-      <w:r>
-        <w:rPr>
-          <w:b/>
-        </w:rPr>
-        <w:t>Multi-layer perceptron</w:t>
-      </w:r>
-      <w:r>
-        <w:t xml:space="preserve"> (32, 16) with StandardScaler preprocessing.</w:t>
-      </w:r>
-    </w:p>
-    <w:p>
-      <w:pPr>
-        <w:pStyle w:val="IText"/>
-      </w:pPr>
-      <w:r>
-        <w:rPr>
-          <w:b/>
-        </w:rPr>
-        <w:t xml:space="preserve">5. </w:t>
-      </w:r>
-      <w:r>
-        <w:rPr>
-          <w:b/>
-        </w:rPr>
-        <w:t>Gaussian naive Bayes</w:t>
+        <w:t>flagged</w:t>
+      </w:r>
+      <w:r>
+        <w:t xml:space="preserve"> if </w:t>
+      </w:r>
+      <w:r>
+        <w:t>SI ≥ 0.65</w:t>
       </w:r>
       <w:r>
         <w:t>.</w:t>
-      </w:r>
-    </w:p>
-    <w:p>
-      <w:pPr>
-        <w:pStyle w:val="IText"/>
-      </w:pPr>
-      <w:r>
-        <w:t xml:space="preserve">Each model uses standard library defaults rather than an exhaustive hyperparameter search [47], so the comparison reflects out-of-the-box behaviour rather than per-model tuning effort. A session is </w:t>
-      </w:r>
-      <w:r>
-        <w:rPr>
-          <w:i/>
-        </w:rPr>
-        <w:t>warned</w:t>
-      </w:r>
-      <w:r>
-        <w:t xml:space="preserve"> if $\mathrm{SI} \geq 0.35$ and </w:t>
-      </w:r>
-      <w:r>
-        <w:rPr>
-          <w:i/>
-        </w:rPr>
-        <w:t>flagged</w:t>
-      </w:r>
-      <w:r>
-        <w:t xml:space="preserve"> if $\mathrm{SI} \geq 0.65$.</w:t>
       </w:r>
     </w:p>
     <w:p>
@@ -8316,7 +8895,10 @@
         <w:pStyle w:val="IText"/>
       </w:pPr>
       <w:r>
-        <w:t xml:space="preserve">• A raw-audio attacker that extracts mel-frequency cepstral coefficients from the raw 16 kHz audio buffer (the kind of artefact a conventional proctoring system would retain) achieves a re-identification AUC of </w:t>
+        <w:t xml:space="preserve">• </w:t>
+      </w:r>
+      <w:r>
+        <w:t xml:space="preserve">A raw-audio attacker that extracts mel-frequency cepstral coefficients from the raw 16 kHz audio buffer (the kind of artefact a conventional proctoring system would retain) achieves a re-identification AUC of </w:t>
       </w:r>
       <w:r>
         <w:rPr>
@@ -8333,7 +8915,10 @@
         <w:pStyle w:val="IText"/>
       </w:pPr>
       <w:r>
-        <w:t xml:space="preserve">• A metadata-only attacker using the same classifier on the event log emitted by the proposed system achieves an AUC of </w:t>
+        <w:t xml:space="preserve">• </w:t>
+      </w:r>
+      <w:r>
+        <w:t xml:space="preserve">A metadata-only attacker using the same classifier on the event log emitted by the proposed system achieves an AUC of </w:t>
       </w:r>
       <w:r>
         <w:rPr>
@@ -8741,23 +9326,32 @@
         <w:pStyle w:val="IText"/>
       </w:pPr>
       <w:r>
-        <w:t>• Differentially private gaze and lip-movement signals to bound information leakage to a configurable ε budget.</w:t>
-      </w:r>
-    </w:p>
-    <w:p>
-      <w:pPr>
-        <w:pStyle w:val="IText"/>
-      </w:pPr>
-      <w:r>
-        <w:t>• A formal proof of non-invertibility for the Whisper-encoder embedding under our content-free configuration.</w:t>
-      </w:r>
-    </w:p>
-    <w:p>
-      <w:pPr>
-        <w:pStyle w:val="IText"/>
-      </w:pPr>
-      <w:r>
-        <w:t>• A longitudinal study across at least three Moroccan universities to validate cross-cohort generalisation and gather examiner feedback for the active-learning loop.</w:t>
+        <w:t xml:space="preserve">• </w:t>
+      </w:r>
+      <w:r>
+        <w:t>Differentially private gaze and lip-movement signals to bound information leakage to a configurable ε budget.</w:t>
+      </w:r>
+    </w:p>
+    <w:p>
+      <w:pPr>
+        <w:pStyle w:val="IText"/>
+      </w:pPr>
+      <w:r>
+        <w:t xml:space="preserve">• </w:t>
+      </w:r>
+      <w:r>
+        <w:t>A formal proof of non-invertibility for the Whisper-encoder embedding under our content-free configuration.</w:t>
+      </w:r>
+    </w:p>
+    <w:p>
+      <w:pPr>
+        <w:pStyle w:val="IText"/>
+      </w:pPr>
+      <w:r>
+        <w:t xml:space="preserve">• </w:t>
+      </w:r>
+      <w:r>
+        <w:t>A longitudinal study across at least three Moroccan universities to validate cross-cohort generalisation and gather examiner feedback for the active-learning loop.</w:t>
       </w:r>
     </w:p>
     <w:p>

</xml_diff>

<commit_message>
Restore the journal running heads on every page
The build cleared the template body to lay out the manuscript, which also removed
the section that carried the page headers (the title-page header reference and the
titlePg flag), so the first page rendered with no 'Informatica ...' running head and
later pages inherited nothing. Re-attach the first/default/even header references and
titlePg to the title section so the heads cascade through the document, and overwrite
the template's placeholder header text and document properties (short title, author,
volume, year) with this paper's values. The first-page header is now a clean static
journal line plus the page number; even/odd pages show the page number, journal line,
short title and author as the template intends.
</commit_message>
<xml_diff>
--- a/manuscript/Article_Informatica.docx
+++ b/manuscript/Article_Informatica.docx
@@ -101,10 +101,14 @@
     <w:p>
       <w:pPr>
         <w:sectPr>
+          <w:headerReference w:type="even" r:id="rId7"/>
+          <w:headerReference w:type="default" r:id="rId8"/>
+          <w:headerReference w:type="first" r:id="rId9"/>
           <w:type w:val="continuous"/>
           <w:pgSz w:w="11906" w:h="16838"/>
           <w:pgMar w:top="1644" w:right="1077" w:bottom="1134" w:left="1304" w:header="936" w:footer="720"/>
           <w:cols w:num="1" w:space="284"/>
+          <w:titlePg/>
         </w:sectPr>
       </w:pPr>
     </w:p>
@@ -9479,7 +9483,6 @@
       </w:r>
     </w:p>
     <w:sectPr>
-      <w:headerReference w:type="even" r:id="rId14"/>
       <w:type w:val="continuous"/>
       <w:pgSz w:w="11906" w:h="16838" w:code="9"/>
       <w:pgMar w:top="1644" w:right="1077" w:bottom="1134" w:left="1304" w:header="936" w:footer="720" w:gutter="0"/>
@@ -9572,7 +9575,7 @@
         <w:rStyle w:val="PageNumber"/>
       </w:rPr>
       <w:tab/>
-      <w:t>Informatica 23 (1999) xxx–yyy</w:t>
+      <w:t>Informatica 50 (2026) xxx–yyy</w:t>
     </w:r>
     <w:r>
       <w:rPr>
@@ -9609,7 +9612,7 @@
         <w:rStyle w:val="PageNumber"/>
         <w:noProof/>
       </w:rPr>
-      <w:t>Borut</w:t>
+      <w:t>R. Ali et al.</w:t>
     </w:r>
     <w:r>
       <w:rPr>
@@ -9649,7 +9652,7 @@
       <w:rPr>
         <w:rStyle w:val="PageNumber"/>
       </w:rPr>
-      <w:t>Enter short title in File/Properties/Summary</w:t>
+      <w:t>Privacy-Preserving Multi-Modal Proctoring for Online Exams</w:t>
     </w:r>
     <w:r>
       <w:rPr>
@@ -9675,13 +9678,13 @@
         <w:rStyle w:val="PageNumber"/>
         <w:b/>
       </w:rPr>
-      <w:t>23</w:t>
+      <w:t>50</w:t>
     </w:r>
     <w:r>
       <w:rPr>
         <w:rStyle w:val="PageNumber"/>
       </w:rPr>
-      <w:t xml:space="preserve"> (1999) xxx–yyy</w:t>
+      <w:t xml:space="preserve"> (2026) xxx–yyy</w:t>
     </w:r>
   </w:p>
 </w:hdr>
@@ -9693,212 +9696,15 @@
     <w:pPr>
       <w:pStyle w:val="Header"/>
       <w:tabs>
-        <w:tab w:val="clear" w:pos="4153"/>
-        <w:tab w:val="clear" w:pos="8306"/>
-        <w:tab w:val="right" w:pos="9048"/>
         <w:tab w:val="right" w:pos="9524"/>
       </w:tabs>
-      <w:rPr>
-        <w:szCs w:val="18"/>
-      </w:rPr>
     </w:pPr>
     <w:r>
       <w:rPr>
         <w:sz w:val="18"/>
-        <w:szCs w:val="18"/>
       </w:rPr>
       <w:tab/>
-    </w:r>
-    <w:r>
-      <w:rPr>
-        <w:sz w:val="18"/>
-        <w:lang w:val="sl-SI"/>
-      </w:rPr>
-      <w:t xml:space="preserve">Informatica </w:t>
-    </w:r>
-    <w:r>
-      <w:rPr>
-        <w:b/>
-        <w:sz w:val="18"/>
-        <w:lang w:val="sl-SI"/>
-      </w:rPr>
-      <w:fldChar w:fldCharType="begin"/>
-    </w:r>
-    <w:r>
-      <w:rPr>
-        <w:b/>
-        <w:sz w:val="18"/>
-        <w:lang w:val="sl-SI"/>
-      </w:rPr>
-      <w:instrText xml:space="preserve"> DOCPROPERTY  Letnik  \* MERGEFORMAT </w:instrText>
-    </w:r>
-    <w:r>
-      <w:rPr>
-        <w:b/>
-        <w:sz w:val="18"/>
-        <w:lang w:val="sl-SI"/>
-      </w:rPr>
-      <w:fldChar w:fldCharType="separate"/>
-    </w:r>
-    <w:r>
-      <w:rPr>
-        <w:b/>
-        <w:sz w:val="18"/>
-        <w:lang w:val="sl-SI"/>
-      </w:rPr>
-      <w:t>37</w:t>
-    </w:r>
-    <w:r>
-      <w:rPr>
-        <w:b/>
-        <w:sz w:val="18"/>
-        <w:lang w:val="sl-SI"/>
-      </w:rPr>
-      <w:fldChar w:fldCharType="end"/>
-    </w:r>
-    <w:r>
-      <w:rPr>
-        <w:sz w:val="18"/>
-        <w:lang w:val="sl-SI"/>
-      </w:rPr>
-      <w:t xml:space="preserve"> (</w:t>
-    </w:r>
-    <w:r>
-      <w:rPr>
-        <w:sz w:val="18"/>
-        <w:lang w:val="sl-SI"/>
-      </w:rPr>
-      <w:fldChar w:fldCharType="begin"/>
-    </w:r>
-    <w:r>
-      <w:rPr>
-        <w:sz w:val="18"/>
-        <w:lang w:val="sl-SI"/>
-      </w:rPr>
-      <w:instrText xml:space="preserve"> DOCPROPERTY  Leto  \* MERGEFORMAT </w:instrText>
-    </w:r>
-    <w:r>
-      <w:rPr>
-        <w:sz w:val="18"/>
-        <w:lang w:val="sl-SI"/>
-      </w:rPr>
-      <w:fldChar w:fldCharType="separate"/>
-    </w:r>
-    <w:r>
-      <w:rPr>
-        <w:sz w:val="18"/>
-        <w:lang w:val="sl-SI"/>
-      </w:rPr>
-      <w:t>2013</w:t>
-    </w:r>
-    <w:r>
-      <w:rPr>
-        <w:sz w:val="18"/>
-        <w:lang w:val="sl-SI"/>
-      </w:rPr>
-      <w:fldChar w:fldCharType="end"/>
-    </w:r>
-    <w:r>
-      <w:rPr>
-        <w:sz w:val="18"/>
-        <w:lang w:val="sl-SI"/>
-      </w:rPr>
-      <w:t xml:space="preserve">) </w:t>
-    </w:r>
-    <w:r>
-      <w:rPr>
-        <w:rStyle w:val="PageNumber"/>
-        <w:bCs/>
-        <w:sz w:val="18"/>
-        <w:szCs w:val="18"/>
-      </w:rPr>
-      <w:fldChar w:fldCharType="begin"/>
-    </w:r>
-    <w:r>
-      <w:rPr>
-        <w:rStyle w:val="PageNumber"/>
-        <w:bCs/>
-        <w:sz w:val="18"/>
-        <w:szCs w:val="18"/>
-      </w:rPr>
-      <w:instrText xml:space="preserve"> PAGE </w:instrText>
-    </w:r>
-    <w:r>
-      <w:rPr>
-        <w:rStyle w:val="PageNumber"/>
-        <w:bCs/>
-        <w:sz w:val="18"/>
-        <w:szCs w:val="18"/>
-      </w:rPr>
-      <w:fldChar w:fldCharType="separate"/>
-    </w:r>
-    <w:r>
-      <w:rPr>
-        <w:rStyle w:val="PageNumber"/>
-        <w:bCs/>
-        <w:noProof/>
-        <w:sz w:val="18"/>
-        <w:szCs w:val="18"/>
-      </w:rPr>
-      <w:t>501</w:t>
-    </w:r>
-    <w:r>
-      <w:rPr>
-        <w:rStyle w:val="PageNumber"/>
-        <w:bCs/>
-        <w:sz w:val="18"/>
-        <w:szCs w:val="18"/>
-      </w:rPr>
-      <w:fldChar w:fldCharType="end"/>
-    </w:r>
-    <w:r>
-      <w:rPr>
-        <w:sz w:val="18"/>
-        <w:lang w:val="sl-SI"/>
-      </w:rPr>
-      <w:t>–</w:t>
-    </w:r>
-    <w:r>
-      <w:rPr>
-        <w:sz w:val="18"/>
-        <w:lang w:val="sl-SI"/>
-      </w:rPr>
-      <w:fldChar w:fldCharType="begin"/>
-    </w:r>
-    <w:r>
-      <w:rPr>
-        <w:sz w:val="18"/>
-        <w:lang w:val="sl-SI"/>
-      </w:rPr>
-      <w:instrText xml:space="preserve"> DOCPROPERTY  pageL  \* MERGEFORMAT </w:instrText>
-    </w:r>
-    <w:r>
-      <w:rPr>
-        <w:sz w:val="18"/>
-        <w:lang w:val="sl-SI"/>
-      </w:rPr>
-      <w:fldChar w:fldCharType="separate"/>
-    </w:r>
-    <w:r>
-      <w:rPr>
-        <w:sz w:val="18"/>
-        <w:lang w:val="sl-SI"/>
-      </w:rPr>
-      <w:t>505</w:t>
-    </w:r>
-    <w:r>
-      <w:rPr>
-        <w:sz w:val="18"/>
-        <w:lang w:val="sl-SI"/>
-      </w:rPr>
-      <w:fldChar w:fldCharType="end"/>
-    </w:r>
-    <w:r>
-      <w:rPr>
-        <w:sz w:val="18"/>
-        <w:lang w:val="sl-SI"/>
-      </w:rPr>
-      <w:tab/>
+      <w:t xml:space="preserve">Informatica 50 (2026) xxx–yyy  </w:t>
     </w:r>
     <w:r>
       <w:rPr>
@@ -9927,7 +9733,7 @@
         <w:b/>
         <w:noProof/>
       </w:rPr>
-      <w:t>501</w:t>
+      <w:t>1</w:t>
     </w:r>
     <w:r>
       <w:rPr>

</xml_diff>

<commit_message>
Match the template's paragraph spacing and body indentation
The builder packed the front matter with no separators and set every body
paragraph to the flush, no-indent style, so paragraphs ran together and the
front-matter blocks were too tight. Follow the template's conventions instead:
a blank line after the author block, 12 pt of space after the Keywords line, and
a blank line before the abstract; and in the body, only the first paragraph after
a heading is flush (Normal-no indent) while subsequent paragraphs take the
first-line indent of the Normal style, which is how the template separates them.
</commit_message>
<xml_diff>
--- a/manuscript/Article_Informatica.docx
+++ b/manuscript/Article_Informatica.docx
@@ -58,6 +58,12 @@
       <w:pPr>
         <w:pStyle w:val="Normal-noindent"/>
       </w:pPr>
+    </w:p>
+    <w:p>
+      <w:pPr>
+        <w:pStyle w:val="Normal-noindent"/>
+        <w:spacing w:after="240"/>
+      </w:pPr>
       <w:r>
         <w:rPr>
           <w:b/>
@@ -75,6 +81,11 @@
       <w:r>
         <w:t xml:space="preserve">Received: </w:t>
       </w:r>
+    </w:p>
+    <w:p>
+      <w:pPr>
+        <w:pStyle w:val="Normal-noindent"/>
+      </w:pPr>
     </w:p>
     <w:p>
       <w:pPr>
@@ -143,9 +154,7 @@
       </w:r>
     </w:p>
     <w:p>
-      <w:pPr>
-        <w:pStyle w:val="Normal-noindent"/>
-      </w:pPr>
+      <w:pPr/>
       <w:r>
         <w:t xml:space="preserve">In parallel, the regulatory environment has tightened sharply. Under GDPR Article 4(14), </w:t>
       </w:r>
@@ -465,9 +474,7 @@
       </w:r>
     </w:p>
     <w:p>
-      <w:pPr>
-        <w:pStyle w:val="Normal-noindent"/>
-      </w:pPr>
+      <w:pPr/>
       <w:r>
         <w:t>These approaches share an important limitation: they require either persistent biometric templates (face embeddings) or extensive raw-video retention, both of which raise significant GDPR Article 9 and CNDP Law 09-08 exposure once used for identification.</w:t>
       </w:r>
@@ -2182,9 +2189,7 @@
       </w:r>
     </w:p>
     <w:p>
-      <w:pPr>
-        <w:pStyle w:val="Normal-noindent"/>
-      </w:pPr>
+      <w:pPr/>
       <w:r>
         <w:t>Figure 1 shows the end-to-end pipeline.</w:t>
       </w:r>
@@ -2442,9 +2447,7 @@
       </w:r>
     </w:p>
     <w:p>
-      <w:pPr>
-        <w:pStyle w:val="Normal-noindent"/>
-      </w:pPr>
+      <w:pPr/>
       <w:r>
         <w:t xml:space="preserve">A system is </w:t>
       </w:r>
@@ -2498,9 +2501,7 @@
       </w:r>
     </w:p>
     <w:p>
-      <w:pPr>
-        <w:pStyle w:val="Normal-noindent"/>
-      </w:pPr>
+      <w:pPr/>
       <w:r>
         <w:t xml:space="preserve">For each detection </w:t>
       </w:r>
@@ -2650,9 +2651,7 @@
       </w:r>
     </w:p>
     <w:p>
-      <w:pPr>
-        <w:pStyle w:val="Normal-noindent"/>
-      </w:pPr>
+      <w:pPr/>
       <w:r>
         <w:t xml:space="preserve">MediaPipe FaceMesh [15], [48] yields 468 facial landmarks </w:t>
       </w:r>
@@ -2796,9 +2795,7 @@
       </w:r>
     </w:p>
     <w:p>
-      <w:pPr>
-        <w:pStyle w:val="Normal-noindent"/>
-      </w:pPr>
+      <w:pPr/>
       <w:r>
         <w:t xml:space="preserve">Sustained off-screen gaze is flagged when </w:t>
       </w:r>
@@ -2975,9 +2972,7 @@
       </w:r>
     </w:p>
     <w:p>
-      <w:pPr>
-        <w:pStyle w:val="Normal-noindent"/>
-      </w:pPr>
+      <w:pPr/>
       <w:r>
         <w:t>The secondary-speaker probability is then computed by an empirically calibrated logistic mapping:</w:t>
       </w:r>
@@ -3028,9 +3023,7 @@
       </w:r>
     </w:p>
     <w:p>
-      <w:pPr>
-        <w:pStyle w:val="Normal-noindent"/>
-      </w:pPr>
+      <w:pPr/>
       <w:r>
         <w:t xml:space="preserve">where </w:t>
       </w:r>
@@ -3253,9 +3246,7 @@
       </w:r>
     </w:p>
     <w:p>
-      <w:pPr>
-        <w:pStyle w:val="Normal-noindent"/>
-      </w:pPr>
+      <w:pPr/>
       <w:r>
         <w:t xml:space="preserve">The Suspicion Index </w:t>
       </w:r>
@@ -3397,9 +3388,7 @@
       </w:r>
     </w:p>
     <w:p>
-      <w:pPr>
-        <w:pStyle w:val="Normal-noindent"/>
-      </w:pPr>
+      <w:pPr/>
       <w:r>
         <w:t xml:space="preserve">Each model uses standard library defaults rather than an exhaustive hyperparameter search [47], so the comparison reflects out-of-the-box behaviour rather than per-model tuning effort. A session is </w:t>
       </w:r>
@@ -3454,25 +3443,19 @@
       </w:r>
     </w:p>
     <w:p>
-      <w:pPr>
-        <w:pStyle w:val="Normal-noindent"/>
-      </w:pPr>
+      <w:pPr/>
       <w:r>
         <w:t>``` {event_type: string, confidence_or_probability: float in [0,1], timestamp: ISO-8601, module: 'visual'|'acoustic'|'behaviour'|'fusion'}</w:t>
       </w:r>
     </w:p>
     <w:p>
-      <w:pPr>
-        <w:pStyle w:val="Normal-noindent"/>
-      </w:pPr>
+      <w:pPr/>
       <w:r>
         <w:t>```</w:t>
       </w:r>
     </w:p>
     <w:p>
-      <w:pPr>
-        <w:pStyle w:val="Normal-noindent"/>
-      </w:pPr>
+      <w:pPr/>
       <w:r>
         <w:t>We deliberately do not write bounding boxes, landmarks, or any time series that could be used to triangulate identity. The model itself is shipped without per-candidate state. Figure 2 illustrates how the per-modality risk components and the resulting Suspicion Index evolve over a simulated 60-second session, including the warn (0.35) and flag (0.65) thresholds.</w:t>
       </w:r>
@@ -3705,9 +3688,7 @@
       </w:r>
     </w:p>
     <w:p>
-      <w:pPr>
-        <w:pStyle w:val="Normal-noindent"/>
-      </w:pPr>
+      <w:pPr/>
       <w:r>
         <w:t>All datasets, generators, and trained-model state are reproducible from a fixed random seed (42).</w:t>
       </w:r>
@@ -3732,9 +3713,7 @@
       </w:r>
     </w:p>
     <w:p>
-      <w:pPr>
-        <w:pStyle w:val="Normal-noindent"/>
-      </w:pPr>
+      <w:pPr/>
       <w:r>
         <w:t>Latency is measured per-call with `time.perf_counter()` after a 3-call warmup; we report mean, standard deviation, median, p95, and p99 in milliseconds. Memory footprint is measured via `resource.getrusage`.</w:t>
       </w:r>
@@ -4651,17 +4630,13 @@
       </w:pPr>
     </w:p>
     <w:p>
-      <w:pPr>
-        <w:pStyle w:val="Normal-noindent"/>
-      </w:pPr>
+      <w:pPr/>
       <w:r>
         <w:t>Per-frame YOLOv8-s inference latency is characterised separately in Section 6.5 (Table 7); on the deployed MPS configuration the median is 34.4 ms per frame.</w:t>
       </w:r>
     </w:p>
     <w:p>
-      <w:pPr>
-        <w:pStyle w:val="Normal-noindent"/>
-      </w:pPr>
+      <w:pPr/>
       <w:r>
         <w:t xml:space="preserve">The low book recall (6.8%) reflects a known limitation of the YOLOv8-s checkpoint used out-of-the-box on the COCO definition of </w:t>
       </w:r>
@@ -5152,9 +5127,7 @@
       </w:pPr>
     </w:p>
     <w:p>
-      <w:pPr>
-        <w:pStyle w:val="Normal-noindent"/>
-      </w:pPr>
+      <w:pPr/>
       <w:r>
         <w:t>Mean per-buffer inference latency is 119.3 ms for a 5-second buffer (≈ 42× faster than real time on the M4 Max CPU). The mean secondary-speaker probability is near zero for silence (0.00) and background noise (0.01), and rises to 0.66 for single-speaker clips and 0.73 for two-speaker clips. The relatively high value for single-speaker clips (and the resulting moderate ROC AUC of 0.774) is the principal source of false positives: a single real speaker with natural pitch variation can resemble a second voice to a content-free detector that has no access to decoded speaker identity. We report this limitation openly; speaker-count estimation from non-decoded embeddings is intrinsically harder than from full diarization, which is the privacy cost of the content-free design. The whisper detector is cleaner: whispered clips score 0.60 on the whisper probability versus ≤ 0.02 for every other class, giving ROC AUC 0.935. These numbers, obtained on real read English speech, are a more realistic estimate of operational performance than a fully-synthetic benchmark would give.</w:t>
       </w:r>
@@ -5573,9 +5546,7 @@
       </w:pPr>
     </w:p>
     <w:p>
-      <w:pPr>
-        <w:pStyle w:val="Normal-noindent"/>
-      </w:pPr>
+      <w:pPr/>
       <w:r>
         <w:t>Off-screen gaze is detected reliably (AUC ≈ 0.94 on real-face anchors); lip-movement is intrinsically harder on real landmarks because the upper- and lower-lip Y-coordinates encode multiple confounding factors (mouth open/closed, smile, jaw drop), which is consistent with prior work on lip-reading without explicit phoneme labels [23]. We do not claim the lip-movement cue is reliable on its own; the ablation in Section 6.4 quantifies its marginal contribution within the fusion model.</w:t>
       </w:r>
@@ -6276,9 +6247,7 @@
       </w:pPr>
     </w:p>
     <w:p>
-      <w:pPr>
-        <w:pStyle w:val="Normal-noindent"/>
-      </w:pPr>
+      <w:pPr/>
       <w:r>
         <w:t xml:space="preserve">The random forest attains the highest mean F1 (0.905), but the significance testing tells a more careful story that we report in full. McNemar's test (continuity-corrected, on the pooled cross-validation predictions) gives, for the random forest against each alternative: χ²(weighted sum) = 0.80 (p = 0.37), χ²(logistic) = 1.69 (p = 0.19), χ²(MLP) = 7.56 (p = 6.0 × 10⁻³), χ²(naive Bayes) = 17.50 (p = 2.9 × 10⁻⁵). In other words, the random forest is </w:t>
       </w:r>
@@ -6329,9 +6298,7 @@
       </w:r>
     </w:p>
     <w:p>
-      <w:pPr>
-        <w:pStyle w:val="Normal-noindent"/>
-      </w:pPr>
+      <w:pPr/>
       <w:r>
         <w:t>Table 6 reports two complementary ablations of the random-forest fusion model. The upper block is the leave-one-modality-out (LOMO) study (ΔF1 is relative to the all-modalities baseline); the lower block is the single-modality study (each model sees only one modality's features).</w:t>
       </w:r>
@@ -6775,9 +6742,7 @@
       </w:pPr>
     </w:p>
     <w:p>
-      <w:pPr>
-        <w:pStyle w:val="Normal-noindent"/>
-      </w:pPr>
+      <w:pPr/>
       <w:r>
         <w:t>Two observations follow. First, the visual and behavioural modalities carry the most decision-relevant information: removing either costs roughly 0.04 F1 and, in the case of behaviour, drops ROC AUC from 0.886 to 0.732. Removing the acoustic modality barely changes F1 (−0.005), confirming that on this dataset acoustic cues are the most redundant of the three for the binary cheating decision, although they are, by construction, the only modality whose signal does not depend on the candidate remaining in frame. Second, no single modality is sufficient on its own: the best single-modality model (acoustic only, F1 = 0.832) trails the fused model by 0.073 F1, and the visual-only model collapses to 0.727 because YOLOv8-s alone misses many partially-occluded phones (Section 6.1). The fusion model's value is therefore in combining complementary weak signals rather than in any single dominant cue.</w:t>
       </w:r>
@@ -8120,9 +8085,7 @@
       </w:pPr>
     </w:p>
     <w:p>
-      <w:pPr>
-        <w:pStyle w:val="Normal-noindent"/>
-      </w:pPr>
+      <w:pPr/>
       <w:r>
         <w:t>Peak resident memory is 1,102 MB. The pipeline sustains real-time monitoring at 23.7 FPS with MPS acceleration and 19.4 FPS in CPU-only mode, both comfortably above the 5–10 FPS that the event-based detection logic requires, since the behavioural thresholds operate on sustained multi-second windows rather than per-frame decisions. The end-to-end frame budget is bounded by the visual subsystem; the acoustic subsystem runs once per 5-second buffer and therefore contributes only 23.9 ms per logical frame when amortised over its window. We observed non-trivial run-to-run variance in the MPS latency (SD 17 ms, p99 123 ms), attributable to first-call kernel compilation and thermal scheduling on the fanless shared workstation; the median (34.4 ms) is the more representative central value, and a production deployment with a warm kernel cache would see latencies closer to the median than the mean.</w:t>
       </w:r>
@@ -8363,9 +8326,7 @@
       </w:r>
     </w:p>
     <w:p>
-      <w:pPr>
-        <w:pStyle w:val="Normal-noindent"/>
-      </w:pPr>
+      <w:pPr/>
       <w:r>
         <w:t xml:space="preserve">To close this gap we release the acoustic metadata through an epsilon-differentially-private mechanism: each emitted probability in [0, 1] is perturbed by Laplace noise of scale 1/epsilon and clamped, giving epsilon-differential privacy per released value. Sweeping the budget traces the privacy-utility curve in Figure 14(b): at epsilon = 4 per value (epsilon = 12 for the three-value acoustic event) the re-identification AUC falls to </w:t>
       </w:r>
@@ -8380,9 +8341,7 @@
       </w:r>
     </w:p>
     <w:p>
-      <w:pPr>
-        <w:pStyle w:val="Normal-noindent"/>
-      </w:pPr>
+      <w:pPr/>
       <w:r>
         <w:t>This grounds the privacy claim in measurable evidence rather than design assertions. The honest reading is that the undefended metadata is privacy-reducing relative to raw audio (0.816 versus 0.994) but not privacy-preserving on its own, and that a differentially-private emission layer is required to reach near-chance re-identifiability, at a quantified cost in detection power. The verification covers the acoustic channel only; LibriSpeech is audio-only, so the visual and behavioural metadata are not exercised here, and re-identifiability of the geometric descriptors is left to future work (Section 8).</w:t>
       </w:r>
@@ -8602,9 +8561,7 @@
       </w:r>
     </w:p>
     <w:p>
-      <w:pPr>
-        <w:pStyle w:val="Normal-noindent"/>
-      </w:pPr>
+      <w:pPr/>
       <w:r>
         <w:rPr>
           <w:b/>
@@ -8616,9 +8573,7 @@
       </w:r>
     </w:p>
     <w:p>
-      <w:pPr>
-        <w:pStyle w:val="Normal-noindent"/>
-      </w:pPr>
+      <w:pPr/>
       <w:r>
         <w:rPr>
           <w:b/>
@@ -8630,9 +8585,7 @@
       </w:r>
     </w:p>
     <w:p>
-      <w:pPr>
-        <w:pStyle w:val="Normal-noindent"/>
-      </w:pPr>
+      <w:pPr/>
       <w:r>
         <w:rPr>
           <w:b/>
@@ -8763,9 +8716,7 @@
       </w:r>
     </w:p>
     <w:p>
-      <w:pPr>
-        <w:pStyle w:val="Normal-noindent"/>
-      </w:pPr>
+      <w:pPr/>
       <w:r>
         <w:t>In addition, three research directions follow naturally:</w:t>
       </w:r>

</xml_diff>

<commit_message>
Fix wide-table rendering: fixed layout, fitted column widths, fewer columns
Tables were left at python-docx's default auto layout, so Word shrank them to
content and crushed the columns until headers and cells broke mid-word
("Ye s", "Re al-time", "Obfusc ated"). Give every table a fixed layout with
per-column widths that fill the available width: single-character columns get a
small fixed width, the rest are sized by the longer of their header and capped
content length. Also collapse Table 1's five single-letter category columns
(V/A/M/B/P) into one Type column, taking it from 11 columns to 7 so the text
columns have room to render on one or two clean lines.
</commit_message>
<xml_diff>
--- a/manuscript/Article_Informatica.docx
+++ b/manuscript/Article_Informatica.docx
@@ -601,6 +601,7 @@
     <w:tbl>
       <w:tblPr>
         <w:tblW w:type="auto" w:w="0"/>
+        <w:tblLayout w:type="fixed"/>
         <w:tblLook w:firstColumn="1" w:firstRow="1" w:lastColumn="0" w:lastRow="0" w:noHBand="0" w:noVBand="1" w:val="04A0"/>
         <w:tblBorders>
           <w:top w:val="single" w:sz="4" w:color="000000"/>
@@ -612,17 +613,13 @@
         </w:tblBorders>
       </w:tblPr>
       <w:tblGrid>
-        <w:gridCol w:w="866"/>
-        <w:gridCol w:w="866"/>
-        <w:gridCol w:w="866"/>
-        <w:gridCol w:w="866"/>
-        <w:gridCol w:w="866"/>
-        <w:gridCol w:w="866"/>
-        <w:gridCol w:w="866"/>
-        <w:gridCol w:w="866"/>
-        <w:gridCol w:w="866"/>
-        <w:gridCol w:w="866"/>
-        <w:gridCol w:w="866"/>
+        <w:gridCol w:w="2054"/>
+        <w:gridCol w:w="933"/>
+        <w:gridCol w:w="1680"/>
+        <w:gridCol w:w="840"/>
+        <w:gridCol w:w="1307"/>
+        <w:gridCol w:w="1867"/>
+        <w:gridCol w:w="840"/>
       </w:tblGrid>
       <w:tr>
         <w:trPr>
@@ -631,7 +628,7 @@
         </w:trPr>
         <w:tc>
           <w:tcPr>
-            <w:tcW w:type="dxa" w:w="866"/>
+            <w:tcW w:type="dxa" w:w="2054"/>
           </w:tcPr>
           <w:p>
             <w:pPr/>
@@ -646,7 +643,7 @@
         </w:tc>
         <w:tc>
           <w:tcPr>
-            <w:tcW w:type="dxa" w:w="866"/>
+            <w:tcW w:type="dxa" w:w="933"/>
           </w:tcPr>
           <w:p>
             <w:pPr/>
@@ -655,73 +652,13 @@
               <w:rPr>
                 <w:b/>
               </w:rPr>
-              <w:t>V</w:t>
-            </w:r>
-          </w:p>
-        </w:tc>
-        <w:tc>
-          <w:tcPr>
-            <w:tcW w:type="dxa" w:w="866"/>
-          </w:tcPr>
-          <w:p>
-            <w:pPr/>
-            <w:r/>
-            <w:r>
-              <w:rPr>
-                <w:b/>
-              </w:rPr>
-              <w:t>A</w:t>
-            </w:r>
-          </w:p>
-        </w:tc>
-        <w:tc>
-          <w:tcPr>
-            <w:tcW w:type="dxa" w:w="866"/>
-          </w:tcPr>
-          <w:p>
-            <w:pPr/>
-            <w:r/>
-            <w:r>
-              <w:rPr>
-                <w:b/>
-              </w:rPr>
-              <w:t>M</w:t>
-            </w:r>
-          </w:p>
-        </w:tc>
-        <w:tc>
-          <w:tcPr>
-            <w:tcW w:type="dxa" w:w="866"/>
-          </w:tcPr>
-          <w:p>
-            <w:pPr/>
-            <w:r/>
-            <w:r>
-              <w:rPr>
-                <w:b/>
-              </w:rPr>
-              <w:t>B</w:t>
-            </w:r>
-          </w:p>
-        </w:tc>
-        <w:tc>
-          <w:tcPr>
-            <w:tcW w:type="dxa" w:w="866"/>
-          </w:tcPr>
-          <w:p>
-            <w:pPr/>
-            <w:r/>
-            <w:r>
-              <w:rPr>
-                <w:b/>
-              </w:rPr>
-              <w:t>P</w:t>
-            </w:r>
-          </w:p>
-        </w:tc>
-        <w:tc>
-          <w:tcPr>
-            <w:tcW w:type="dxa" w:w="866"/>
+              <w:t>Type</w:t>
+            </w:r>
+          </w:p>
+        </w:tc>
+        <w:tc>
+          <w:tcPr>
+            <w:tcW w:type="dxa" w:w="1680"/>
           </w:tcPr>
           <w:p>
             <w:pPr/>
@@ -736,7 +673,7 @@
         </w:tc>
         <w:tc>
           <w:tcPr>
-            <w:tcW w:type="dxa" w:w="866"/>
+            <w:tcW w:type="dxa" w:w="840"/>
           </w:tcPr>
           <w:p>
             <w:pPr/>
@@ -751,7 +688,7 @@
         </w:tc>
         <w:tc>
           <w:tcPr>
-            <w:tcW w:type="dxa" w:w="866"/>
+            <w:tcW w:type="dxa" w:w="1307"/>
           </w:tcPr>
           <w:p>
             <w:pPr/>
@@ -766,7 +703,7 @@
         </w:tc>
         <w:tc>
           <w:tcPr>
-            <w:tcW w:type="dxa" w:w="866"/>
+            <w:tcW w:type="dxa" w:w="1867"/>
           </w:tcPr>
           <w:p>
             <w:pPr/>
@@ -781,7 +718,7 @@
         </w:tc>
         <w:tc>
           <w:tcPr>
-            <w:tcW w:type="dxa" w:w="866"/>
+            <w:tcW w:type="dxa" w:w="840"/>
           </w:tcPr>
           <w:p>
             <w:pPr/>
@@ -801,7 +738,7 @@
         </w:trPr>
         <w:tc>
           <w:tcPr>
-            <w:tcW w:type="dxa" w:w="866"/>
+            <w:tcW w:type="dxa" w:w="2054"/>
           </w:tcPr>
           <w:p>
             <w:pPr/>
@@ -813,59 +750,19 @@
         </w:tc>
         <w:tc>
           <w:tcPr>
-            <w:tcW w:type="dxa" w:w="866"/>
-          </w:tcPr>
-          <w:p>
-            <w:pPr/>
-            <w:r/>
-            <w:r>
-              <w:t>✓</w:t>
-            </w:r>
-          </w:p>
-        </w:tc>
-        <w:tc>
-          <w:tcPr>
-            <w:tcW w:type="dxa" w:w="866"/>
-          </w:tcPr>
-          <w:p>
-            <w:pPr/>
-            <w:r/>
-            <w:r/>
-          </w:p>
-        </w:tc>
-        <w:tc>
-          <w:tcPr>
-            <w:tcW w:type="dxa" w:w="866"/>
-          </w:tcPr>
-          <w:p>
-            <w:pPr/>
-            <w:r/>
-            <w:r/>
-          </w:p>
-        </w:tc>
-        <w:tc>
-          <w:tcPr>
-            <w:tcW w:type="dxa" w:w="866"/>
-          </w:tcPr>
-          <w:p>
-            <w:pPr/>
-            <w:r/>
-            <w:r/>
-          </w:p>
-        </w:tc>
-        <w:tc>
-          <w:tcPr>
-            <w:tcW w:type="dxa" w:w="866"/>
-          </w:tcPr>
-          <w:p>
-            <w:pPr/>
-            <w:r/>
-            <w:r/>
-          </w:p>
-        </w:tc>
-        <w:tc>
-          <w:tcPr>
-            <w:tcW w:type="dxa" w:w="866"/>
+            <w:tcW w:type="dxa" w:w="933"/>
+          </w:tcPr>
+          <w:p>
+            <w:pPr/>
+            <w:r/>
+            <w:r>
+              <w:t>V</w:t>
+            </w:r>
+          </w:p>
+        </w:tc>
+        <w:tc>
+          <w:tcPr>
+            <w:tcW w:type="dxa" w:w="1680"/>
           </w:tcPr>
           <w:p>
             <w:pPr/>
@@ -877,7 +774,7 @@
         </w:tc>
         <w:tc>
           <w:tcPr>
-            <w:tcW w:type="dxa" w:w="866"/>
+            <w:tcW w:type="dxa" w:w="840"/>
           </w:tcPr>
           <w:p>
             <w:pPr/>
@@ -889,7 +786,7 @@
         </w:tc>
         <w:tc>
           <w:tcPr>
-            <w:tcW w:type="dxa" w:w="866"/>
+            <w:tcW w:type="dxa" w:w="1307"/>
           </w:tcPr>
           <w:p>
             <w:pPr/>
@@ -901,7 +798,7 @@
         </w:tc>
         <w:tc>
           <w:tcPr>
-            <w:tcW w:type="dxa" w:w="866"/>
+            <w:tcW w:type="dxa" w:w="1867"/>
           </w:tcPr>
           <w:p>
             <w:pPr/>
@@ -913,7 +810,7 @@
         </w:tc>
         <w:tc>
           <w:tcPr>
-            <w:tcW w:type="dxa" w:w="866"/>
+            <w:tcW w:type="dxa" w:w="840"/>
           </w:tcPr>
           <w:p>
             <w:pPr/>
@@ -930,7 +827,7 @@
         </w:trPr>
         <w:tc>
           <w:tcPr>
-            <w:tcW w:type="dxa" w:w="866"/>
+            <w:tcW w:type="dxa" w:w="2054"/>
           </w:tcPr>
           <w:p>
             <w:pPr/>
@@ -942,59 +839,19 @@
         </w:tc>
         <w:tc>
           <w:tcPr>
-            <w:tcW w:type="dxa" w:w="866"/>
-          </w:tcPr>
-          <w:p>
-            <w:pPr/>
-            <w:r/>
-            <w:r>
-              <w:t>✓</w:t>
-            </w:r>
-          </w:p>
-        </w:tc>
-        <w:tc>
-          <w:tcPr>
-            <w:tcW w:type="dxa" w:w="866"/>
-          </w:tcPr>
-          <w:p>
-            <w:pPr/>
-            <w:r/>
-            <w:r/>
-          </w:p>
-        </w:tc>
-        <w:tc>
-          <w:tcPr>
-            <w:tcW w:type="dxa" w:w="866"/>
-          </w:tcPr>
-          <w:p>
-            <w:pPr/>
-            <w:r/>
-            <w:r/>
-          </w:p>
-        </w:tc>
-        <w:tc>
-          <w:tcPr>
-            <w:tcW w:type="dxa" w:w="866"/>
-          </w:tcPr>
-          <w:p>
-            <w:pPr/>
-            <w:r/>
-            <w:r/>
-          </w:p>
-        </w:tc>
-        <w:tc>
-          <w:tcPr>
-            <w:tcW w:type="dxa" w:w="866"/>
-          </w:tcPr>
-          <w:p>
-            <w:pPr/>
-            <w:r/>
-            <w:r/>
-          </w:p>
-        </w:tc>
-        <w:tc>
-          <w:tcPr>
-            <w:tcW w:type="dxa" w:w="866"/>
+            <w:tcW w:type="dxa" w:w="933"/>
+          </w:tcPr>
+          <w:p>
+            <w:pPr/>
+            <w:r/>
+            <w:r>
+              <w:t>V</w:t>
+            </w:r>
+          </w:p>
+        </w:tc>
+        <w:tc>
+          <w:tcPr>
+            <w:tcW w:type="dxa" w:w="1680"/>
           </w:tcPr>
           <w:p>
             <w:pPr/>
@@ -1006,7 +863,7 @@
         </w:tc>
         <w:tc>
           <w:tcPr>
-            <w:tcW w:type="dxa" w:w="866"/>
+            <w:tcW w:type="dxa" w:w="840"/>
           </w:tcPr>
           <w:p>
             <w:pPr/>
@@ -1018,7 +875,7 @@
         </w:tc>
         <w:tc>
           <w:tcPr>
-            <w:tcW w:type="dxa" w:w="866"/>
+            <w:tcW w:type="dxa" w:w="1307"/>
           </w:tcPr>
           <w:p>
             <w:pPr/>
@@ -1030,7 +887,7 @@
         </w:tc>
         <w:tc>
           <w:tcPr>
-            <w:tcW w:type="dxa" w:w="866"/>
+            <w:tcW w:type="dxa" w:w="1867"/>
           </w:tcPr>
           <w:p>
             <w:pPr/>
@@ -1042,7 +899,7 @@
         </w:tc>
         <w:tc>
           <w:tcPr>
-            <w:tcW w:type="dxa" w:w="866"/>
+            <w:tcW w:type="dxa" w:w="840"/>
           </w:tcPr>
           <w:p>
             <w:pPr/>
@@ -1059,7 +916,7 @@
         </w:trPr>
         <w:tc>
           <w:tcPr>
-            <w:tcW w:type="dxa" w:w="866"/>
+            <w:tcW w:type="dxa" w:w="2054"/>
           </w:tcPr>
           <w:p>
             <w:pPr/>
@@ -1071,59 +928,19 @@
         </w:tc>
         <w:tc>
           <w:tcPr>
-            <w:tcW w:type="dxa" w:w="866"/>
-          </w:tcPr>
-          <w:p>
-            <w:pPr/>
-            <w:r/>
-            <w:r>
-              <w:t>✓</w:t>
-            </w:r>
-          </w:p>
-        </w:tc>
-        <w:tc>
-          <w:tcPr>
-            <w:tcW w:type="dxa" w:w="866"/>
-          </w:tcPr>
-          <w:p>
-            <w:pPr/>
-            <w:r/>
-            <w:r/>
-          </w:p>
-        </w:tc>
-        <w:tc>
-          <w:tcPr>
-            <w:tcW w:type="dxa" w:w="866"/>
-          </w:tcPr>
-          <w:p>
-            <w:pPr/>
-            <w:r/>
-            <w:r/>
-          </w:p>
-        </w:tc>
-        <w:tc>
-          <w:tcPr>
-            <w:tcW w:type="dxa" w:w="866"/>
-          </w:tcPr>
-          <w:p>
-            <w:pPr/>
-            <w:r/>
-            <w:r/>
-          </w:p>
-        </w:tc>
-        <w:tc>
-          <w:tcPr>
-            <w:tcW w:type="dxa" w:w="866"/>
-          </w:tcPr>
-          <w:p>
-            <w:pPr/>
-            <w:r/>
-            <w:r/>
-          </w:p>
-        </w:tc>
-        <w:tc>
-          <w:tcPr>
-            <w:tcW w:type="dxa" w:w="866"/>
+            <w:tcW w:type="dxa" w:w="933"/>
+          </w:tcPr>
+          <w:p>
+            <w:pPr/>
+            <w:r/>
+            <w:r>
+              <w:t>V</w:t>
+            </w:r>
+          </w:p>
+        </w:tc>
+        <w:tc>
+          <w:tcPr>
+            <w:tcW w:type="dxa" w:w="1680"/>
           </w:tcPr>
           <w:p>
             <w:pPr/>
@@ -1135,7 +952,7 @@
         </w:tc>
         <w:tc>
           <w:tcPr>
-            <w:tcW w:type="dxa" w:w="866"/>
+            <w:tcW w:type="dxa" w:w="840"/>
           </w:tcPr>
           <w:p>
             <w:pPr/>
@@ -1147,7 +964,7 @@
         </w:tc>
         <w:tc>
           <w:tcPr>
-            <w:tcW w:type="dxa" w:w="866"/>
+            <w:tcW w:type="dxa" w:w="1307"/>
           </w:tcPr>
           <w:p>
             <w:pPr/>
@@ -1159,7 +976,7 @@
         </w:tc>
         <w:tc>
           <w:tcPr>
-            <w:tcW w:type="dxa" w:w="866"/>
+            <w:tcW w:type="dxa" w:w="1867"/>
           </w:tcPr>
           <w:p>
             <w:pPr/>
@@ -1171,7 +988,7 @@
         </w:tc>
         <w:tc>
           <w:tcPr>
-            <w:tcW w:type="dxa" w:w="866"/>
+            <w:tcW w:type="dxa" w:w="840"/>
           </w:tcPr>
           <w:p>
             <w:pPr/>
@@ -1188,7 +1005,7 @@
         </w:trPr>
         <w:tc>
           <w:tcPr>
-            <w:tcW w:type="dxa" w:w="866"/>
+            <w:tcW w:type="dxa" w:w="2054"/>
           </w:tcPr>
           <w:p>
             <w:pPr/>
@@ -1200,59 +1017,19 @@
         </w:tc>
         <w:tc>
           <w:tcPr>
-            <w:tcW w:type="dxa" w:w="866"/>
-          </w:tcPr>
-          <w:p>
-            <w:pPr/>
-            <w:r/>
-            <w:r/>
-          </w:p>
-        </w:tc>
-        <w:tc>
-          <w:tcPr>
-            <w:tcW w:type="dxa" w:w="866"/>
-          </w:tcPr>
-          <w:p>
-            <w:pPr/>
-            <w:r/>
-            <w:r>
-              <w:t>✓</w:t>
-            </w:r>
-          </w:p>
-        </w:tc>
-        <w:tc>
-          <w:tcPr>
-            <w:tcW w:type="dxa" w:w="866"/>
-          </w:tcPr>
-          <w:p>
-            <w:pPr/>
-            <w:r/>
-            <w:r/>
-          </w:p>
-        </w:tc>
-        <w:tc>
-          <w:tcPr>
-            <w:tcW w:type="dxa" w:w="866"/>
-          </w:tcPr>
-          <w:p>
-            <w:pPr/>
-            <w:r/>
-            <w:r/>
-          </w:p>
-        </w:tc>
-        <w:tc>
-          <w:tcPr>
-            <w:tcW w:type="dxa" w:w="866"/>
-          </w:tcPr>
-          <w:p>
-            <w:pPr/>
-            <w:r/>
-            <w:r/>
-          </w:p>
-        </w:tc>
-        <w:tc>
-          <w:tcPr>
-            <w:tcW w:type="dxa" w:w="866"/>
+            <w:tcW w:type="dxa" w:w="933"/>
+          </w:tcPr>
+          <w:p>
+            <w:pPr/>
+            <w:r/>
+            <w:r>
+              <w:t>A</w:t>
+            </w:r>
+          </w:p>
+        </w:tc>
+        <w:tc>
+          <w:tcPr>
+            <w:tcW w:type="dxa" w:w="1680"/>
           </w:tcPr>
           <w:p>
             <w:pPr/>
@@ -1264,7 +1041,7 @@
         </w:tc>
         <w:tc>
           <w:tcPr>
-            <w:tcW w:type="dxa" w:w="866"/>
+            <w:tcW w:type="dxa" w:w="840"/>
           </w:tcPr>
           <w:p>
             <w:pPr/>
@@ -1276,7 +1053,7 @@
         </w:tc>
         <w:tc>
           <w:tcPr>
-            <w:tcW w:type="dxa" w:w="866"/>
+            <w:tcW w:type="dxa" w:w="1307"/>
           </w:tcPr>
           <w:p>
             <w:pPr/>
@@ -1288,7 +1065,7 @@
         </w:tc>
         <w:tc>
           <w:tcPr>
-            <w:tcW w:type="dxa" w:w="866"/>
+            <w:tcW w:type="dxa" w:w="1867"/>
           </w:tcPr>
           <w:p>
             <w:pPr/>
@@ -1300,7 +1077,7 @@
         </w:tc>
         <w:tc>
           <w:tcPr>
-            <w:tcW w:type="dxa" w:w="866"/>
+            <w:tcW w:type="dxa" w:w="840"/>
           </w:tcPr>
           <w:p>
             <w:pPr/>
@@ -1317,7 +1094,7 @@
         </w:trPr>
         <w:tc>
           <w:tcPr>
-            <w:tcW w:type="dxa" w:w="866"/>
+            <w:tcW w:type="dxa" w:w="2054"/>
           </w:tcPr>
           <w:p>
             <w:pPr/>
@@ -1329,63 +1106,19 @@
         </w:tc>
         <w:tc>
           <w:tcPr>
-            <w:tcW w:type="dxa" w:w="866"/>
-          </w:tcPr>
-          <w:p>
-            <w:pPr/>
-            <w:r/>
-            <w:r>
-              <w:t>✓</w:t>
-            </w:r>
-          </w:p>
-        </w:tc>
-        <w:tc>
-          <w:tcPr>
-            <w:tcW w:type="dxa" w:w="866"/>
-          </w:tcPr>
-          <w:p>
-            <w:pPr/>
-            <w:r/>
-            <w:r>
-              <w:t>✓</w:t>
-            </w:r>
-          </w:p>
-        </w:tc>
-        <w:tc>
-          <w:tcPr>
-            <w:tcW w:type="dxa" w:w="866"/>
-          </w:tcPr>
-          <w:p>
-            <w:pPr/>
-            <w:r/>
-            <w:r>
-              <w:t>✓</w:t>
-            </w:r>
-          </w:p>
-        </w:tc>
-        <w:tc>
-          <w:tcPr>
-            <w:tcW w:type="dxa" w:w="866"/>
-          </w:tcPr>
-          <w:p>
-            <w:pPr/>
-            <w:r/>
-            <w:r/>
-          </w:p>
-        </w:tc>
-        <w:tc>
-          <w:tcPr>
-            <w:tcW w:type="dxa" w:w="866"/>
-          </w:tcPr>
-          <w:p>
-            <w:pPr/>
-            <w:r/>
-            <w:r/>
-          </w:p>
-        </w:tc>
-        <w:tc>
-          <w:tcPr>
-            <w:tcW w:type="dxa" w:w="866"/>
+            <w:tcW w:type="dxa" w:w="933"/>
+          </w:tcPr>
+          <w:p>
+            <w:pPr/>
+            <w:r/>
+            <w:r>
+              <w:t>V, A, M</w:t>
+            </w:r>
+          </w:p>
+        </w:tc>
+        <w:tc>
+          <w:tcPr>
+            <w:tcW w:type="dxa" w:w="1680"/>
           </w:tcPr>
           <w:p>
             <w:pPr/>
@@ -1397,7 +1130,7 @@
         </w:tc>
         <w:tc>
           <w:tcPr>
-            <w:tcW w:type="dxa" w:w="866"/>
+            <w:tcW w:type="dxa" w:w="840"/>
           </w:tcPr>
           <w:p>
             <w:pPr/>
@@ -1409,7 +1142,7 @@
         </w:tc>
         <w:tc>
           <w:tcPr>
-            <w:tcW w:type="dxa" w:w="866"/>
+            <w:tcW w:type="dxa" w:w="1307"/>
           </w:tcPr>
           <w:p>
             <w:pPr/>
@@ -1421,7 +1154,7 @@
         </w:tc>
         <w:tc>
           <w:tcPr>
-            <w:tcW w:type="dxa" w:w="866"/>
+            <w:tcW w:type="dxa" w:w="1867"/>
           </w:tcPr>
           <w:p>
             <w:pPr/>
@@ -1433,7 +1166,7 @@
         </w:tc>
         <w:tc>
           <w:tcPr>
-            <w:tcW w:type="dxa" w:w="866"/>
+            <w:tcW w:type="dxa" w:w="840"/>
           </w:tcPr>
           <w:p>
             <w:pPr/>
@@ -1450,7 +1183,7 @@
         </w:trPr>
         <w:tc>
           <w:tcPr>
-            <w:tcW w:type="dxa" w:w="866"/>
+            <w:tcW w:type="dxa" w:w="2054"/>
           </w:tcPr>
           <w:p>
             <w:pPr/>
@@ -1462,59 +1195,19 @@
         </w:tc>
         <w:tc>
           <w:tcPr>
-            <w:tcW w:type="dxa" w:w="866"/>
-          </w:tcPr>
-          <w:p>
-            <w:pPr/>
-            <w:r/>
-            <w:r/>
-          </w:p>
-        </w:tc>
-        <w:tc>
-          <w:tcPr>
-            <w:tcW w:type="dxa" w:w="866"/>
-          </w:tcPr>
-          <w:p>
-            <w:pPr/>
-            <w:r/>
-            <w:r/>
-          </w:p>
-        </w:tc>
-        <w:tc>
-          <w:tcPr>
-            <w:tcW w:type="dxa" w:w="866"/>
-          </w:tcPr>
-          <w:p>
-            <w:pPr/>
-            <w:r/>
-            <w:r/>
-          </w:p>
-        </w:tc>
-        <w:tc>
-          <w:tcPr>
-            <w:tcW w:type="dxa" w:w="866"/>
-          </w:tcPr>
-          <w:p>
-            <w:pPr/>
-            <w:r/>
-            <w:r/>
-          </w:p>
-        </w:tc>
-        <w:tc>
-          <w:tcPr>
-            <w:tcW w:type="dxa" w:w="866"/>
-          </w:tcPr>
-          <w:p>
-            <w:pPr/>
-            <w:r/>
-            <w:r>
-              <w:t>✓</w:t>
-            </w:r>
-          </w:p>
-        </w:tc>
-        <w:tc>
-          <w:tcPr>
-            <w:tcW w:type="dxa" w:w="866"/>
+            <w:tcW w:type="dxa" w:w="933"/>
+          </w:tcPr>
+          <w:p>
+            <w:pPr/>
+            <w:r/>
+            <w:r>
+              <w:t>P</w:t>
+            </w:r>
+          </w:p>
+        </w:tc>
+        <w:tc>
+          <w:tcPr>
+            <w:tcW w:type="dxa" w:w="1680"/>
           </w:tcPr>
           <w:p>
             <w:pPr/>
@@ -1526,7 +1219,7 @@
         </w:tc>
         <w:tc>
           <w:tcPr>
-            <w:tcW w:type="dxa" w:w="866"/>
+            <w:tcW w:type="dxa" w:w="840"/>
           </w:tcPr>
           <w:p>
             <w:pPr/>
@@ -1538,7 +1231,7 @@
         </w:tc>
         <w:tc>
           <w:tcPr>
-            <w:tcW w:type="dxa" w:w="866"/>
+            <w:tcW w:type="dxa" w:w="1307"/>
           </w:tcPr>
           <w:p>
             <w:pPr/>
@@ -1550,7 +1243,7 @@
         </w:tc>
         <w:tc>
           <w:tcPr>
-            <w:tcW w:type="dxa" w:w="866"/>
+            <w:tcW w:type="dxa" w:w="1867"/>
           </w:tcPr>
           <w:p>
             <w:pPr/>
@@ -1562,7 +1255,7 @@
         </w:tc>
         <w:tc>
           <w:tcPr>
-            <w:tcW w:type="dxa" w:w="866"/>
+            <w:tcW w:type="dxa" w:w="840"/>
           </w:tcPr>
           <w:p>
             <w:pPr/>
@@ -1579,7 +1272,7 @@
         </w:trPr>
         <w:tc>
           <w:tcPr>
-            <w:tcW w:type="dxa" w:w="866"/>
+            <w:tcW w:type="dxa" w:w="2054"/>
           </w:tcPr>
           <w:p>
             <w:pPr/>
@@ -1591,59 +1284,19 @@
         </w:tc>
         <w:tc>
           <w:tcPr>
-            <w:tcW w:type="dxa" w:w="866"/>
-          </w:tcPr>
-          <w:p>
-            <w:pPr/>
-            <w:r/>
-            <w:r/>
-          </w:p>
-        </w:tc>
-        <w:tc>
-          <w:tcPr>
-            <w:tcW w:type="dxa" w:w="866"/>
-          </w:tcPr>
-          <w:p>
-            <w:pPr/>
-            <w:r/>
-            <w:r/>
-          </w:p>
-        </w:tc>
-        <w:tc>
-          <w:tcPr>
-            <w:tcW w:type="dxa" w:w="866"/>
-          </w:tcPr>
-          <w:p>
-            <w:pPr/>
-            <w:r/>
-            <w:r/>
-          </w:p>
-        </w:tc>
-        <w:tc>
-          <w:tcPr>
-            <w:tcW w:type="dxa" w:w="866"/>
-          </w:tcPr>
-          <w:p>
-            <w:pPr/>
-            <w:r/>
-            <w:r/>
-          </w:p>
-        </w:tc>
-        <w:tc>
-          <w:tcPr>
-            <w:tcW w:type="dxa" w:w="866"/>
-          </w:tcPr>
-          <w:p>
-            <w:pPr/>
-            <w:r/>
-            <w:r>
-              <w:t>✓</w:t>
-            </w:r>
-          </w:p>
-        </w:tc>
-        <w:tc>
-          <w:tcPr>
-            <w:tcW w:type="dxa" w:w="866"/>
+            <w:tcW w:type="dxa" w:w="933"/>
+          </w:tcPr>
+          <w:p>
+            <w:pPr/>
+            <w:r/>
+            <w:r>
+              <w:t>P</w:t>
+            </w:r>
+          </w:p>
+        </w:tc>
+        <w:tc>
+          <w:tcPr>
+            <w:tcW w:type="dxa" w:w="1680"/>
           </w:tcPr>
           <w:p>
             <w:pPr/>
@@ -1655,7 +1308,7 @@
         </w:tc>
         <w:tc>
           <w:tcPr>
-            <w:tcW w:type="dxa" w:w="866"/>
+            <w:tcW w:type="dxa" w:w="840"/>
           </w:tcPr>
           <w:p>
             <w:pPr/>
@@ -1667,7 +1320,7 @@
         </w:tc>
         <w:tc>
           <w:tcPr>
-            <w:tcW w:type="dxa" w:w="866"/>
+            <w:tcW w:type="dxa" w:w="1307"/>
           </w:tcPr>
           <w:p>
             <w:pPr/>
@@ -1679,7 +1332,7 @@
         </w:tc>
         <w:tc>
           <w:tcPr>
-            <w:tcW w:type="dxa" w:w="866"/>
+            <w:tcW w:type="dxa" w:w="1867"/>
           </w:tcPr>
           <w:p>
             <w:pPr/>
@@ -1691,7 +1344,7 @@
         </w:tc>
         <w:tc>
           <w:tcPr>
-            <w:tcW w:type="dxa" w:w="866"/>
+            <w:tcW w:type="dxa" w:w="840"/>
           </w:tcPr>
           <w:p>
             <w:pPr/>
@@ -1708,7 +1361,7 @@
         </w:trPr>
         <w:tc>
           <w:tcPr>
-            <w:tcW w:type="dxa" w:w="866"/>
+            <w:tcW w:type="dxa" w:w="2054"/>
           </w:tcPr>
           <w:p>
             <w:pPr/>
@@ -1720,59 +1373,19 @@
         </w:tc>
         <w:tc>
           <w:tcPr>
-            <w:tcW w:type="dxa" w:w="866"/>
-          </w:tcPr>
-          <w:p>
-            <w:pPr/>
-            <w:r/>
-            <w:r/>
-          </w:p>
-        </w:tc>
-        <w:tc>
-          <w:tcPr>
-            <w:tcW w:type="dxa" w:w="866"/>
-          </w:tcPr>
-          <w:p>
-            <w:pPr/>
-            <w:r/>
-            <w:r/>
-          </w:p>
-        </w:tc>
-        <w:tc>
-          <w:tcPr>
-            <w:tcW w:type="dxa" w:w="866"/>
-          </w:tcPr>
-          <w:p>
-            <w:pPr/>
-            <w:r/>
-            <w:r/>
-          </w:p>
-        </w:tc>
-        <w:tc>
-          <w:tcPr>
-            <w:tcW w:type="dxa" w:w="866"/>
-          </w:tcPr>
-          <w:p>
-            <w:pPr/>
-            <w:r/>
-            <w:r/>
-          </w:p>
-        </w:tc>
-        <w:tc>
-          <w:tcPr>
-            <w:tcW w:type="dxa" w:w="866"/>
-          </w:tcPr>
-          <w:p>
-            <w:pPr/>
-            <w:r/>
-            <w:r>
-              <w:t>✓</w:t>
-            </w:r>
-          </w:p>
-        </w:tc>
-        <w:tc>
-          <w:tcPr>
-            <w:tcW w:type="dxa" w:w="866"/>
+            <w:tcW w:type="dxa" w:w="933"/>
+          </w:tcPr>
+          <w:p>
+            <w:pPr/>
+            <w:r/>
+            <w:r>
+              <w:t>P</w:t>
+            </w:r>
+          </w:p>
+        </w:tc>
+        <w:tc>
+          <w:tcPr>
+            <w:tcW w:type="dxa" w:w="1680"/>
           </w:tcPr>
           <w:p>
             <w:pPr/>
@@ -1784,7 +1397,7 @@
         </w:tc>
         <w:tc>
           <w:tcPr>
-            <w:tcW w:type="dxa" w:w="866"/>
+            <w:tcW w:type="dxa" w:w="840"/>
           </w:tcPr>
           <w:p>
             <w:pPr/>
@@ -1796,7 +1409,7 @@
         </w:tc>
         <w:tc>
           <w:tcPr>
-            <w:tcW w:type="dxa" w:w="866"/>
+            <w:tcW w:type="dxa" w:w="1307"/>
           </w:tcPr>
           <w:p>
             <w:pPr/>
@@ -1808,7 +1421,7 @@
         </w:tc>
         <w:tc>
           <w:tcPr>
-            <w:tcW w:type="dxa" w:w="866"/>
+            <w:tcW w:type="dxa" w:w="1867"/>
           </w:tcPr>
           <w:p>
             <w:pPr/>
@@ -1820,7 +1433,7 @@
         </w:tc>
         <w:tc>
           <w:tcPr>
-            <w:tcW w:type="dxa" w:w="866"/>
+            <w:tcW w:type="dxa" w:w="840"/>
           </w:tcPr>
           <w:p>
             <w:pPr/>
@@ -1837,7 +1450,7 @@
         </w:trPr>
         <w:tc>
           <w:tcPr>
-            <w:tcW w:type="dxa" w:w="866"/>
+            <w:tcW w:type="dxa" w:w="2054"/>
           </w:tcPr>
           <w:p>
             <w:pPr/>
@@ -1849,59 +1462,19 @@
         </w:tc>
         <w:tc>
           <w:tcPr>
-            <w:tcW w:type="dxa" w:w="866"/>
-          </w:tcPr>
-          <w:p>
-            <w:pPr/>
-            <w:r/>
-            <w:r/>
-          </w:p>
-        </w:tc>
-        <w:tc>
-          <w:tcPr>
-            <w:tcW w:type="dxa" w:w="866"/>
-          </w:tcPr>
-          <w:p>
-            <w:pPr/>
-            <w:r/>
-            <w:r/>
-          </w:p>
-        </w:tc>
-        <w:tc>
-          <w:tcPr>
-            <w:tcW w:type="dxa" w:w="866"/>
-          </w:tcPr>
-          <w:p>
-            <w:pPr/>
-            <w:r/>
-            <w:r/>
-          </w:p>
-        </w:tc>
-        <w:tc>
-          <w:tcPr>
-            <w:tcW w:type="dxa" w:w="866"/>
-          </w:tcPr>
-          <w:p>
-            <w:pPr/>
-            <w:r/>
-            <w:r/>
-          </w:p>
-        </w:tc>
-        <w:tc>
-          <w:tcPr>
-            <w:tcW w:type="dxa" w:w="866"/>
-          </w:tcPr>
-          <w:p>
-            <w:pPr/>
-            <w:r/>
-            <w:r>
-              <w:t>✓</w:t>
-            </w:r>
-          </w:p>
-        </w:tc>
-        <w:tc>
-          <w:tcPr>
-            <w:tcW w:type="dxa" w:w="866"/>
+            <w:tcW w:type="dxa" w:w="933"/>
+          </w:tcPr>
+          <w:p>
+            <w:pPr/>
+            <w:r/>
+            <w:r>
+              <w:t>P</w:t>
+            </w:r>
+          </w:p>
+        </w:tc>
+        <w:tc>
+          <w:tcPr>
+            <w:tcW w:type="dxa" w:w="1680"/>
           </w:tcPr>
           <w:p>
             <w:pPr/>
@@ -1913,7 +1486,7 @@
         </w:tc>
         <w:tc>
           <w:tcPr>
-            <w:tcW w:type="dxa" w:w="866"/>
+            <w:tcW w:type="dxa" w:w="840"/>
           </w:tcPr>
           <w:p>
             <w:pPr/>
@@ -1925,7 +1498,7 @@
         </w:tc>
         <w:tc>
           <w:tcPr>
-            <w:tcW w:type="dxa" w:w="866"/>
+            <w:tcW w:type="dxa" w:w="1307"/>
           </w:tcPr>
           <w:p>
             <w:pPr/>
@@ -1937,7 +1510,7 @@
         </w:tc>
         <w:tc>
           <w:tcPr>
-            <w:tcW w:type="dxa" w:w="866"/>
+            <w:tcW w:type="dxa" w:w="1867"/>
           </w:tcPr>
           <w:p>
             <w:pPr/>
@@ -1949,7 +1522,7 @@
         </w:tc>
         <w:tc>
           <w:tcPr>
-            <w:tcW w:type="dxa" w:w="866"/>
+            <w:tcW w:type="dxa" w:w="840"/>
           </w:tcPr>
           <w:p>
             <w:pPr/>
@@ -1966,7 +1539,7 @@
         </w:trPr>
         <w:tc>
           <w:tcPr>
-            <w:tcW w:type="dxa" w:w="866"/>
+            <w:tcW w:type="dxa" w:w="2054"/>
           </w:tcPr>
           <w:p>
             <w:pPr/>
@@ -1981,65 +1554,19 @@
         </w:tc>
         <w:tc>
           <w:tcPr>
-            <w:tcW w:type="dxa" w:w="866"/>
-          </w:tcPr>
-          <w:p>
-            <w:pPr/>
-            <w:r/>
-            <w:r>
-              <w:t>✓</w:t>
-            </w:r>
-          </w:p>
-        </w:tc>
-        <w:tc>
-          <w:tcPr>
-            <w:tcW w:type="dxa" w:w="866"/>
-          </w:tcPr>
-          <w:p>
-            <w:pPr/>
-            <w:r/>
-            <w:r>
-              <w:t>✓</w:t>
-            </w:r>
-          </w:p>
-        </w:tc>
-        <w:tc>
-          <w:tcPr>
-            <w:tcW w:type="dxa" w:w="866"/>
-          </w:tcPr>
-          <w:p>
-            <w:pPr/>
-            <w:r/>
-            <w:r>
-              <w:t>✓</w:t>
-            </w:r>
-          </w:p>
-        </w:tc>
-        <w:tc>
-          <w:tcPr>
-            <w:tcW w:type="dxa" w:w="866"/>
-          </w:tcPr>
-          <w:p>
-            <w:pPr/>
-            <w:r/>
-            <w:r/>
-          </w:p>
-        </w:tc>
-        <w:tc>
-          <w:tcPr>
-            <w:tcW w:type="dxa" w:w="866"/>
-          </w:tcPr>
-          <w:p>
-            <w:pPr/>
-            <w:r/>
-            <w:r>
-              <w:t>✓</w:t>
-            </w:r>
-          </w:p>
-        </w:tc>
-        <w:tc>
-          <w:tcPr>
-            <w:tcW w:type="dxa" w:w="866"/>
+            <w:tcW w:type="dxa" w:w="933"/>
+          </w:tcPr>
+          <w:p>
+            <w:pPr/>
+            <w:r/>
+            <w:r>
+              <w:t>V, A, M, P</w:t>
+            </w:r>
+          </w:p>
+        </w:tc>
+        <w:tc>
+          <w:tcPr>
+            <w:tcW w:type="dxa" w:w="1680"/>
           </w:tcPr>
           <w:p>
             <w:pPr/>
@@ -2054,7 +1581,7 @@
         </w:tc>
         <w:tc>
           <w:tcPr>
-            <w:tcW w:type="dxa" w:w="866"/>
+            <w:tcW w:type="dxa" w:w="840"/>
           </w:tcPr>
           <w:p>
             <w:pPr/>
@@ -2069,7 +1596,7 @@
         </w:tc>
         <w:tc>
           <w:tcPr>
-            <w:tcW w:type="dxa" w:w="866"/>
+            <w:tcW w:type="dxa" w:w="1307"/>
           </w:tcPr>
           <w:p>
             <w:pPr/>
@@ -2084,7 +1611,7 @@
         </w:tc>
         <w:tc>
           <w:tcPr>
-            <w:tcW w:type="dxa" w:w="866"/>
+            <w:tcW w:type="dxa" w:w="1867"/>
           </w:tcPr>
           <w:p>
             <w:pPr/>
@@ -2099,7 +1626,7 @@
         </w:tc>
         <w:tc>
           <w:tcPr>
-            <w:tcW w:type="dxa" w:w="866"/>
+            <w:tcW w:type="dxa" w:w="840"/>
           </w:tcPr>
           <w:p>
             <w:pPr/>
@@ -3775,6 +3302,7 @@
     <w:tbl>
       <w:tblPr>
         <w:tblW w:type="auto" w:w="0"/>
+        <w:tblLayout w:type="fixed"/>
         <w:tblLook w:firstColumn="1" w:firstRow="1" w:lastColumn="0" w:lastRow="0" w:noHBand="0" w:noVBand="1" w:val="04A0"/>
         <w:tblBorders>
           <w:top w:val="single" w:sz="4" w:color="000000"/>
@@ -3786,13 +3314,13 @@
         </w:tblBorders>
       </w:tblPr>
       <w:tblGrid>
-        <w:gridCol w:w="1361"/>
-        <w:gridCol w:w="1361"/>
-        <w:gridCol w:w="1361"/>
-        <w:gridCol w:w="1361"/>
-        <w:gridCol w:w="1361"/>
-        <w:gridCol w:w="1361"/>
-        <w:gridCol w:w="1361"/>
+        <w:gridCol w:w="1614"/>
+        <w:gridCol w:w="1937"/>
+        <w:gridCol w:w="1775"/>
+        <w:gridCol w:w="1452"/>
+        <w:gridCol w:w="968"/>
+        <w:gridCol w:w="807"/>
+        <w:gridCol w:w="968"/>
       </w:tblGrid>
       <w:tr>
         <w:trPr>
@@ -3801,7 +3329,7 @@
         </w:trPr>
         <w:tc>
           <w:tcPr>
-            <w:tcW w:type="dxa" w:w="1361"/>
+            <w:tcW w:type="dxa" w:w="1614"/>
           </w:tcPr>
           <w:p>
             <w:pPr/>
@@ -3816,7 +3344,7 @@
         </w:tc>
         <w:tc>
           <w:tcPr>
-            <w:tcW w:type="dxa" w:w="1361"/>
+            <w:tcW w:type="dxa" w:w="1937"/>
           </w:tcPr>
           <w:p>
             <w:pPr/>
@@ -3831,7 +3359,7 @@
         </w:tc>
         <w:tc>
           <w:tcPr>
-            <w:tcW w:type="dxa" w:w="1361"/>
+            <w:tcW w:type="dxa" w:w="1775"/>
           </w:tcPr>
           <w:p>
             <w:pPr/>
@@ -3846,7 +3374,7 @@
         </w:tc>
         <w:tc>
           <w:tcPr>
-            <w:tcW w:type="dxa" w:w="1361"/>
+            <w:tcW w:type="dxa" w:w="1452"/>
           </w:tcPr>
           <w:p>
             <w:pPr/>
@@ -3861,7 +3389,7 @@
         </w:tc>
         <w:tc>
           <w:tcPr>
-            <w:tcW w:type="dxa" w:w="1361"/>
+            <w:tcW w:type="dxa" w:w="968"/>
           </w:tcPr>
           <w:p>
             <w:pPr/>
@@ -3876,7 +3404,7 @@
         </w:tc>
         <w:tc>
           <w:tcPr>
-            <w:tcW w:type="dxa" w:w="1361"/>
+            <w:tcW w:type="dxa" w:w="807"/>
           </w:tcPr>
           <w:p>
             <w:pPr/>
@@ -3891,7 +3419,7 @@
         </w:tc>
         <w:tc>
           <w:tcPr>
-            <w:tcW w:type="dxa" w:w="1361"/>
+            <w:tcW w:type="dxa" w:w="968"/>
           </w:tcPr>
           <w:p>
             <w:pPr/>
@@ -3911,7 +3439,7 @@
         </w:trPr>
         <w:tc>
           <w:tcPr>
-            <w:tcW w:type="dxa" w:w="1361"/>
+            <w:tcW w:type="dxa" w:w="1614"/>
           </w:tcPr>
           <w:p>
             <w:pPr/>
@@ -3923,7 +3451,7 @@
         </w:tc>
         <w:tc>
           <w:tcPr>
-            <w:tcW w:type="dxa" w:w="1361"/>
+            <w:tcW w:type="dxa" w:w="1937"/>
           </w:tcPr>
           <w:p>
             <w:pPr/>
@@ -3935,7 +3463,7 @@
         </w:tc>
         <w:tc>
           <w:tcPr>
-            <w:tcW w:type="dxa" w:w="1361"/>
+            <w:tcW w:type="dxa" w:w="1775"/>
           </w:tcPr>
           <w:p>
             <w:pPr/>
@@ -3947,7 +3475,7 @@
         </w:tc>
         <w:tc>
           <w:tcPr>
-            <w:tcW w:type="dxa" w:w="1361"/>
+            <w:tcW w:type="dxa" w:w="1452"/>
           </w:tcPr>
           <w:p>
             <w:pPr/>
@@ -3959,7 +3487,7 @@
         </w:tc>
         <w:tc>
           <w:tcPr>
-            <w:tcW w:type="dxa" w:w="1361"/>
+            <w:tcW w:type="dxa" w:w="968"/>
           </w:tcPr>
           <w:p>
             <w:pPr/>
@@ -3971,7 +3499,7 @@
         </w:tc>
         <w:tc>
           <w:tcPr>
-            <w:tcW w:type="dxa" w:w="1361"/>
+            <w:tcW w:type="dxa" w:w="807"/>
           </w:tcPr>
           <w:p>
             <w:pPr/>
@@ -3983,7 +3511,7 @@
         </w:tc>
         <w:tc>
           <w:tcPr>
-            <w:tcW w:type="dxa" w:w="1361"/>
+            <w:tcW w:type="dxa" w:w="968"/>
           </w:tcPr>
           <w:p>
             <w:pPr/>
@@ -4000,7 +3528,7 @@
         </w:trPr>
         <w:tc>
           <w:tcPr>
-            <w:tcW w:type="dxa" w:w="1361"/>
+            <w:tcW w:type="dxa" w:w="1614"/>
           </w:tcPr>
           <w:p>
             <w:pPr/>
@@ -4012,7 +3540,7 @@
         </w:tc>
         <w:tc>
           <w:tcPr>
-            <w:tcW w:type="dxa" w:w="1361"/>
+            <w:tcW w:type="dxa" w:w="1937"/>
           </w:tcPr>
           <w:p>
             <w:pPr/>
@@ -4024,7 +3552,7 @@
         </w:tc>
         <w:tc>
           <w:tcPr>
-            <w:tcW w:type="dxa" w:w="1361"/>
+            <w:tcW w:type="dxa" w:w="1775"/>
           </w:tcPr>
           <w:p>
             <w:pPr/>
@@ -4036,7 +3564,7 @@
         </w:tc>
         <w:tc>
           <w:tcPr>
-            <w:tcW w:type="dxa" w:w="1361"/>
+            <w:tcW w:type="dxa" w:w="1452"/>
           </w:tcPr>
           <w:p>
             <w:pPr/>
@@ -4048,7 +3576,7 @@
         </w:tc>
         <w:tc>
           <w:tcPr>
-            <w:tcW w:type="dxa" w:w="1361"/>
+            <w:tcW w:type="dxa" w:w="968"/>
           </w:tcPr>
           <w:p>
             <w:pPr/>
@@ -4060,7 +3588,7 @@
         </w:tc>
         <w:tc>
           <w:tcPr>
-            <w:tcW w:type="dxa" w:w="1361"/>
+            <w:tcW w:type="dxa" w:w="807"/>
           </w:tcPr>
           <w:p>
             <w:pPr/>
@@ -4072,7 +3600,7 @@
         </w:tc>
         <w:tc>
           <w:tcPr>
-            <w:tcW w:type="dxa" w:w="1361"/>
+            <w:tcW w:type="dxa" w:w="968"/>
           </w:tcPr>
           <w:p>
             <w:pPr/>
@@ -4089,7 +3617,7 @@
         </w:trPr>
         <w:tc>
           <w:tcPr>
-            <w:tcW w:type="dxa" w:w="1361"/>
+            <w:tcW w:type="dxa" w:w="1614"/>
           </w:tcPr>
           <w:p>
             <w:pPr/>
@@ -4101,7 +3629,7 @@
         </w:tc>
         <w:tc>
           <w:tcPr>
-            <w:tcW w:type="dxa" w:w="1361"/>
+            <w:tcW w:type="dxa" w:w="1937"/>
           </w:tcPr>
           <w:p>
             <w:pPr/>
@@ -4113,7 +3641,7 @@
         </w:tc>
         <w:tc>
           <w:tcPr>
-            <w:tcW w:type="dxa" w:w="1361"/>
+            <w:tcW w:type="dxa" w:w="1775"/>
           </w:tcPr>
           <w:p>
             <w:pPr/>
@@ -4125,7 +3653,7 @@
         </w:tc>
         <w:tc>
           <w:tcPr>
-            <w:tcW w:type="dxa" w:w="1361"/>
+            <w:tcW w:type="dxa" w:w="1452"/>
           </w:tcPr>
           <w:p>
             <w:pPr/>
@@ -4137,7 +3665,7 @@
         </w:tc>
         <w:tc>
           <w:tcPr>
-            <w:tcW w:type="dxa" w:w="1361"/>
+            <w:tcW w:type="dxa" w:w="968"/>
           </w:tcPr>
           <w:p>
             <w:pPr/>
@@ -4149,7 +3677,7 @@
         </w:tc>
         <w:tc>
           <w:tcPr>
-            <w:tcW w:type="dxa" w:w="1361"/>
+            <w:tcW w:type="dxa" w:w="807"/>
           </w:tcPr>
           <w:p>
             <w:pPr/>
@@ -4161,7 +3689,7 @@
         </w:tc>
         <w:tc>
           <w:tcPr>
-            <w:tcW w:type="dxa" w:w="1361"/>
+            <w:tcW w:type="dxa" w:w="968"/>
           </w:tcPr>
           <w:p>
             <w:pPr/>
@@ -4178,7 +3706,7 @@
         </w:trPr>
         <w:tc>
           <w:tcPr>
-            <w:tcW w:type="dxa" w:w="1361"/>
+            <w:tcW w:type="dxa" w:w="1614"/>
           </w:tcPr>
           <w:p>
             <w:pPr/>
@@ -4190,7 +3718,7 @@
         </w:tc>
         <w:tc>
           <w:tcPr>
-            <w:tcW w:type="dxa" w:w="1361"/>
+            <w:tcW w:type="dxa" w:w="1937"/>
           </w:tcPr>
           <w:p>
             <w:pPr/>
@@ -4202,7 +3730,7 @@
         </w:tc>
         <w:tc>
           <w:tcPr>
-            <w:tcW w:type="dxa" w:w="1361"/>
+            <w:tcW w:type="dxa" w:w="1775"/>
           </w:tcPr>
           <w:p>
             <w:pPr/>
@@ -4214,7 +3742,7 @@
         </w:tc>
         <w:tc>
           <w:tcPr>
-            <w:tcW w:type="dxa" w:w="1361"/>
+            <w:tcW w:type="dxa" w:w="1452"/>
           </w:tcPr>
           <w:p>
             <w:pPr/>
@@ -4226,7 +3754,7 @@
         </w:tc>
         <w:tc>
           <w:tcPr>
-            <w:tcW w:type="dxa" w:w="1361"/>
+            <w:tcW w:type="dxa" w:w="968"/>
           </w:tcPr>
           <w:p>
             <w:pPr/>
@@ -4238,7 +3766,7 @@
         </w:tc>
         <w:tc>
           <w:tcPr>
-            <w:tcW w:type="dxa" w:w="1361"/>
+            <w:tcW w:type="dxa" w:w="807"/>
           </w:tcPr>
           <w:p>
             <w:pPr/>
@@ -4250,7 +3778,7 @@
         </w:tc>
         <w:tc>
           <w:tcPr>
-            <w:tcW w:type="dxa" w:w="1361"/>
+            <w:tcW w:type="dxa" w:w="968"/>
           </w:tcPr>
           <w:p>
             <w:pPr/>
@@ -4267,7 +3795,7 @@
         </w:trPr>
         <w:tc>
           <w:tcPr>
-            <w:tcW w:type="dxa" w:w="1361"/>
+            <w:tcW w:type="dxa" w:w="1614"/>
           </w:tcPr>
           <w:p>
             <w:pPr/>
@@ -4279,7 +3807,7 @@
         </w:tc>
         <w:tc>
           <w:tcPr>
-            <w:tcW w:type="dxa" w:w="1361"/>
+            <w:tcW w:type="dxa" w:w="1937"/>
           </w:tcPr>
           <w:p>
             <w:pPr/>
@@ -4291,7 +3819,7 @@
         </w:tc>
         <w:tc>
           <w:tcPr>
-            <w:tcW w:type="dxa" w:w="1361"/>
+            <w:tcW w:type="dxa" w:w="1775"/>
           </w:tcPr>
           <w:p>
             <w:pPr/>
@@ -4303,7 +3831,7 @@
         </w:tc>
         <w:tc>
           <w:tcPr>
-            <w:tcW w:type="dxa" w:w="1361"/>
+            <w:tcW w:type="dxa" w:w="1452"/>
           </w:tcPr>
           <w:p>
             <w:pPr/>
@@ -4315,7 +3843,7 @@
         </w:tc>
         <w:tc>
           <w:tcPr>
-            <w:tcW w:type="dxa" w:w="1361"/>
+            <w:tcW w:type="dxa" w:w="968"/>
           </w:tcPr>
           <w:p>
             <w:pPr/>
@@ -4327,7 +3855,7 @@
         </w:tc>
         <w:tc>
           <w:tcPr>
-            <w:tcW w:type="dxa" w:w="1361"/>
+            <w:tcW w:type="dxa" w:w="807"/>
           </w:tcPr>
           <w:p>
             <w:pPr/>
@@ -4339,7 +3867,7 @@
         </w:tc>
         <w:tc>
           <w:tcPr>
-            <w:tcW w:type="dxa" w:w="1361"/>
+            <w:tcW w:type="dxa" w:w="968"/>
           </w:tcPr>
           <w:p>
             <w:pPr/>
@@ -4356,7 +3884,7 @@
         </w:trPr>
         <w:tc>
           <w:tcPr>
-            <w:tcW w:type="dxa" w:w="1361"/>
+            <w:tcW w:type="dxa" w:w="1614"/>
           </w:tcPr>
           <w:p>
             <w:pPr/>
@@ -4368,7 +3896,7 @@
         </w:tc>
         <w:tc>
           <w:tcPr>
-            <w:tcW w:type="dxa" w:w="1361"/>
+            <w:tcW w:type="dxa" w:w="1937"/>
           </w:tcPr>
           <w:p>
             <w:pPr/>
@@ -4380,7 +3908,7 @@
         </w:tc>
         <w:tc>
           <w:tcPr>
-            <w:tcW w:type="dxa" w:w="1361"/>
+            <w:tcW w:type="dxa" w:w="1775"/>
           </w:tcPr>
           <w:p>
             <w:pPr/>
@@ -4392,7 +3920,7 @@
         </w:tc>
         <w:tc>
           <w:tcPr>
-            <w:tcW w:type="dxa" w:w="1361"/>
+            <w:tcW w:type="dxa" w:w="1452"/>
           </w:tcPr>
           <w:p>
             <w:pPr/>
@@ -4404,7 +3932,7 @@
         </w:tc>
         <w:tc>
           <w:tcPr>
-            <w:tcW w:type="dxa" w:w="1361"/>
+            <w:tcW w:type="dxa" w:w="968"/>
           </w:tcPr>
           <w:p>
             <w:pPr/>
@@ -4416,7 +3944,7 @@
         </w:tc>
         <w:tc>
           <w:tcPr>
-            <w:tcW w:type="dxa" w:w="1361"/>
+            <w:tcW w:type="dxa" w:w="807"/>
           </w:tcPr>
           <w:p>
             <w:pPr/>
@@ -4428,7 +3956,7 @@
         </w:tc>
         <w:tc>
           <w:tcPr>
-            <w:tcW w:type="dxa" w:w="1361"/>
+            <w:tcW w:type="dxa" w:w="968"/>
           </w:tcPr>
           <w:p>
             <w:pPr/>
@@ -4445,7 +3973,7 @@
         </w:trPr>
         <w:tc>
           <w:tcPr>
-            <w:tcW w:type="dxa" w:w="1361"/>
+            <w:tcW w:type="dxa" w:w="1614"/>
           </w:tcPr>
           <w:p>
             <w:pPr/>
@@ -4457,7 +3985,7 @@
         </w:tc>
         <w:tc>
           <w:tcPr>
-            <w:tcW w:type="dxa" w:w="1361"/>
+            <w:tcW w:type="dxa" w:w="1937"/>
           </w:tcPr>
           <w:p>
             <w:pPr/>
@@ -4469,7 +3997,7 @@
         </w:tc>
         <w:tc>
           <w:tcPr>
-            <w:tcW w:type="dxa" w:w="1361"/>
+            <w:tcW w:type="dxa" w:w="1775"/>
           </w:tcPr>
           <w:p>
             <w:pPr/>
@@ -4481,7 +4009,7 @@
         </w:tc>
         <w:tc>
           <w:tcPr>
-            <w:tcW w:type="dxa" w:w="1361"/>
+            <w:tcW w:type="dxa" w:w="1452"/>
           </w:tcPr>
           <w:p>
             <w:pPr/>
@@ -4493,7 +4021,7 @@
         </w:tc>
         <w:tc>
           <w:tcPr>
-            <w:tcW w:type="dxa" w:w="1361"/>
+            <w:tcW w:type="dxa" w:w="968"/>
           </w:tcPr>
           <w:p>
             <w:pPr/>
@@ -4505,7 +4033,7 @@
         </w:tc>
         <w:tc>
           <w:tcPr>
-            <w:tcW w:type="dxa" w:w="1361"/>
+            <w:tcW w:type="dxa" w:w="807"/>
           </w:tcPr>
           <w:p>
             <w:pPr/>
@@ -4517,7 +4045,7 @@
         </w:tc>
         <w:tc>
           <w:tcPr>
-            <w:tcW w:type="dxa" w:w="1361"/>
+            <w:tcW w:type="dxa" w:w="968"/>
           </w:tcPr>
           <w:p>
             <w:pPr/>
@@ -4534,7 +4062,7 @@
         </w:trPr>
         <w:tc>
           <w:tcPr>
-            <w:tcW w:type="dxa" w:w="1361"/>
+            <w:tcW w:type="dxa" w:w="1614"/>
           </w:tcPr>
           <w:p>
             <w:pPr/>
@@ -4549,47 +4077,47 @@
         </w:tc>
         <w:tc>
           <w:tcPr>
-            <w:tcW w:type="dxa" w:w="1361"/>
-          </w:tcPr>
-          <w:p>
-            <w:pPr/>
-            <w:r/>
-            <w:r/>
-          </w:p>
-        </w:tc>
-        <w:tc>
-          <w:tcPr>
-            <w:tcW w:type="dxa" w:w="1361"/>
-          </w:tcPr>
-          <w:p>
-            <w:pPr/>
-            <w:r/>
-            <w:r/>
-          </w:p>
-        </w:tc>
-        <w:tc>
-          <w:tcPr>
-            <w:tcW w:type="dxa" w:w="1361"/>
-          </w:tcPr>
-          <w:p>
-            <w:pPr/>
-            <w:r/>
-            <w:r/>
-          </w:p>
-        </w:tc>
-        <w:tc>
-          <w:tcPr>
-            <w:tcW w:type="dxa" w:w="1361"/>
-          </w:tcPr>
-          <w:p>
-            <w:pPr/>
-            <w:r/>
-            <w:r/>
-          </w:p>
-        </w:tc>
-        <w:tc>
-          <w:tcPr>
-            <w:tcW w:type="dxa" w:w="1361"/>
+            <w:tcW w:type="dxa" w:w="1937"/>
+          </w:tcPr>
+          <w:p>
+            <w:pPr/>
+            <w:r/>
+            <w:r/>
+          </w:p>
+        </w:tc>
+        <w:tc>
+          <w:tcPr>
+            <w:tcW w:type="dxa" w:w="1775"/>
+          </w:tcPr>
+          <w:p>
+            <w:pPr/>
+            <w:r/>
+            <w:r/>
+          </w:p>
+        </w:tc>
+        <w:tc>
+          <w:tcPr>
+            <w:tcW w:type="dxa" w:w="1452"/>
+          </w:tcPr>
+          <w:p>
+            <w:pPr/>
+            <w:r/>
+            <w:r/>
+          </w:p>
+        </w:tc>
+        <w:tc>
+          <w:tcPr>
+            <w:tcW w:type="dxa" w:w="968"/>
+          </w:tcPr>
+          <w:p>
+            <w:pPr/>
+            <w:r/>
+            <w:r/>
+          </w:p>
+        </w:tc>
+        <w:tc>
+          <w:tcPr>
+            <w:tcW w:type="dxa" w:w="807"/>
           </w:tcPr>
           <w:p>
             <w:pPr/>
@@ -4604,7 +4132,7 @@
         </w:tc>
         <w:tc>
           <w:tcPr>
-            <w:tcW w:type="dxa" w:w="1361"/>
+            <w:tcW w:type="dxa" w:w="968"/>
           </w:tcPr>
           <w:p>
             <w:pPr/>
@@ -4822,6 +4350,7 @@
     <w:tbl>
       <w:tblPr>
         <w:tblW w:type="auto" w:w="0"/>
+        <w:tblLayout w:type="fixed"/>
         <w:tblLook w:firstColumn="1" w:firstRow="1" w:lastColumn="0" w:lastRow="0" w:noHBand="0" w:noVBand="1" w:val="04A0"/>
         <w:tblBorders>
           <w:top w:val="single" w:sz="4" w:color="000000"/>
@@ -4833,11 +4362,11 @@
         </w:tblBorders>
       </w:tblPr>
       <w:tblGrid>
-        <w:gridCol w:w="1905"/>
-        <w:gridCol w:w="1905"/>
-        <w:gridCol w:w="1905"/>
-        <w:gridCol w:w="1905"/>
-        <w:gridCol w:w="1905"/>
+        <w:gridCol w:w="3081"/>
+        <w:gridCol w:w="980"/>
+        <w:gridCol w:w="840"/>
+        <w:gridCol w:w="2661"/>
+        <w:gridCol w:w="1961"/>
       </w:tblGrid>
       <w:tr>
         <w:trPr>
@@ -4846,7 +4375,7 @@
         </w:trPr>
         <w:tc>
           <w:tcPr>
-            <w:tcW w:type="dxa" w:w="1905"/>
+            <w:tcW w:type="dxa" w:w="3081"/>
           </w:tcPr>
           <w:p>
             <w:pPr/>
@@ -4861,7 +4390,7 @@
         </w:tc>
         <w:tc>
           <w:tcPr>
-            <w:tcW w:type="dxa" w:w="1905"/>
+            <w:tcW w:type="dxa" w:w="980"/>
           </w:tcPr>
           <w:p>
             <w:pPr/>
@@ -4876,7 +4405,7 @@
         </w:tc>
         <w:tc>
           <w:tcPr>
-            <w:tcW w:type="dxa" w:w="1905"/>
+            <w:tcW w:type="dxa" w:w="840"/>
           </w:tcPr>
           <w:p>
             <w:pPr/>
@@ -4891,7 +4420,7 @@
         </w:tc>
         <w:tc>
           <w:tcPr>
-            <w:tcW w:type="dxa" w:w="1905"/>
+            <w:tcW w:type="dxa" w:w="2661"/>
           </w:tcPr>
           <w:p>
             <w:pPr/>
@@ -4906,7 +4435,7 @@
         </w:tc>
         <w:tc>
           <w:tcPr>
-            <w:tcW w:type="dxa" w:w="1905"/>
+            <w:tcW w:type="dxa" w:w="1961"/>
           </w:tcPr>
           <w:p>
             <w:pPr/>
@@ -4926,7 +4455,7 @@
         </w:trPr>
         <w:tc>
           <w:tcPr>
-            <w:tcW w:type="dxa" w:w="1905"/>
+            <w:tcW w:type="dxa" w:w="3081"/>
           </w:tcPr>
           <w:p>
             <w:pPr/>
@@ -4938,7 +4467,7 @@
         </w:tc>
         <w:tc>
           <w:tcPr>
-            <w:tcW w:type="dxa" w:w="1905"/>
+            <w:tcW w:type="dxa" w:w="980"/>
           </w:tcPr>
           <w:p>
             <w:pPr/>
@@ -4950,7 +4479,7 @@
         </w:tc>
         <w:tc>
           <w:tcPr>
-            <w:tcW w:type="dxa" w:w="1905"/>
+            <w:tcW w:type="dxa" w:w="840"/>
           </w:tcPr>
           <w:p>
             <w:pPr/>
@@ -4962,7 +4491,7 @@
         </w:tc>
         <w:tc>
           <w:tcPr>
-            <w:tcW w:type="dxa" w:w="1905"/>
+            <w:tcW w:type="dxa" w:w="2661"/>
           </w:tcPr>
           <w:p>
             <w:pPr/>
@@ -4974,7 +4503,7 @@
         </w:tc>
         <w:tc>
           <w:tcPr>
-            <w:tcW w:type="dxa" w:w="1905"/>
+            <w:tcW w:type="dxa" w:w="1961"/>
           </w:tcPr>
           <w:p>
             <w:pPr/>
@@ -4991,7 +4520,7 @@
         </w:trPr>
         <w:tc>
           <w:tcPr>
-            <w:tcW w:type="dxa" w:w="1905"/>
+            <w:tcW w:type="dxa" w:w="3081"/>
           </w:tcPr>
           <w:p>
             <w:pPr/>
@@ -5003,7 +4532,7 @@
         </w:tc>
         <w:tc>
           <w:tcPr>
-            <w:tcW w:type="dxa" w:w="1905"/>
+            <w:tcW w:type="dxa" w:w="980"/>
           </w:tcPr>
           <w:p>
             <w:pPr/>
@@ -5015,7 +4544,7 @@
         </w:tc>
         <w:tc>
           <w:tcPr>
-            <w:tcW w:type="dxa" w:w="1905"/>
+            <w:tcW w:type="dxa" w:w="840"/>
           </w:tcPr>
           <w:p>
             <w:pPr/>
@@ -5027,7 +4556,7 @@
         </w:tc>
         <w:tc>
           <w:tcPr>
-            <w:tcW w:type="dxa" w:w="1905"/>
+            <w:tcW w:type="dxa" w:w="2661"/>
           </w:tcPr>
           <w:p>
             <w:pPr/>
@@ -5039,7 +4568,7 @@
         </w:tc>
         <w:tc>
           <w:tcPr>
-            <w:tcW w:type="dxa" w:w="1905"/>
+            <w:tcW w:type="dxa" w:w="1961"/>
           </w:tcPr>
           <w:p>
             <w:pPr/>
@@ -5056,7 +4585,7 @@
         </w:trPr>
         <w:tc>
           <w:tcPr>
-            <w:tcW w:type="dxa" w:w="1905"/>
+            <w:tcW w:type="dxa" w:w="3081"/>
           </w:tcPr>
           <w:p>
             <w:pPr/>
@@ -5068,7 +4597,7 @@
         </w:tc>
         <w:tc>
           <w:tcPr>
-            <w:tcW w:type="dxa" w:w="1905"/>
+            <w:tcW w:type="dxa" w:w="980"/>
           </w:tcPr>
           <w:p>
             <w:pPr/>
@@ -5080,7 +4609,7 @@
         </w:tc>
         <w:tc>
           <w:tcPr>
-            <w:tcW w:type="dxa" w:w="1905"/>
+            <w:tcW w:type="dxa" w:w="840"/>
           </w:tcPr>
           <w:p>
             <w:pPr/>
@@ -5092,7 +4621,7 @@
         </w:tc>
         <w:tc>
           <w:tcPr>
-            <w:tcW w:type="dxa" w:w="1905"/>
+            <w:tcW w:type="dxa" w:w="2661"/>
           </w:tcPr>
           <w:p>
             <w:pPr/>
@@ -5104,7 +4633,7 @@
         </w:tc>
         <w:tc>
           <w:tcPr>
-            <w:tcW w:type="dxa" w:w="1905"/>
+            <w:tcW w:type="dxa" w:w="1961"/>
           </w:tcPr>
           <w:p>
             <w:pPr/>
@@ -5306,6 +4835,7 @@
     <w:tbl>
       <w:tblPr>
         <w:tblW w:type="auto" w:w="0"/>
+        <w:tblLayout w:type="fixed"/>
         <w:tblLook w:firstColumn="1" w:firstRow="1" w:lastColumn="0" w:lastRow="0" w:noHBand="0" w:noVBand="1" w:val="04A0"/>
         <w:tblBorders>
           <w:top w:val="single" w:sz="4" w:color="000000"/>
@@ -5317,11 +4847,11 @@
         </w:tblBorders>
       </w:tblPr>
       <w:tblGrid>
-        <w:gridCol w:w="1905"/>
-        <w:gridCol w:w="1905"/>
-        <w:gridCol w:w="1905"/>
-        <w:gridCol w:w="1905"/>
-        <w:gridCol w:w="1905"/>
+        <w:gridCol w:w="2794"/>
+        <w:gridCol w:w="889"/>
+        <w:gridCol w:w="762"/>
+        <w:gridCol w:w="2413"/>
+        <w:gridCol w:w="2667"/>
       </w:tblGrid>
       <w:tr>
         <w:trPr>
@@ -5330,7 +4860,7 @@
         </w:trPr>
         <w:tc>
           <w:tcPr>
-            <w:tcW w:type="dxa" w:w="1905"/>
+            <w:tcW w:type="dxa" w:w="2794"/>
           </w:tcPr>
           <w:p>
             <w:pPr/>
@@ -5345,7 +4875,7 @@
         </w:tc>
         <w:tc>
           <w:tcPr>
-            <w:tcW w:type="dxa" w:w="1905"/>
+            <w:tcW w:type="dxa" w:w="889"/>
           </w:tcPr>
           <w:p>
             <w:pPr/>
@@ -5360,7 +4890,7 @@
         </w:tc>
         <w:tc>
           <w:tcPr>
-            <w:tcW w:type="dxa" w:w="1905"/>
+            <w:tcW w:type="dxa" w:w="762"/>
           </w:tcPr>
           <w:p>
             <w:pPr/>
@@ -5375,7 +4905,7 @@
         </w:tc>
         <w:tc>
           <w:tcPr>
-            <w:tcW w:type="dxa" w:w="1905"/>
+            <w:tcW w:type="dxa" w:w="2413"/>
           </w:tcPr>
           <w:p>
             <w:pPr/>
@@ -5390,7 +4920,7 @@
         </w:tc>
         <w:tc>
           <w:tcPr>
-            <w:tcW w:type="dxa" w:w="1905"/>
+            <w:tcW w:type="dxa" w:w="2667"/>
           </w:tcPr>
           <w:p>
             <w:pPr/>
@@ -5410,7 +4940,7 @@
         </w:trPr>
         <w:tc>
           <w:tcPr>
-            <w:tcW w:type="dxa" w:w="1905"/>
+            <w:tcW w:type="dxa" w:w="2794"/>
           </w:tcPr>
           <w:p>
             <w:pPr/>
@@ -5422,7 +4952,7 @@
         </w:tc>
         <w:tc>
           <w:tcPr>
-            <w:tcW w:type="dxa" w:w="1905"/>
+            <w:tcW w:type="dxa" w:w="889"/>
           </w:tcPr>
           <w:p>
             <w:pPr/>
@@ -5434,7 +4964,7 @@
         </w:tc>
         <w:tc>
           <w:tcPr>
-            <w:tcW w:type="dxa" w:w="1905"/>
+            <w:tcW w:type="dxa" w:w="762"/>
           </w:tcPr>
           <w:p>
             <w:pPr/>
@@ -5446,7 +4976,7 @@
         </w:tc>
         <w:tc>
           <w:tcPr>
-            <w:tcW w:type="dxa" w:w="1905"/>
+            <w:tcW w:type="dxa" w:w="2413"/>
           </w:tcPr>
           <w:p>
             <w:pPr/>
@@ -5458,7 +4988,7 @@
         </w:tc>
         <w:tc>
           <w:tcPr>
-            <w:tcW w:type="dxa" w:w="1905"/>
+            <w:tcW w:type="dxa" w:w="2667"/>
           </w:tcPr>
           <w:p>
             <w:pPr/>
@@ -5475,7 +5005,7 @@
         </w:trPr>
         <w:tc>
           <w:tcPr>
-            <w:tcW w:type="dxa" w:w="1905"/>
+            <w:tcW w:type="dxa" w:w="2794"/>
           </w:tcPr>
           <w:p>
             <w:pPr/>
@@ -5487,7 +5017,7 @@
         </w:tc>
         <w:tc>
           <w:tcPr>
-            <w:tcW w:type="dxa" w:w="1905"/>
+            <w:tcW w:type="dxa" w:w="889"/>
           </w:tcPr>
           <w:p>
             <w:pPr/>
@@ -5499,7 +5029,7 @@
         </w:tc>
         <w:tc>
           <w:tcPr>
-            <w:tcW w:type="dxa" w:w="1905"/>
+            <w:tcW w:type="dxa" w:w="762"/>
           </w:tcPr>
           <w:p>
             <w:pPr/>
@@ -5511,7 +5041,7 @@
         </w:tc>
         <w:tc>
           <w:tcPr>
-            <w:tcW w:type="dxa" w:w="1905"/>
+            <w:tcW w:type="dxa" w:w="2413"/>
           </w:tcPr>
           <w:p>
             <w:pPr/>
@@ -5523,7 +5053,7 @@
         </w:tc>
         <w:tc>
           <w:tcPr>
-            <w:tcW w:type="dxa" w:w="1905"/>
+            <w:tcW w:type="dxa" w:w="2667"/>
           </w:tcPr>
           <w:p>
             <w:pPr/>
@@ -5651,6 +5181,7 @@
     <w:tbl>
       <w:tblPr>
         <w:tblW w:type="auto" w:w="0"/>
+        <w:tblLayout w:type="fixed"/>
         <w:tblLook w:firstColumn="1" w:firstRow="1" w:lastColumn="0" w:lastRow="0" w:noHBand="0" w:noVBand="1" w:val="04A0"/>
         <w:tblBorders>
           <w:top w:val="single" w:sz="4" w:color="000000"/>
@@ -5662,13 +5193,13 @@
         </w:tblBorders>
       </w:tblPr>
       <w:tblGrid>
-        <w:gridCol w:w="1361"/>
-        <w:gridCol w:w="1361"/>
-        <w:gridCol w:w="1361"/>
-        <w:gridCol w:w="1361"/>
-        <w:gridCol w:w="1361"/>
-        <w:gridCol w:w="1361"/>
-        <w:gridCol w:w="1361"/>
+        <w:gridCol w:w="2721"/>
+        <w:gridCol w:w="1608"/>
+        <w:gridCol w:w="1113"/>
+        <w:gridCol w:w="742"/>
+        <w:gridCol w:w="865"/>
+        <w:gridCol w:w="742"/>
+        <w:gridCol w:w="1731"/>
       </w:tblGrid>
       <w:tr>
         <w:trPr>
@@ -5677,7 +5208,7 @@
         </w:trPr>
         <w:tc>
           <w:tcPr>
-            <w:tcW w:type="dxa" w:w="1361"/>
+            <w:tcW w:type="dxa" w:w="2721"/>
           </w:tcPr>
           <w:p>
             <w:pPr/>
@@ -5692,7 +5223,7 @@
         </w:tc>
         <w:tc>
           <w:tcPr>
-            <w:tcW w:type="dxa" w:w="1361"/>
+            <w:tcW w:type="dxa" w:w="1608"/>
           </w:tcPr>
           <w:p>
             <w:pPr/>
@@ -5707,7 +5238,7 @@
         </w:tc>
         <w:tc>
           <w:tcPr>
-            <w:tcW w:type="dxa" w:w="1361"/>
+            <w:tcW w:type="dxa" w:w="1113"/>
           </w:tcPr>
           <w:p>
             <w:pPr/>
@@ -5722,7 +5253,7 @@
         </w:tc>
         <w:tc>
           <w:tcPr>
-            <w:tcW w:type="dxa" w:w="1361"/>
+            <w:tcW w:type="dxa" w:w="742"/>
           </w:tcPr>
           <w:p>
             <w:pPr/>
@@ -5737,7 +5268,7 @@
         </w:tc>
         <w:tc>
           <w:tcPr>
-            <w:tcW w:type="dxa" w:w="1361"/>
+            <w:tcW w:type="dxa" w:w="865"/>
           </w:tcPr>
           <w:p>
             <w:pPr/>
@@ -5752,7 +5283,7 @@
         </w:tc>
         <w:tc>
           <w:tcPr>
-            <w:tcW w:type="dxa" w:w="1361"/>
+            <w:tcW w:type="dxa" w:w="742"/>
           </w:tcPr>
           <w:p>
             <w:pPr/>
@@ -5767,7 +5298,7 @@
         </w:tc>
         <w:tc>
           <w:tcPr>
-            <w:tcW w:type="dxa" w:w="1361"/>
+            <w:tcW w:type="dxa" w:w="1731"/>
           </w:tcPr>
           <w:p>
             <w:pPr/>
@@ -5787,7 +5318,7 @@
         </w:trPr>
         <w:tc>
           <w:tcPr>
-            <w:tcW w:type="dxa" w:w="1361"/>
+            <w:tcW w:type="dxa" w:w="2721"/>
           </w:tcPr>
           <w:p>
             <w:pPr/>
@@ -5799,7 +5330,7 @@
         </w:tc>
         <w:tc>
           <w:tcPr>
-            <w:tcW w:type="dxa" w:w="1361"/>
+            <w:tcW w:type="dxa" w:w="1608"/>
           </w:tcPr>
           <w:p>
             <w:pPr/>
@@ -5811,7 +5342,7 @@
         </w:tc>
         <w:tc>
           <w:tcPr>
-            <w:tcW w:type="dxa" w:w="1361"/>
+            <w:tcW w:type="dxa" w:w="1113"/>
           </w:tcPr>
           <w:p>
             <w:pPr/>
@@ -5823,7 +5354,7 @@
         </w:tc>
         <w:tc>
           <w:tcPr>
-            <w:tcW w:type="dxa" w:w="1361"/>
+            <w:tcW w:type="dxa" w:w="742"/>
           </w:tcPr>
           <w:p>
             <w:pPr/>
@@ -5835,7 +5366,7 @@
         </w:tc>
         <w:tc>
           <w:tcPr>
-            <w:tcW w:type="dxa" w:w="1361"/>
+            <w:tcW w:type="dxa" w:w="865"/>
           </w:tcPr>
           <w:p>
             <w:pPr/>
@@ -5847,7 +5378,7 @@
         </w:tc>
         <w:tc>
           <w:tcPr>
-            <w:tcW w:type="dxa" w:w="1361"/>
+            <w:tcW w:type="dxa" w:w="742"/>
           </w:tcPr>
           <w:p>
             <w:pPr/>
@@ -5859,7 +5390,7 @@
         </w:tc>
         <w:tc>
           <w:tcPr>
-            <w:tcW w:type="dxa" w:w="1361"/>
+            <w:tcW w:type="dxa" w:w="1731"/>
           </w:tcPr>
           <w:p>
             <w:pPr/>
@@ -5876,7 +5407,7 @@
         </w:trPr>
         <w:tc>
           <w:tcPr>
-            <w:tcW w:type="dxa" w:w="1361"/>
+            <w:tcW w:type="dxa" w:w="2721"/>
           </w:tcPr>
           <w:p>
             <w:pPr/>
@@ -5888,7 +5419,7 @@
         </w:tc>
         <w:tc>
           <w:tcPr>
-            <w:tcW w:type="dxa" w:w="1361"/>
+            <w:tcW w:type="dxa" w:w="1608"/>
           </w:tcPr>
           <w:p>
             <w:pPr/>
@@ -5900,7 +5431,7 @@
         </w:tc>
         <w:tc>
           <w:tcPr>
-            <w:tcW w:type="dxa" w:w="1361"/>
+            <w:tcW w:type="dxa" w:w="1113"/>
           </w:tcPr>
           <w:p>
             <w:pPr/>
@@ -5912,7 +5443,7 @@
         </w:tc>
         <w:tc>
           <w:tcPr>
-            <w:tcW w:type="dxa" w:w="1361"/>
+            <w:tcW w:type="dxa" w:w="742"/>
           </w:tcPr>
           <w:p>
             <w:pPr/>
@@ -5924,7 +5455,7 @@
         </w:tc>
         <w:tc>
           <w:tcPr>
-            <w:tcW w:type="dxa" w:w="1361"/>
+            <w:tcW w:type="dxa" w:w="865"/>
           </w:tcPr>
           <w:p>
             <w:pPr/>
@@ -5936,7 +5467,7 @@
         </w:tc>
         <w:tc>
           <w:tcPr>
-            <w:tcW w:type="dxa" w:w="1361"/>
+            <w:tcW w:type="dxa" w:w="742"/>
           </w:tcPr>
           <w:p>
             <w:pPr/>
@@ -5948,7 +5479,7 @@
         </w:tc>
         <w:tc>
           <w:tcPr>
-            <w:tcW w:type="dxa" w:w="1361"/>
+            <w:tcW w:type="dxa" w:w="1731"/>
           </w:tcPr>
           <w:p>
             <w:pPr/>
@@ -5965,7 +5496,7 @@
         </w:trPr>
         <w:tc>
           <w:tcPr>
-            <w:tcW w:type="dxa" w:w="1361"/>
+            <w:tcW w:type="dxa" w:w="2721"/>
           </w:tcPr>
           <w:p>
             <w:pPr/>
@@ -5980,7 +5511,7 @@
         </w:tc>
         <w:tc>
           <w:tcPr>
-            <w:tcW w:type="dxa" w:w="1361"/>
+            <w:tcW w:type="dxa" w:w="1608"/>
           </w:tcPr>
           <w:p>
             <w:pPr/>
@@ -5995,7 +5526,7 @@
         </w:tc>
         <w:tc>
           <w:tcPr>
-            <w:tcW w:type="dxa" w:w="1361"/>
+            <w:tcW w:type="dxa" w:w="1113"/>
           </w:tcPr>
           <w:p>
             <w:pPr/>
@@ -6007,7 +5538,7 @@
         </w:tc>
         <w:tc>
           <w:tcPr>
-            <w:tcW w:type="dxa" w:w="1361"/>
+            <w:tcW w:type="dxa" w:w="742"/>
           </w:tcPr>
           <w:p>
             <w:pPr/>
@@ -6019,7 +5550,7 @@
         </w:tc>
         <w:tc>
           <w:tcPr>
-            <w:tcW w:type="dxa" w:w="1361"/>
+            <w:tcW w:type="dxa" w:w="865"/>
           </w:tcPr>
           <w:p>
             <w:pPr/>
@@ -6031,7 +5562,7 @@
         </w:tc>
         <w:tc>
           <w:tcPr>
-            <w:tcW w:type="dxa" w:w="1361"/>
+            <w:tcW w:type="dxa" w:w="742"/>
           </w:tcPr>
           <w:p>
             <w:pPr/>
@@ -6043,7 +5574,7 @@
         </w:tc>
         <w:tc>
           <w:tcPr>
-            <w:tcW w:type="dxa" w:w="1361"/>
+            <w:tcW w:type="dxa" w:w="1731"/>
           </w:tcPr>
           <w:p>
             <w:pPr/>
@@ -6063,7 +5594,7 @@
         </w:trPr>
         <w:tc>
           <w:tcPr>
-            <w:tcW w:type="dxa" w:w="1361"/>
+            <w:tcW w:type="dxa" w:w="2721"/>
           </w:tcPr>
           <w:p>
             <w:pPr/>
@@ -6075,7 +5606,7 @@
         </w:tc>
         <w:tc>
           <w:tcPr>
-            <w:tcW w:type="dxa" w:w="1361"/>
+            <w:tcW w:type="dxa" w:w="1608"/>
           </w:tcPr>
           <w:p>
             <w:pPr/>
@@ -6087,7 +5618,7 @@
         </w:tc>
         <w:tc>
           <w:tcPr>
-            <w:tcW w:type="dxa" w:w="1361"/>
+            <w:tcW w:type="dxa" w:w="1113"/>
           </w:tcPr>
           <w:p>
             <w:pPr/>
@@ -6099,7 +5630,7 @@
         </w:tc>
         <w:tc>
           <w:tcPr>
-            <w:tcW w:type="dxa" w:w="1361"/>
+            <w:tcW w:type="dxa" w:w="742"/>
           </w:tcPr>
           <w:p>
             <w:pPr/>
@@ -6111,7 +5642,7 @@
         </w:tc>
         <w:tc>
           <w:tcPr>
-            <w:tcW w:type="dxa" w:w="1361"/>
+            <w:tcW w:type="dxa" w:w="865"/>
           </w:tcPr>
           <w:p>
             <w:pPr/>
@@ -6123,7 +5654,7 @@
         </w:tc>
         <w:tc>
           <w:tcPr>
-            <w:tcW w:type="dxa" w:w="1361"/>
+            <w:tcW w:type="dxa" w:w="742"/>
           </w:tcPr>
           <w:p>
             <w:pPr/>
@@ -6135,7 +5666,7 @@
         </w:tc>
         <w:tc>
           <w:tcPr>
-            <w:tcW w:type="dxa" w:w="1361"/>
+            <w:tcW w:type="dxa" w:w="1731"/>
           </w:tcPr>
           <w:p>
             <w:pPr/>
@@ -6152,7 +5683,7 @@
         </w:trPr>
         <w:tc>
           <w:tcPr>
-            <w:tcW w:type="dxa" w:w="1361"/>
+            <w:tcW w:type="dxa" w:w="2721"/>
           </w:tcPr>
           <w:p>
             <w:pPr/>
@@ -6164,7 +5695,7 @@
         </w:tc>
         <w:tc>
           <w:tcPr>
-            <w:tcW w:type="dxa" w:w="1361"/>
+            <w:tcW w:type="dxa" w:w="1608"/>
           </w:tcPr>
           <w:p>
             <w:pPr/>
@@ -6176,7 +5707,7 @@
         </w:tc>
         <w:tc>
           <w:tcPr>
-            <w:tcW w:type="dxa" w:w="1361"/>
+            <w:tcW w:type="dxa" w:w="1113"/>
           </w:tcPr>
           <w:p>
             <w:pPr/>
@@ -6188,7 +5719,7 @@
         </w:tc>
         <w:tc>
           <w:tcPr>
-            <w:tcW w:type="dxa" w:w="1361"/>
+            <w:tcW w:type="dxa" w:w="742"/>
           </w:tcPr>
           <w:p>
             <w:pPr/>
@@ -6200,7 +5731,7 @@
         </w:tc>
         <w:tc>
           <w:tcPr>
-            <w:tcW w:type="dxa" w:w="1361"/>
+            <w:tcW w:type="dxa" w:w="865"/>
           </w:tcPr>
           <w:p>
             <w:pPr/>
@@ -6212,7 +5743,7 @@
         </w:tc>
         <w:tc>
           <w:tcPr>
-            <w:tcW w:type="dxa" w:w="1361"/>
+            <w:tcW w:type="dxa" w:w="742"/>
           </w:tcPr>
           <w:p>
             <w:pPr/>
@@ -6224,7 +5755,7 @@
         </w:tc>
         <w:tc>
           <w:tcPr>
-            <w:tcW w:type="dxa" w:w="1361"/>
+            <w:tcW w:type="dxa" w:w="1731"/>
           </w:tcPr>
           <w:p>
             <w:pPr/>
@@ -6330,6 +5861,7 @@
     <w:tbl>
       <w:tblPr>
         <w:tblW w:type="auto" w:w="0"/>
+        <w:tblLayout w:type="fixed"/>
         <w:tblLook w:firstColumn="1" w:firstRow="1" w:lastColumn="0" w:lastRow="0" w:noHBand="0" w:noVBand="1" w:val="04A0"/>
         <w:tblBorders>
           <w:top w:val="single" w:sz="4" w:color="000000"/>
@@ -6341,10 +5873,10 @@
         </w:tblBorders>
       </w:tblPr>
       <w:tblGrid>
-        <w:gridCol w:w="2381"/>
-        <w:gridCol w:w="2381"/>
-        <w:gridCol w:w="2381"/>
-        <w:gridCol w:w="2381"/>
+        <w:gridCol w:w="3445"/>
+        <w:gridCol w:w="2634"/>
+        <w:gridCol w:w="1418"/>
+        <w:gridCol w:w="2026"/>
       </w:tblGrid>
       <w:tr>
         <w:trPr>
@@ -6353,7 +5885,7 @@
         </w:trPr>
         <w:tc>
           <w:tcPr>
-            <w:tcW w:type="dxa" w:w="2381"/>
+            <w:tcW w:type="dxa" w:w="3445"/>
           </w:tcPr>
           <w:p>
             <w:pPr/>
@@ -6368,7 +5900,7 @@
         </w:tc>
         <w:tc>
           <w:tcPr>
-            <w:tcW w:type="dxa" w:w="2381"/>
+            <w:tcW w:type="dxa" w:w="2634"/>
           </w:tcPr>
           <w:p>
             <w:pPr/>
@@ -6383,7 +5915,7 @@
         </w:tc>
         <w:tc>
           <w:tcPr>
-            <w:tcW w:type="dxa" w:w="2381"/>
+            <w:tcW w:type="dxa" w:w="1418"/>
           </w:tcPr>
           <w:p>
             <w:pPr/>
@@ -6398,7 +5930,7 @@
         </w:tc>
         <w:tc>
           <w:tcPr>
-            <w:tcW w:type="dxa" w:w="2381"/>
+            <w:tcW w:type="dxa" w:w="2026"/>
           </w:tcPr>
           <w:p>
             <w:pPr/>
@@ -6418,7 +5950,7 @@
         </w:trPr>
         <w:tc>
           <w:tcPr>
-            <w:tcW w:type="dxa" w:w="2381"/>
+            <w:tcW w:type="dxa" w:w="3445"/>
           </w:tcPr>
           <w:p>
             <w:pPr/>
@@ -6430,7 +5962,7 @@
         </w:tc>
         <w:tc>
           <w:tcPr>
-            <w:tcW w:type="dxa" w:w="2381"/>
+            <w:tcW w:type="dxa" w:w="2634"/>
           </w:tcPr>
           <w:p>
             <w:pPr/>
@@ -6442,7 +5974,7 @@
         </w:tc>
         <w:tc>
           <w:tcPr>
-            <w:tcW w:type="dxa" w:w="2381"/>
+            <w:tcW w:type="dxa" w:w="1418"/>
           </w:tcPr>
           <w:p>
             <w:pPr/>
@@ -6454,7 +5986,7 @@
         </w:tc>
         <w:tc>
           <w:tcPr>
-            <w:tcW w:type="dxa" w:w="2381"/>
+            <w:tcW w:type="dxa" w:w="2026"/>
           </w:tcPr>
           <w:p>
             <w:pPr/>
@@ -6471,7 +6003,7 @@
         </w:trPr>
         <w:tc>
           <w:tcPr>
-            <w:tcW w:type="dxa" w:w="2381"/>
+            <w:tcW w:type="dxa" w:w="3445"/>
           </w:tcPr>
           <w:p>
             <w:pPr/>
@@ -6483,7 +6015,7 @@
         </w:tc>
         <w:tc>
           <w:tcPr>
-            <w:tcW w:type="dxa" w:w="2381"/>
+            <w:tcW w:type="dxa" w:w="2634"/>
           </w:tcPr>
           <w:p>
             <w:pPr/>
@@ -6495,7 +6027,7 @@
         </w:tc>
         <w:tc>
           <w:tcPr>
-            <w:tcW w:type="dxa" w:w="2381"/>
+            <w:tcW w:type="dxa" w:w="1418"/>
           </w:tcPr>
           <w:p>
             <w:pPr/>
@@ -6507,7 +6039,7 @@
         </w:tc>
         <w:tc>
           <w:tcPr>
-            <w:tcW w:type="dxa" w:w="2381"/>
+            <w:tcW w:type="dxa" w:w="2026"/>
           </w:tcPr>
           <w:p>
             <w:pPr/>
@@ -6524,7 +6056,7 @@
         </w:trPr>
         <w:tc>
           <w:tcPr>
-            <w:tcW w:type="dxa" w:w="2381"/>
+            <w:tcW w:type="dxa" w:w="3445"/>
           </w:tcPr>
           <w:p>
             <w:pPr/>
@@ -6536,7 +6068,7 @@
         </w:tc>
         <w:tc>
           <w:tcPr>
-            <w:tcW w:type="dxa" w:w="2381"/>
+            <w:tcW w:type="dxa" w:w="2634"/>
           </w:tcPr>
           <w:p>
             <w:pPr/>
@@ -6548,7 +6080,7 @@
         </w:tc>
         <w:tc>
           <w:tcPr>
-            <w:tcW w:type="dxa" w:w="2381"/>
+            <w:tcW w:type="dxa" w:w="1418"/>
           </w:tcPr>
           <w:p>
             <w:pPr/>
@@ -6560,7 +6092,7 @@
         </w:tc>
         <w:tc>
           <w:tcPr>
-            <w:tcW w:type="dxa" w:w="2381"/>
+            <w:tcW w:type="dxa" w:w="2026"/>
           </w:tcPr>
           <w:p>
             <w:pPr/>
@@ -6577,7 +6109,7 @@
         </w:trPr>
         <w:tc>
           <w:tcPr>
-            <w:tcW w:type="dxa" w:w="2381"/>
+            <w:tcW w:type="dxa" w:w="3445"/>
           </w:tcPr>
           <w:p>
             <w:pPr/>
@@ -6589,7 +6121,7 @@
         </w:tc>
         <w:tc>
           <w:tcPr>
-            <w:tcW w:type="dxa" w:w="2381"/>
+            <w:tcW w:type="dxa" w:w="2634"/>
           </w:tcPr>
           <w:p>
             <w:pPr/>
@@ -6601,7 +6133,7 @@
         </w:tc>
         <w:tc>
           <w:tcPr>
-            <w:tcW w:type="dxa" w:w="2381"/>
+            <w:tcW w:type="dxa" w:w="1418"/>
           </w:tcPr>
           <w:p>
             <w:pPr/>
@@ -6613,7 +6145,7 @@
         </w:tc>
         <w:tc>
           <w:tcPr>
-            <w:tcW w:type="dxa" w:w="2381"/>
+            <w:tcW w:type="dxa" w:w="2026"/>
           </w:tcPr>
           <w:p>
             <w:pPr/>
@@ -6630,7 +6162,7 @@
         </w:trPr>
         <w:tc>
           <w:tcPr>
-            <w:tcW w:type="dxa" w:w="2381"/>
+            <w:tcW w:type="dxa" w:w="3445"/>
           </w:tcPr>
           <w:p>
             <w:pPr/>
@@ -6642,7 +6174,7 @@
         </w:tc>
         <w:tc>
           <w:tcPr>
-            <w:tcW w:type="dxa" w:w="2381"/>
+            <w:tcW w:type="dxa" w:w="2634"/>
           </w:tcPr>
           <w:p>
             <w:pPr/>
@@ -6654,7 +6186,7 @@
         </w:tc>
         <w:tc>
           <w:tcPr>
-            <w:tcW w:type="dxa" w:w="2381"/>
+            <w:tcW w:type="dxa" w:w="1418"/>
           </w:tcPr>
           <w:p>
             <w:pPr/>
@@ -6666,7 +6198,7 @@
         </w:tc>
         <w:tc>
           <w:tcPr>
-            <w:tcW w:type="dxa" w:w="2381"/>
+            <w:tcW w:type="dxa" w:w="2026"/>
           </w:tcPr>
           <w:p>
             <w:pPr/>
@@ -6683,7 +6215,7 @@
         </w:trPr>
         <w:tc>
           <w:tcPr>
-            <w:tcW w:type="dxa" w:w="2381"/>
+            <w:tcW w:type="dxa" w:w="3445"/>
           </w:tcPr>
           <w:p>
             <w:pPr/>
@@ -6695,7 +6227,7 @@
         </w:tc>
         <w:tc>
           <w:tcPr>
-            <w:tcW w:type="dxa" w:w="2381"/>
+            <w:tcW w:type="dxa" w:w="2634"/>
           </w:tcPr>
           <w:p>
             <w:pPr/>
@@ -6707,7 +6239,7 @@
         </w:tc>
         <w:tc>
           <w:tcPr>
-            <w:tcW w:type="dxa" w:w="2381"/>
+            <w:tcW w:type="dxa" w:w="1418"/>
           </w:tcPr>
           <w:p>
             <w:pPr/>
@@ -6719,7 +6251,7 @@
         </w:tc>
         <w:tc>
           <w:tcPr>
-            <w:tcW w:type="dxa" w:w="2381"/>
+            <w:tcW w:type="dxa" w:w="2026"/>
           </w:tcPr>
           <w:p>
             <w:pPr/>
@@ -7029,6 +6561,7 @@
     <w:tbl>
       <w:tblPr>
         <w:tblW w:type="auto" w:w="0"/>
+        <w:tblLayout w:type="fixed"/>
         <w:tblLook w:firstColumn="1" w:firstRow="1" w:lastColumn="0" w:lastRow="0" w:noHBand="0" w:noVBand="1" w:val="04A0"/>
         <w:tblBorders>
           <w:top w:val="single" w:sz="4" w:color="000000"/>
@@ -7040,13 +6573,13 @@
         </w:tblBorders>
       </w:tblPr>
       <w:tblGrid>
-        <w:gridCol w:w="1361"/>
-        <w:gridCol w:w="1361"/>
-        <w:gridCol w:w="1361"/>
-        <w:gridCol w:w="1361"/>
-        <w:gridCol w:w="1361"/>
-        <w:gridCol w:w="1361"/>
-        <w:gridCol w:w="1361"/>
+        <w:gridCol w:w="3435"/>
+        <w:gridCol w:w="2029"/>
+        <w:gridCol w:w="780"/>
+        <w:gridCol w:w="780"/>
+        <w:gridCol w:w="936"/>
+        <w:gridCol w:w="780"/>
+        <w:gridCol w:w="780"/>
       </w:tblGrid>
       <w:tr>
         <w:trPr>
@@ -7055,7 +6588,7 @@
         </w:trPr>
         <w:tc>
           <w:tcPr>
-            <w:tcW w:type="dxa" w:w="1361"/>
+            <w:tcW w:type="dxa" w:w="3435"/>
           </w:tcPr>
           <w:p>
             <w:pPr/>
@@ -7070,7 +6603,7 @@
         </w:tc>
         <w:tc>
           <w:tcPr>
-            <w:tcW w:type="dxa" w:w="1361"/>
+            <w:tcW w:type="dxa" w:w="2029"/>
           </w:tcPr>
           <w:p>
             <w:pPr/>
@@ -7085,7 +6618,7 @@
         </w:tc>
         <w:tc>
           <w:tcPr>
-            <w:tcW w:type="dxa" w:w="1361"/>
+            <w:tcW w:type="dxa" w:w="780"/>
           </w:tcPr>
           <w:p>
             <w:pPr/>
@@ -7100,7 +6633,7 @@
         </w:tc>
         <w:tc>
           <w:tcPr>
-            <w:tcW w:type="dxa" w:w="1361"/>
+            <w:tcW w:type="dxa" w:w="780"/>
           </w:tcPr>
           <w:p>
             <w:pPr/>
@@ -7115,7 +6648,7 @@
         </w:tc>
         <w:tc>
           <w:tcPr>
-            <w:tcW w:type="dxa" w:w="1361"/>
+            <w:tcW w:type="dxa" w:w="936"/>
           </w:tcPr>
           <w:p>
             <w:pPr/>
@@ -7130,7 +6663,7 @@
         </w:tc>
         <w:tc>
           <w:tcPr>
-            <w:tcW w:type="dxa" w:w="1361"/>
+            <w:tcW w:type="dxa" w:w="780"/>
           </w:tcPr>
           <w:p>
             <w:pPr/>
@@ -7145,7 +6678,7 @@
         </w:tc>
         <w:tc>
           <w:tcPr>
-            <w:tcW w:type="dxa" w:w="1361"/>
+            <w:tcW w:type="dxa" w:w="780"/>
           </w:tcPr>
           <w:p>
             <w:pPr/>
@@ -7165,7 +6698,7 @@
         </w:trPr>
         <w:tc>
           <w:tcPr>
-            <w:tcW w:type="dxa" w:w="1361"/>
+            <w:tcW w:type="dxa" w:w="3435"/>
           </w:tcPr>
           <w:p>
             <w:pPr/>
@@ -7177,7 +6710,7 @@
         </w:tc>
         <w:tc>
           <w:tcPr>
-            <w:tcW w:type="dxa" w:w="1361"/>
+            <w:tcW w:type="dxa" w:w="2029"/>
           </w:tcPr>
           <w:p>
             <w:pPr/>
@@ -7189,7 +6722,7 @@
         </w:tc>
         <w:tc>
           <w:tcPr>
-            <w:tcW w:type="dxa" w:w="1361"/>
+            <w:tcW w:type="dxa" w:w="780"/>
           </w:tcPr>
           <w:p>
             <w:pPr/>
@@ -7201,7 +6734,7 @@
         </w:tc>
         <w:tc>
           <w:tcPr>
-            <w:tcW w:type="dxa" w:w="1361"/>
+            <w:tcW w:type="dxa" w:w="780"/>
           </w:tcPr>
           <w:p>
             <w:pPr/>
@@ -7213,7 +6746,7 @@
         </w:tc>
         <w:tc>
           <w:tcPr>
-            <w:tcW w:type="dxa" w:w="1361"/>
+            <w:tcW w:type="dxa" w:w="936"/>
           </w:tcPr>
           <w:p>
             <w:pPr/>
@@ -7225,7 +6758,7 @@
         </w:tc>
         <w:tc>
           <w:tcPr>
-            <w:tcW w:type="dxa" w:w="1361"/>
+            <w:tcW w:type="dxa" w:w="780"/>
           </w:tcPr>
           <w:p>
             <w:pPr/>
@@ -7237,7 +6770,7 @@
         </w:tc>
         <w:tc>
           <w:tcPr>
-            <w:tcW w:type="dxa" w:w="1361"/>
+            <w:tcW w:type="dxa" w:w="780"/>
           </w:tcPr>
           <w:p>
             <w:pPr/>
@@ -7254,7 +6787,7 @@
         </w:trPr>
         <w:tc>
           <w:tcPr>
-            <w:tcW w:type="dxa" w:w="1361"/>
+            <w:tcW w:type="dxa" w:w="3435"/>
           </w:tcPr>
           <w:p>
             <w:pPr/>
@@ -7266,7 +6799,7 @@
         </w:tc>
         <w:tc>
           <w:tcPr>
-            <w:tcW w:type="dxa" w:w="1361"/>
+            <w:tcW w:type="dxa" w:w="2029"/>
           </w:tcPr>
           <w:p>
             <w:pPr/>
@@ -7278,7 +6811,7 @@
         </w:tc>
         <w:tc>
           <w:tcPr>
-            <w:tcW w:type="dxa" w:w="1361"/>
+            <w:tcW w:type="dxa" w:w="780"/>
           </w:tcPr>
           <w:p>
             <w:pPr/>
@@ -7290,7 +6823,7 @@
         </w:tc>
         <w:tc>
           <w:tcPr>
-            <w:tcW w:type="dxa" w:w="1361"/>
+            <w:tcW w:type="dxa" w:w="780"/>
           </w:tcPr>
           <w:p>
             <w:pPr/>
@@ -7302,7 +6835,7 @@
         </w:tc>
         <w:tc>
           <w:tcPr>
-            <w:tcW w:type="dxa" w:w="1361"/>
+            <w:tcW w:type="dxa" w:w="936"/>
           </w:tcPr>
           <w:p>
             <w:pPr/>
@@ -7314,7 +6847,7 @@
         </w:tc>
         <w:tc>
           <w:tcPr>
-            <w:tcW w:type="dxa" w:w="1361"/>
+            <w:tcW w:type="dxa" w:w="780"/>
           </w:tcPr>
           <w:p>
             <w:pPr/>
@@ -7326,7 +6859,7 @@
         </w:tc>
         <w:tc>
           <w:tcPr>
-            <w:tcW w:type="dxa" w:w="1361"/>
+            <w:tcW w:type="dxa" w:w="780"/>
           </w:tcPr>
           <w:p>
             <w:pPr/>
@@ -7343,7 +6876,7 @@
         </w:trPr>
         <w:tc>
           <w:tcPr>
-            <w:tcW w:type="dxa" w:w="1361"/>
+            <w:tcW w:type="dxa" w:w="3435"/>
           </w:tcPr>
           <w:p>
             <w:pPr/>
@@ -7355,7 +6888,7 @@
         </w:tc>
         <w:tc>
           <w:tcPr>
-            <w:tcW w:type="dxa" w:w="1361"/>
+            <w:tcW w:type="dxa" w:w="2029"/>
           </w:tcPr>
           <w:p>
             <w:pPr/>
@@ -7367,7 +6900,7 @@
         </w:tc>
         <w:tc>
           <w:tcPr>
-            <w:tcW w:type="dxa" w:w="1361"/>
+            <w:tcW w:type="dxa" w:w="780"/>
           </w:tcPr>
           <w:p>
             <w:pPr/>
@@ -7379,7 +6912,7 @@
         </w:tc>
         <w:tc>
           <w:tcPr>
-            <w:tcW w:type="dxa" w:w="1361"/>
+            <w:tcW w:type="dxa" w:w="780"/>
           </w:tcPr>
           <w:p>
             <w:pPr/>
@@ -7391,7 +6924,7 @@
         </w:tc>
         <w:tc>
           <w:tcPr>
-            <w:tcW w:type="dxa" w:w="1361"/>
+            <w:tcW w:type="dxa" w:w="936"/>
           </w:tcPr>
           <w:p>
             <w:pPr/>
@@ -7403,7 +6936,7 @@
         </w:tc>
         <w:tc>
           <w:tcPr>
-            <w:tcW w:type="dxa" w:w="1361"/>
+            <w:tcW w:type="dxa" w:w="780"/>
           </w:tcPr>
           <w:p>
             <w:pPr/>
@@ -7415,7 +6948,7 @@
         </w:tc>
         <w:tc>
           <w:tcPr>
-            <w:tcW w:type="dxa" w:w="1361"/>
+            <w:tcW w:type="dxa" w:w="780"/>
           </w:tcPr>
           <w:p>
             <w:pPr/>
@@ -7432,7 +6965,7 @@
         </w:trPr>
         <w:tc>
           <w:tcPr>
-            <w:tcW w:type="dxa" w:w="1361"/>
+            <w:tcW w:type="dxa" w:w="3435"/>
           </w:tcPr>
           <w:p>
             <w:pPr/>
@@ -7444,7 +6977,7 @@
         </w:tc>
         <w:tc>
           <w:tcPr>
-            <w:tcW w:type="dxa" w:w="1361"/>
+            <w:tcW w:type="dxa" w:w="2029"/>
           </w:tcPr>
           <w:p>
             <w:pPr/>
@@ -7456,7 +6989,7 @@
         </w:tc>
         <w:tc>
           <w:tcPr>
-            <w:tcW w:type="dxa" w:w="1361"/>
+            <w:tcW w:type="dxa" w:w="780"/>
           </w:tcPr>
           <w:p>
             <w:pPr/>
@@ -7468,7 +7001,7 @@
         </w:tc>
         <w:tc>
           <w:tcPr>
-            <w:tcW w:type="dxa" w:w="1361"/>
+            <w:tcW w:type="dxa" w:w="780"/>
           </w:tcPr>
           <w:p>
             <w:pPr/>
@@ -7480,7 +7013,7 @@
         </w:tc>
         <w:tc>
           <w:tcPr>
-            <w:tcW w:type="dxa" w:w="1361"/>
+            <w:tcW w:type="dxa" w:w="936"/>
           </w:tcPr>
           <w:p>
             <w:pPr/>
@@ -7492,7 +7025,7 @@
         </w:tc>
         <w:tc>
           <w:tcPr>
-            <w:tcW w:type="dxa" w:w="1361"/>
+            <w:tcW w:type="dxa" w:w="780"/>
           </w:tcPr>
           <w:p>
             <w:pPr/>
@@ -7504,7 +7037,7 @@
         </w:tc>
         <w:tc>
           <w:tcPr>
-            <w:tcW w:type="dxa" w:w="1361"/>
+            <w:tcW w:type="dxa" w:w="780"/>
           </w:tcPr>
           <w:p>
             <w:pPr/>
@@ -7521,7 +7054,7 @@
         </w:trPr>
         <w:tc>
           <w:tcPr>
-            <w:tcW w:type="dxa" w:w="1361"/>
+            <w:tcW w:type="dxa" w:w="3435"/>
           </w:tcPr>
           <w:p>
             <w:pPr/>
@@ -7533,7 +7066,7 @@
         </w:tc>
         <w:tc>
           <w:tcPr>
-            <w:tcW w:type="dxa" w:w="1361"/>
+            <w:tcW w:type="dxa" w:w="2029"/>
           </w:tcPr>
           <w:p>
             <w:pPr/>
@@ -7545,7 +7078,7 @@
         </w:tc>
         <w:tc>
           <w:tcPr>
-            <w:tcW w:type="dxa" w:w="1361"/>
+            <w:tcW w:type="dxa" w:w="780"/>
           </w:tcPr>
           <w:p>
             <w:pPr/>
@@ -7557,7 +7090,7 @@
         </w:tc>
         <w:tc>
           <w:tcPr>
-            <w:tcW w:type="dxa" w:w="1361"/>
+            <w:tcW w:type="dxa" w:w="780"/>
           </w:tcPr>
           <w:p>
             <w:pPr/>
@@ -7569,7 +7102,7 @@
         </w:tc>
         <w:tc>
           <w:tcPr>
-            <w:tcW w:type="dxa" w:w="1361"/>
+            <w:tcW w:type="dxa" w:w="936"/>
           </w:tcPr>
           <w:p>
             <w:pPr/>
@@ -7581,7 +7114,7 @@
         </w:tc>
         <w:tc>
           <w:tcPr>
-            <w:tcW w:type="dxa" w:w="1361"/>
+            <w:tcW w:type="dxa" w:w="780"/>
           </w:tcPr>
           <w:p>
             <w:pPr/>
@@ -7593,7 +7126,7 @@
         </w:tc>
         <w:tc>
           <w:tcPr>
-            <w:tcW w:type="dxa" w:w="1361"/>
+            <w:tcW w:type="dxa" w:w="780"/>
           </w:tcPr>
           <w:p>
             <w:pPr/>
@@ -7610,7 +7143,7 @@
         </w:trPr>
         <w:tc>
           <w:tcPr>
-            <w:tcW w:type="dxa" w:w="1361"/>
+            <w:tcW w:type="dxa" w:w="3435"/>
           </w:tcPr>
           <w:p>
             <w:pPr/>
@@ -7622,7 +7155,7 @@
         </w:tc>
         <w:tc>
           <w:tcPr>
-            <w:tcW w:type="dxa" w:w="1361"/>
+            <w:tcW w:type="dxa" w:w="2029"/>
           </w:tcPr>
           <w:p>
             <w:pPr/>
@@ -7634,7 +7167,7 @@
         </w:tc>
         <w:tc>
           <w:tcPr>
-            <w:tcW w:type="dxa" w:w="1361"/>
+            <w:tcW w:type="dxa" w:w="780"/>
           </w:tcPr>
           <w:p>
             <w:pPr/>
@@ -7646,7 +7179,7 @@
         </w:tc>
         <w:tc>
           <w:tcPr>
-            <w:tcW w:type="dxa" w:w="1361"/>
+            <w:tcW w:type="dxa" w:w="780"/>
           </w:tcPr>
           <w:p>
             <w:pPr/>
@@ -7658,7 +7191,7 @@
         </w:tc>
         <w:tc>
           <w:tcPr>
-            <w:tcW w:type="dxa" w:w="1361"/>
+            <w:tcW w:type="dxa" w:w="936"/>
           </w:tcPr>
           <w:p>
             <w:pPr/>
@@ -7670,7 +7203,7 @@
         </w:tc>
         <w:tc>
           <w:tcPr>
-            <w:tcW w:type="dxa" w:w="1361"/>
+            <w:tcW w:type="dxa" w:w="780"/>
           </w:tcPr>
           <w:p>
             <w:pPr/>
@@ -7682,7 +7215,7 @@
         </w:tc>
         <w:tc>
           <w:tcPr>
-            <w:tcW w:type="dxa" w:w="1361"/>
+            <w:tcW w:type="dxa" w:w="780"/>
           </w:tcPr>
           <w:p>
             <w:pPr/>
@@ -7699,7 +7232,7 @@
         </w:trPr>
         <w:tc>
           <w:tcPr>
-            <w:tcW w:type="dxa" w:w="1361"/>
+            <w:tcW w:type="dxa" w:w="3435"/>
           </w:tcPr>
           <w:p>
             <w:pPr/>
@@ -7714,7 +7247,7 @@
         </w:tc>
         <w:tc>
           <w:tcPr>
-            <w:tcW w:type="dxa" w:w="1361"/>
+            <w:tcW w:type="dxa" w:w="2029"/>
           </w:tcPr>
           <w:p>
             <w:pPr/>
@@ -7726,7 +7259,7 @@
         </w:tc>
         <w:tc>
           <w:tcPr>
-            <w:tcW w:type="dxa" w:w="1361"/>
+            <w:tcW w:type="dxa" w:w="780"/>
           </w:tcPr>
           <w:p>
             <w:pPr/>
@@ -7741,7 +7274,7 @@
         </w:tc>
         <w:tc>
           <w:tcPr>
-            <w:tcW w:type="dxa" w:w="1361"/>
+            <w:tcW w:type="dxa" w:w="780"/>
           </w:tcPr>
           <w:p>
             <w:pPr/>
@@ -7753,7 +7286,7 @@
         </w:tc>
         <w:tc>
           <w:tcPr>
-            <w:tcW w:type="dxa" w:w="1361"/>
+            <w:tcW w:type="dxa" w:w="936"/>
           </w:tcPr>
           <w:p>
             <w:pPr/>
@@ -7765,7 +7298,7 @@
         </w:tc>
         <w:tc>
           <w:tcPr>
-            <w:tcW w:type="dxa" w:w="1361"/>
+            <w:tcW w:type="dxa" w:w="780"/>
           </w:tcPr>
           <w:p>
             <w:pPr/>
@@ -7777,7 +7310,7 @@
         </w:tc>
         <w:tc>
           <w:tcPr>
-            <w:tcW w:type="dxa" w:w="1361"/>
+            <w:tcW w:type="dxa" w:w="780"/>
           </w:tcPr>
           <w:p>
             <w:pPr/>
@@ -7794,7 +7327,7 @@
         </w:trPr>
         <w:tc>
           <w:tcPr>
-            <w:tcW w:type="dxa" w:w="1361"/>
+            <w:tcW w:type="dxa" w:w="3435"/>
           </w:tcPr>
           <w:p>
             <w:pPr/>
@@ -7809,7 +7342,7 @@
         </w:tc>
         <w:tc>
           <w:tcPr>
-            <w:tcW w:type="dxa" w:w="1361"/>
+            <w:tcW w:type="dxa" w:w="2029"/>
           </w:tcPr>
           <w:p>
             <w:pPr/>
@@ -7821,7 +7354,7 @@
         </w:tc>
         <w:tc>
           <w:tcPr>
-            <w:tcW w:type="dxa" w:w="1361"/>
+            <w:tcW w:type="dxa" w:w="780"/>
           </w:tcPr>
           <w:p>
             <w:pPr/>
@@ -7836,7 +7369,7 @@
         </w:tc>
         <w:tc>
           <w:tcPr>
-            <w:tcW w:type="dxa" w:w="1361"/>
+            <w:tcW w:type="dxa" w:w="780"/>
           </w:tcPr>
           <w:p>
             <w:pPr/>
@@ -7848,7 +7381,7 @@
         </w:tc>
         <w:tc>
           <w:tcPr>
-            <w:tcW w:type="dxa" w:w="1361"/>
+            <w:tcW w:type="dxa" w:w="936"/>
           </w:tcPr>
           <w:p>
             <w:pPr/>
@@ -7860,7 +7393,7 @@
         </w:tc>
         <w:tc>
           <w:tcPr>
-            <w:tcW w:type="dxa" w:w="1361"/>
+            <w:tcW w:type="dxa" w:w="780"/>
           </w:tcPr>
           <w:p>
             <w:pPr/>
@@ -7872,7 +7405,7 @@
         </w:tc>
         <w:tc>
           <w:tcPr>
-            <w:tcW w:type="dxa" w:w="1361"/>
+            <w:tcW w:type="dxa" w:w="780"/>
           </w:tcPr>
           <w:p>
             <w:pPr/>
@@ -7889,7 +7422,7 @@
         </w:trPr>
         <w:tc>
           <w:tcPr>
-            <w:tcW w:type="dxa" w:w="1361"/>
+            <w:tcW w:type="dxa" w:w="3435"/>
           </w:tcPr>
           <w:p>
             <w:pPr/>
@@ -7904,7 +7437,7 @@
         </w:tc>
         <w:tc>
           <w:tcPr>
-            <w:tcW w:type="dxa" w:w="1361"/>
+            <w:tcW w:type="dxa" w:w="2029"/>
           </w:tcPr>
           <w:p>
             <w:pPr/>
@@ -7916,7 +7449,7 @@
         </w:tc>
         <w:tc>
           <w:tcPr>
-            <w:tcW w:type="dxa" w:w="1361"/>
+            <w:tcW w:type="dxa" w:w="780"/>
           </w:tcPr>
           <w:p>
             <w:pPr/>
@@ -7931,7 +7464,7 @@
         </w:tc>
         <w:tc>
           <w:tcPr>
-            <w:tcW w:type="dxa" w:w="1361"/>
+            <w:tcW w:type="dxa" w:w="780"/>
           </w:tcPr>
           <w:p>
             <w:pPr/>
@@ -7943,7 +7476,7 @@
         </w:tc>
         <w:tc>
           <w:tcPr>
-            <w:tcW w:type="dxa" w:w="1361"/>
+            <w:tcW w:type="dxa" w:w="936"/>
           </w:tcPr>
           <w:p>
             <w:pPr/>
@@ -7955,7 +7488,7 @@
         </w:tc>
         <w:tc>
           <w:tcPr>
-            <w:tcW w:type="dxa" w:w="1361"/>
+            <w:tcW w:type="dxa" w:w="780"/>
           </w:tcPr>
           <w:p>
             <w:pPr/>
@@ -7967,7 +7500,7 @@
         </w:tc>
         <w:tc>
           <w:tcPr>
-            <w:tcW w:type="dxa" w:w="1361"/>
+            <w:tcW w:type="dxa" w:w="780"/>
           </w:tcPr>
           <w:p>
             <w:pPr/>
@@ -7984,7 +7517,7 @@
         </w:trPr>
         <w:tc>
           <w:tcPr>
-            <w:tcW w:type="dxa" w:w="1361"/>
+            <w:tcW w:type="dxa" w:w="3435"/>
           </w:tcPr>
           <w:p>
             <w:pPr/>
@@ -7999,7 +7532,7 @@
         </w:tc>
         <w:tc>
           <w:tcPr>
-            <w:tcW w:type="dxa" w:w="1361"/>
+            <w:tcW w:type="dxa" w:w="2029"/>
           </w:tcPr>
           <w:p>
             <w:pPr/>
@@ -8011,7 +7544,7 @@
         </w:tc>
         <w:tc>
           <w:tcPr>
-            <w:tcW w:type="dxa" w:w="1361"/>
+            <w:tcW w:type="dxa" w:w="780"/>
           </w:tcPr>
           <w:p>
             <w:pPr/>
@@ -8026,7 +7559,7 @@
         </w:tc>
         <w:tc>
           <w:tcPr>
-            <w:tcW w:type="dxa" w:w="1361"/>
+            <w:tcW w:type="dxa" w:w="780"/>
           </w:tcPr>
           <w:p>
             <w:pPr/>
@@ -8038,7 +7571,7 @@
         </w:tc>
         <w:tc>
           <w:tcPr>
-            <w:tcW w:type="dxa" w:w="1361"/>
+            <w:tcW w:type="dxa" w:w="936"/>
           </w:tcPr>
           <w:p>
             <w:pPr/>
@@ -8050,7 +7583,7 @@
         </w:tc>
         <w:tc>
           <w:tcPr>
-            <w:tcW w:type="dxa" w:w="1361"/>
+            <w:tcW w:type="dxa" w:w="780"/>
           </w:tcPr>
           <w:p>
             <w:pPr/>
@@ -8062,7 +7595,7 @@
         </w:tc>
         <w:tc>
           <w:tcPr>
-            <w:tcW w:type="dxa" w:w="1361"/>
+            <w:tcW w:type="dxa" w:w="780"/>
           </w:tcPr>
           <w:p>
             <w:pPr/>

</xml_diff>

<commit_message>
Place table captions below the table to match the Informatica template
The word_example template prints the 'Table N:' caption underneath the table (and
the figure caption underneath the figure). Figures were already captioned below;
move the table caption from above to directly below the table, kept in the same
full-width section so it stays with the table.
</commit_message>
<xml_diff>
--- a/manuscript/Article_Informatica.docx
+++ b/manuscript/Article_Informatica.docx
@@ -583,20 +583,6 @@
           <w:cols w:num="2" w:space="284"/>
         </w:sectPr>
       </w:pPr>
-    </w:p>
-    <w:p>
-      <w:pPr>
-        <w:pStyle w:val="Normal-noindent"/>
-      </w:pPr>
-      <w:r>
-        <w:rPr>
-          <w:b/>
-        </w:rPr>
-        <w:t xml:space="preserve">Table 1: </w:t>
-      </w:r>
-      <w:r>
-        <w:t>Comparison of representative proctoring systems against the proposed framework. "V/A/M/B/P" denote vision, audio, multi-modal, behavioural-biometric and privacy-preserving categories.</w:t>
-      </w:r>
     </w:p>
     <w:tbl>
       <w:tblPr>
@@ -1641,6 +1627,20 @@
         </w:tc>
       </w:tr>
     </w:tbl>
+    <w:p>
+      <w:pPr>
+        <w:pStyle w:val="Normal-noindent"/>
+      </w:pPr>
+      <w:r>
+        <w:rPr>
+          <w:b/>
+        </w:rPr>
+        <w:t xml:space="preserve">Table 1: </w:t>
+      </w:r>
+      <w:r>
+        <w:t>Comparison of representative proctoring systems against the proposed framework. "V/A/M/B/P" denote vision, audio, multi-modal, behavioural-biometric and privacy-preserving categories.</w:t>
+      </w:r>
+    </w:p>
     <w:p>
       <w:pPr>
         <w:sectPr>
@@ -3285,20 +3285,6 @@
         </w:sectPr>
       </w:pPr>
     </w:p>
-    <w:p>
-      <w:pPr>
-        <w:pStyle w:val="Normal-noindent"/>
-      </w:pPr>
-      <w:r>
-        <w:rPr>
-          <w:b/>
-        </w:rPr>
-        <w:t xml:space="preserve">Table 2: </w:t>
-      </w:r>
-      <w:r>
-        <w:t>YOLOv8-s on the COCO val2017 proctoring subset.</w:t>
-      </w:r>
-    </w:p>
     <w:tbl>
       <w:tblPr>
         <w:tblW w:type="auto" w:w="0"/>
@@ -4147,6 +4133,20 @@
         </w:tc>
       </w:tr>
     </w:tbl>
+    <w:p>
+      <w:pPr>
+        <w:pStyle w:val="Normal-noindent"/>
+      </w:pPr>
+      <w:r>
+        <w:rPr>
+          <w:b/>
+        </w:rPr>
+        <w:t xml:space="preserve">Table 2: </w:t>
+      </w:r>
+      <w:r>
+        <w:t>YOLOv8-s on the COCO val2017 proctoring subset.</w:t>
+      </w:r>
+    </w:p>
     <w:p>
       <w:pPr>
         <w:sectPr>
@@ -4333,20 +4333,6 @@
         </w:sectPr>
       </w:pPr>
     </w:p>
-    <w:p>
-      <w:pPr>
-        <w:pStyle w:val="Normal-noindent"/>
-      </w:pPr>
-      <w:r>
-        <w:rPr>
-          <w:b/>
-        </w:rPr>
-        <w:t xml:space="preserve">Table 3: </w:t>
-      </w:r>
-      <w:r>
-        <w:t>Whisper-Base in content-free mode on the LibriSpeech-derived acoustic benchmark (400 clips, real read speech).</w:t>
-      </w:r>
-    </w:p>
     <w:tbl>
       <w:tblPr>
         <w:tblW w:type="auto" w:w="0"/>
@@ -4645,6 +4631,20 @@
         </w:tc>
       </w:tr>
     </w:tbl>
+    <w:p>
+      <w:pPr>
+        <w:pStyle w:val="Normal-noindent"/>
+      </w:pPr>
+      <w:r>
+        <w:rPr>
+          <w:b/>
+        </w:rPr>
+        <w:t xml:space="preserve">Table 3: </w:t>
+      </w:r>
+      <w:r>
+        <w:t>Whisper-Base in content-free mode on the LibriSpeech-derived acoustic benchmark (400 clips, real read speech).</w:t>
+      </w:r>
+    </w:p>
     <w:p>
       <w:pPr>
         <w:sectPr>
@@ -4818,20 +4818,6 @@
         </w:sectPr>
       </w:pPr>
     </w:p>
-    <w:p>
-      <w:pPr>
-        <w:pStyle w:val="Normal-noindent"/>
-      </w:pPr>
-      <w:r>
-        <w:rPr>
-          <w:b/>
-        </w:rPr>
-        <w:t xml:space="preserve">Table 4: </w:t>
-      </w:r>
-      <w:r>
-        <w:t>MediaPipe FaceMesh behavioural cues on 400 trajectories generated from 10 real CC-BY face anchors (Pexels portraits, programmatic head/lip motion applied to real MediaPipe landmarks).</w:t>
-      </w:r>
-    </w:p>
     <w:tbl>
       <w:tblPr>
         <w:tblW w:type="auto" w:w="0"/>
@@ -5065,6 +5051,20 @@
         </w:tc>
       </w:tr>
     </w:tbl>
+    <w:p>
+      <w:pPr>
+        <w:pStyle w:val="Normal-noindent"/>
+      </w:pPr>
+      <w:r>
+        <w:rPr>
+          <w:b/>
+        </w:rPr>
+        <w:t xml:space="preserve">Table 4: </w:t>
+      </w:r>
+      <w:r>
+        <w:t>MediaPipe FaceMesh behavioural cues on 400 trajectories generated from 10 real CC-BY face anchors (Pexels portraits, programmatic head/lip motion applied to real MediaPipe landmarks).</w:t>
+      </w:r>
+    </w:p>
     <w:p>
       <w:pPr>
         <w:sectPr>
@@ -5164,20 +5164,6 @@
         </w:sectPr>
       </w:pPr>
     </w:p>
-    <w:p>
-      <w:pPr>
-        <w:pStyle w:val="Normal-noindent"/>
-      </w:pPr>
-      <w:r>
-        <w:rPr>
-          <w:b/>
-        </w:rPr>
-        <w:t xml:space="preserve">Table 5: </w:t>
-      </w:r>
-      <w:r>
-        <w:t>Fusion strategy comparison (5-fold stratified CV on 300 real-feature sessions). Each session's features are real outputs of YOLOv8-s on a COCO image, Whisper-Base on a LibriSpeech mix, and MediaPipe FaceMesh on a Pexels face anchor.</w:t>
-      </w:r>
-    </w:p>
     <w:tbl>
       <w:tblPr>
         <w:tblW w:type="auto" w:w="0"/>
@@ -5769,6 +5755,20 @@
     </w:tbl>
     <w:p>
       <w:pPr>
+        <w:pStyle w:val="Normal-noindent"/>
+      </w:pPr>
+      <w:r>
+        <w:rPr>
+          <w:b/>
+        </w:rPr>
+        <w:t xml:space="preserve">Table 5: </w:t>
+      </w:r>
+      <w:r>
+        <w:t>Fusion strategy comparison (5-fold stratified CV on 300 real-feature sessions). Each session's features are real outputs of YOLOv8-s on a COCO image, Whisper-Base on a LibriSpeech mix, and MediaPipe FaceMesh on a Pexels face anchor.</w:t>
+      </w:r>
+    </w:p>
+    <w:p>
+      <w:pPr>
         <w:sectPr>
           <w:type w:val="continuous"/>
           <w:pgSz w:w="11906" w:h="16838"/>
@@ -5843,20 +5843,6 @@
           <w:cols w:num="2" w:space="284"/>
         </w:sectPr>
       </w:pPr>
-    </w:p>
-    <w:p>
-      <w:pPr>
-        <w:pStyle w:val="Normal-noindent"/>
-      </w:pPr>
-      <w:r>
-        <w:rPr>
-          <w:b/>
-        </w:rPr>
-        <w:t xml:space="preserve">Table 6: </w:t>
-      </w:r>
-      <w:r>
-        <w:t>Ablation of the random-forest fusion model on the 300 real-feature sessions. Upper block: leave-one-modality-out. Lower block: single modality only.</w:t>
-      </w:r>
     </w:p>
     <w:tbl>
       <w:tblPr>
@@ -6263,6 +6249,20 @@
         </w:tc>
       </w:tr>
     </w:tbl>
+    <w:p>
+      <w:pPr>
+        <w:pStyle w:val="Normal-noindent"/>
+      </w:pPr>
+      <w:r>
+        <w:rPr>
+          <w:b/>
+        </w:rPr>
+        <w:t xml:space="preserve">Table 6: </w:t>
+      </w:r>
+      <w:r>
+        <w:t>Ablation of the random-forest fusion model on the 300 real-feature sessions. Upper block: leave-one-modality-out. Lower block: single modality only.</w:t>
+      </w:r>
+    </w:p>
     <w:p>
       <w:pPr>
         <w:sectPr>
@@ -6544,20 +6544,6 @@
         </w:sectPr>
       </w:pPr>
     </w:p>
-    <w:p>
-      <w:pPr>
-        <w:pStyle w:val="Normal-noindent"/>
-      </w:pPr>
-      <w:r>
-        <w:rPr>
-          <w:b/>
-        </w:rPr>
-        <w:t xml:space="preserve">Table 7: </w:t>
-      </w:r>
-      <w:r>
-        <w:t>Inference latency on the Apple M4 Max host (mean ± SD over 80 calls after a 3-call warm-up; median, p95 and p99 in ms).</w:t>
-      </w:r>
-    </w:p>
     <w:tbl>
       <w:tblPr>
         <w:tblW w:type="auto" w:w="0"/>
@@ -7607,6 +7593,20 @@
         </w:tc>
       </w:tr>
     </w:tbl>
+    <w:p>
+      <w:pPr>
+        <w:pStyle w:val="Normal-noindent"/>
+      </w:pPr>
+      <w:r>
+        <w:rPr>
+          <w:b/>
+        </w:rPr>
+        <w:t xml:space="preserve">Table 7: </w:t>
+      </w:r>
+      <w:r>
+        <w:t>Inference latency on the Apple M4 Max host (mean ± SD over 80 calls after a 3-call warm-up; median, p95 and p99 in ms).</w:t>
+      </w:r>
+    </w:p>
     <w:p>
       <w:pPr>
         <w:sectPr>

</xml_diff>

<commit_message>
Remove redundant orphan reference to Figure 1 in Section 3
Section 3.1 (Design Principles) ended with a standalone 'Figure 1 shows the
end-to-end pipeline.', immediately followed by 3.2 reintroducing the same figure
('The pipeline (Figure 1) consists of four logical stages'). Drop the orphan
sentence and fold 'end-to-end' into the 3.2 introduction so the figure is
referenced once, where it is described.
</commit_message>
<xml_diff>
--- a/manuscript/Article_Informatica.docx
+++ b/manuscript/Article_Informatica.docx
@@ -1870,12 +1870,6 @@
       </w:r>
     </w:p>
     <w:p>
-      <w:pPr/>
-      <w:r>
-        <w:t>Figure 1 shows the end-to-end pipeline.</w:t>
-      </w:r>
-    </w:p>
-    <w:p>
       <w:pPr>
         <w:pStyle w:val="Heading2"/>
       </w:pPr>
@@ -1891,7 +1885,7 @@
         <w:pStyle w:val="Normal-noindent"/>
       </w:pPr>
       <w:r>
-        <w:t>The pipeline (Figure 1) consists of four logical stages:</w:t>
+        <w:t>The end-to-end pipeline (Figure 1) consists of four logical stages:</w:t>
       </w:r>
     </w:p>
     <w:p>

</xml_diff>

<commit_message>
Fix (B) bullet alignment, enable hyphenation, keep running head unbroken
Three formatting fixes from a full page-by-page proofread:
- List items (bullets and numbered) now use a left-aligned hanging indent with a
  tab, so the marker sits at the margin and wrapped lines align under the text.
  Previously a list item long enough to wrap (the '(B) Behavioural biometrics'
  axis) had its first line justified/stretched, making the marker look misaligned
  against the single-line items.
- Enable automatic hyphenation. The body is justified in narrow two columns;
  without it, long words opened wide inter-word gaps ('rivers'). This matches the
  journal's hyphenated final typeset.
- Suppress hyphenation inside the running heads so global hyphenation does not
  break 'Informatica' mid-word in the header.
</commit_message>
<xml_diff>
--- a/manuscript/Article_Informatica.docx
+++ b/manuscript/Article_Informatica.docx
@@ -208,12 +208,18 @@
     <w:p>
       <w:pPr>
         <w:pStyle w:val="Normal-noindent"/>
-      </w:pPr>
-      <w:r>
-        <w:rPr>
-          <w:b/>
-        </w:rPr>
-        <w:t xml:space="preserve">1. </w:t>
+        <w:tabs>
+          <w:tab w:pos="300" w:val="left"/>
+        </w:tabs>
+        <w:ind w:left="300" w:hanging="300"/>
+        <w:jc w:val="left"/>
+      </w:pPr>
+      <w:r>
+        <w:rPr>
+          <w:b/>
+        </w:rPr>
+        <w:t>1.</w:t>
+        <w:tab/>
       </w:r>
       <w:r>
         <w:rPr>
@@ -228,12 +234,18 @@
     <w:p>
       <w:pPr>
         <w:pStyle w:val="Normal-noindent"/>
-      </w:pPr>
-      <w:r>
-        <w:rPr>
-          <w:b/>
-        </w:rPr>
-        <w:t xml:space="preserve">2. </w:t>
+        <w:tabs>
+          <w:tab w:pos="300" w:val="left"/>
+        </w:tabs>
+        <w:ind w:left="300" w:hanging="300"/>
+        <w:jc w:val="left"/>
+      </w:pPr>
+      <w:r>
+        <w:rPr>
+          <w:b/>
+        </w:rPr>
+        <w:t>2.</w:t>
+        <w:tab/>
       </w:r>
       <w:r>
         <w:rPr>
@@ -248,12 +260,18 @@
     <w:p>
       <w:pPr>
         <w:pStyle w:val="Normal-noindent"/>
-      </w:pPr>
-      <w:r>
-        <w:rPr>
-          <w:b/>
-        </w:rPr>
-        <w:t xml:space="preserve">3. </w:t>
+        <w:tabs>
+          <w:tab w:pos="300" w:val="left"/>
+        </w:tabs>
+        <w:ind w:left="300" w:hanging="300"/>
+        <w:jc w:val="left"/>
+      </w:pPr>
+      <w:r>
+        <w:rPr>
+          <w:b/>
+        </w:rPr>
+        <w:t>3.</w:t>
+        <w:tab/>
       </w:r>
       <w:r>
         <w:rPr>
@@ -287,9 +305,15 @@
     <w:p>
       <w:pPr>
         <w:pStyle w:val="Normal-noindent"/>
-      </w:pPr>
-      <w:r>
-        <w:t xml:space="preserve">• </w:t>
+        <w:tabs>
+          <w:tab w:pos="300" w:val="left"/>
+        </w:tabs>
+        <w:ind w:left="300" w:hanging="300"/>
+        <w:jc w:val="left"/>
+      </w:pPr>
+      <w:r>
+        <w:t>•</w:t>
+        <w:tab/>
       </w:r>
       <w:r>
         <w:rPr>
@@ -304,9 +328,15 @@
     <w:p>
       <w:pPr>
         <w:pStyle w:val="Normal-noindent"/>
-      </w:pPr>
-      <w:r>
-        <w:t xml:space="preserve">• </w:t>
+        <w:tabs>
+          <w:tab w:pos="300" w:val="left"/>
+        </w:tabs>
+        <w:ind w:left="300" w:hanging="300"/>
+        <w:jc w:val="left"/>
+      </w:pPr>
+      <w:r>
+        <w:t>•</w:t>
+        <w:tab/>
       </w:r>
       <w:r>
         <w:rPr>
@@ -321,9 +351,15 @@
     <w:p>
       <w:pPr>
         <w:pStyle w:val="Normal-noindent"/>
-      </w:pPr>
-      <w:r>
-        <w:t xml:space="preserve">• </w:t>
+        <w:tabs>
+          <w:tab w:pos="300" w:val="left"/>
+        </w:tabs>
+        <w:ind w:left="300" w:hanging="300"/>
+        <w:jc w:val="left"/>
+      </w:pPr>
+      <w:r>
+        <w:t>•</w:t>
+        <w:tab/>
       </w:r>
       <w:r>
         <w:rPr>
@@ -347,9 +383,15 @@
     <w:p>
       <w:pPr>
         <w:pStyle w:val="Normal-noindent"/>
-      </w:pPr>
-      <w:r>
-        <w:t xml:space="preserve">• </w:t>
+        <w:tabs>
+          <w:tab w:pos="300" w:val="left"/>
+        </w:tabs>
+        <w:ind w:left="300" w:hanging="300"/>
+        <w:jc w:val="left"/>
+      </w:pPr>
+      <w:r>
+        <w:t>•</w:t>
+        <w:tab/>
       </w:r>
       <w:r>
         <w:rPr>
@@ -402,9 +444,15 @@
     <w:p>
       <w:pPr>
         <w:pStyle w:val="Normal-noindent"/>
-      </w:pPr>
-      <w:r>
-        <w:t xml:space="preserve">• </w:t>
+        <w:tabs>
+          <w:tab w:pos="300" w:val="left"/>
+        </w:tabs>
+        <w:ind w:left="300" w:hanging="300"/>
+        <w:jc w:val="left"/>
+      </w:pPr>
+      <w:r>
+        <w:t>•</w:t>
+        <w:tab/>
       </w:r>
       <w:r>
         <w:t>(V) Vision-based proctoring,</w:t>
@@ -413,9 +461,15 @@
     <w:p>
       <w:pPr>
         <w:pStyle w:val="Normal-noindent"/>
-      </w:pPr>
-      <w:r>
-        <w:t xml:space="preserve">• </w:t>
+        <w:tabs>
+          <w:tab w:pos="300" w:val="left"/>
+        </w:tabs>
+        <w:ind w:left="300" w:hanging="300"/>
+        <w:jc w:val="left"/>
+      </w:pPr>
+      <w:r>
+        <w:t>•</w:t>
+        <w:tab/>
       </w:r>
       <w:r>
         <w:t>(A) Audio-based proctoring,</w:t>
@@ -424,9 +478,15 @@
     <w:p>
       <w:pPr>
         <w:pStyle w:val="Normal-noindent"/>
-      </w:pPr>
-      <w:r>
-        <w:t xml:space="preserve">• </w:t>
+        <w:tabs>
+          <w:tab w:pos="300" w:val="left"/>
+        </w:tabs>
+        <w:ind w:left="300" w:hanging="300"/>
+        <w:jc w:val="left"/>
+      </w:pPr>
+      <w:r>
+        <w:t>•</w:t>
+        <w:tab/>
       </w:r>
       <w:r>
         <w:t>(M) Multi-modal proctoring,</w:t>
@@ -435,9 +495,15 @@
     <w:p>
       <w:pPr>
         <w:pStyle w:val="Normal-noindent"/>
-      </w:pPr>
-      <w:r>
-        <w:t xml:space="preserve">• </w:t>
+        <w:tabs>
+          <w:tab w:pos="300" w:val="left"/>
+        </w:tabs>
+        <w:ind w:left="300" w:hanging="300"/>
+        <w:jc w:val="left"/>
+      </w:pPr>
+      <w:r>
+        <w:t>•</w:t>
+        <w:tab/>
       </w:r>
       <w:r>
         <w:t>(B) Behavioural biometrics (keystroke, mouse dynamics),</w:t>
@@ -446,9 +512,15 @@
     <w:p>
       <w:pPr>
         <w:pStyle w:val="Normal-noindent"/>
-      </w:pPr>
-      <w:r>
-        <w:t xml:space="preserve">• </w:t>
+        <w:tabs>
+          <w:tab w:pos="300" w:val="left"/>
+        </w:tabs>
+        <w:ind w:left="300" w:hanging="300"/>
+        <w:jc w:val="left"/>
+      </w:pPr>
+      <w:r>
+        <w:t>•</w:t>
+        <w:tab/>
       </w:r>
       <w:r>
         <w:t>(P) Privacy-preserving and federated approaches.</w:t>
@@ -1838,9 +1910,15 @@
     <w:p>
       <w:pPr>
         <w:pStyle w:val="Normal-noindent"/>
-      </w:pPr>
-      <w:r>
-        <w:t xml:space="preserve">• </w:t>
+        <w:tabs>
+          <w:tab w:pos="300" w:val="left"/>
+        </w:tabs>
+        <w:ind w:left="300" w:hanging="300"/>
+        <w:jc w:val="left"/>
+      </w:pPr>
+      <w:r>
+        <w:t>•</w:t>
+        <w:tab/>
       </w:r>
       <w:r>
         <w:rPr>
@@ -1855,9 +1933,15 @@
     <w:p>
       <w:pPr>
         <w:pStyle w:val="Normal-noindent"/>
-      </w:pPr>
-      <w:r>
-        <w:t xml:space="preserve">• </w:t>
+        <w:tabs>
+          <w:tab w:pos="300" w:val="left"/>
+        </w:tabs>
+        <w:ind w:left="300" w:hanging="300"/>
+        <w:jc w:val="left"/>
+      </w:pPr>
+      <w:r>
+        <w:t>•</w:t>
+        <w:tab/>
       </w:r>
       <w:r>
         <w:rPr>
@@ -1891,12 +1975,18 @@
     <w:p>
       <w:pPr>
         <w:pStyle w:val="Normal-noindent"/>
-      </w:pPr>
-      <w:r>
-        <w:rPr>
-          <w:b/>
-        </w:rPr>
-        <w:t xml:space="preserve">1. </w:t>
+        <w:tabs>
+          <w:tab w:pos="300" w:val="left"/>
+        </w:tabs>
+        <w:ind w:left="300" w:hanging="300"/>
+        <w:jc w:val="left"/>
+      </w:pPr>
+      <w:r>
+        <w:rPr>
+          <w:b/>
+        </w:rPr>
+        <w:t>1.</w:t>
+        <w:tab/>
       </w:r>
       <w:r>
         <w:rPr>
@@ -1911,12 +2001,18 @@
     <w:p>
       <w:pPr>
         <w:pStyle w:val="Normal-noindent"/>
-      </w:pPr>
-      <w:r>
-        <w:rPr>
-          <w:b/>
-        </w:rPr>
-        <w:t xml:space="preserve">2. </w:t>
+        <w:tabs>
+          <w:tab w:pos="300" w:val="left"/>
+        </w:tabs>
+        <w:ind w:left="300" w:hanging="300"/>
+        <w:jc w:val="left"/>
+      </w:pPr>
+      <w:r>
+        <w:rPr>
+          <w:b/>
+        </w:rPr>
+        <w:t>2.</w:t>
+        <w:tab/>
       </w:r>
       <w:r>
         <w:rPr>
@@ -1931,12 +2027,18 @@
     <w:p>
       <w:pPr>
         <w:pStyle w:val="Normal-noindent"/>
-      </w:pPr>
-      <w:r>
-        <w:rPr>
-          <w:b/>
-        </w:rPr>
-        <w:t xml:space="preserve">3. </w:t>
+        <w:tabs>
+          <w:tab w:pos="300" w:val="left"/>
+        </w:tabs>
+        <w:ind w:left="300" w:hanging="300"/>
+        <w:jc w:val="left"/>
+      </w:pPr>
+      <w:r>
+        <w:rPr>
+          <w:b/>
+        </w:rPr>
+        <w:t>3.</w:t>
+        <w:tab/>
       </w:r>
       <w:r>
         <w:rPr>
@@ -1951,12 +2053,18 @@
     <w:p>
       <w:pPr>
         <w:pStyle w:val="Normal-noindent"/>
-      </w:pPr>
-      <w:r>
-        <w:rPr>
-          <w:b/>
-        </w:rPr>
-        <w:t xml:space="preserve">4. </w:t>
+        <w:tabs>
+          <w:tab w:pos="300" w:val="left"/>
+        </w:tabs>
+        <w:ind w:left="300" w:hanging="300"/>
+        <w:jc w:val="left"/>
+      </w:pPr>
+      <w:r>
+        <w:rPr>
+          <w:b/>
+        </w:rPr>
+        <w:t>4.</w:t>
+        <w:tab/>
       </w:r>
       <w:r>
         <w:rPr>
@@ -2073,9 +2181,15 @@
     <w:p>
       <w:pPr>
         <w:pStyle w:val="Normal-noindent"/>
-      </w:pPr>
-      <w:r>
-        <w:t xml:space="preserve">• </w:t>
+        <w:tabs>
+          <w:tab w:pos="300" w:val="left"/>
+        </w:tabs>
+        <w:ind w:left="300" w:hanging="300"/>
+        <w:jc w:val="left"/>
+      </w:pPr>
+      <w:r>
+        <w:t>•</w:t>
+        <w:tab/>
       </w:r>
       <w:r>
         <w:rPr>
@@ -2090,9 +2204,15 @@
     <w:p>
       <w:pPr>
         <w:pStyle w:val="Normal-noindent"/>
-      </w:pPr>
-      <w:r>
-        <w:t xml:space="preserve">• </w:t>
+        <w:tabs>
+          <w:tab w:pos="300" w:val="left"/>
+        </w:tabs>
+        <w:ind w:left="300" w:hanging="300"/>
+        <w:jc w:val="left"/>
+      </w:pPr>
+      <w:r>
+        <w:t>•</w:t>
+        <w:tab/>
       </w:r>
       <w:r>
         <w:rPr>
@@ -2107,9 +2227,15 @@
     <w:p>
       <w:pPr>
         <w:pStyle w:val="Normal-noindent"/>
-      </w:pPr>
-      <w:r>
-        <w:t xml:space="preserve">• </w:t>
+        <w:tabs>
+          <w:tab w:pos="300" w:val="left"/>
+        </w:tabs>
+        <w:ind w:left="300" w:hanging="300"/>
+        <w:jc w:val="left"/>
+      </w:pPr>
+      <w:r>
+        <w:t>•</w:t>
+        <w:tab/>
       </w:r>
       <w:r>
         <w:rPr>
@@ -2358,9 +2484,15 @@
     <w:p>
       <w:pPr>
         <w:pStyle w:val="Normal-noindent"/>
-      </w:pPr>
-      <w:r>
-        <w:t xml:space="preserve">• </w:t>
+        <w:tabs>
+          <w:tab w:pos="300" w:val="left"/>
+        </w:tabs>
+        <w:ind w:left="300" w:hanging="300"/>
+        <w:jc w:val="left"/>
+      </w:pPr>
+      <w:r>
+        <w:t>•</w:t>
+        <w:tab/>
       </w:r>
       <w:r>
         <w:rPr>
@@ -2387,9 +2519,15 @@
     <w:p>
       <w:pPr>
         <w:pStyle w:val="Normal-noindent"/>
-      </w:pPr>
-      <w:r>
-        <w:t xml:space="preserve">• </w:t>
+        <w:tabs>
+          <w:tab w:pos="300" w:val="left"/>
+        </w:tabs>
+        <w:ind w:left="300" w:hanging="300"/>
+        <w:jc w:val="left"/>
+      </w:pPr>
+      <w:r>
+        <w:t>•</w:t>
+        <w:tab/>
       </w:r>
       <w:r>
         <w:rPr>
@@ -2437,9 +2575,15 @@
     <w:p>
       <w:pPr>
         <w:pStyle w:val="Normal-noindent"/>
-      </w:pPr>
-      <w:r>
-        <w:t xml:space="preserve">• </w:t>
+        <w:tabs>
+          <w:tab w:pos="300" w:val="left"/>
+        </w:tabs>
+        <w:ind w:left="300" w:hanging="300"/>
+        <w:jc w:val="left"/>
+      </w:pPr>
+      <w:r>
+        <w:t>•</w:t>
+        <w:tab/>
       </w:r>
       <w:r>
         <w:rPr>
@@ -2557,9 +2701,15 @@
     <w:p>
       <w:pPr>
         <w:pStyle w:val="Normal-noindent"/>
-      </w:pPr>
-      <w:r>
-        <w:t xml:space="preserve">• </w:t>
+        <w:tabs>
+          <w:tab w:pos="300" w:val="left"/>
+        </w:tabs>
+        <w:ind w:left="300" w:hanging="300"/>
+        <w:jc w:val="left"/>
+      </w:pPr>
+      <w:r>
+        <w:t>•</w:t>
+        <w:tab/>
       </w:r>
       <w:r>
         <w:rPr>
@@ -2580,9 +2730,15 @@
     <w:p>
       <w:pPr>
         <w:pStyle w:val="Normal-noindent"/>
-      </w:pPr>
-      <w:r>
-        <w:t xml:space="preserve">• </w:t>
+        <w:tabs>
+          <w:tab w:pos="300" w:val="left"/>
+        </w:tabs>
+        <w:ind w:left="300" w:hanging="300"/>
+        <w:jc w:val="left"/>
+      </w:pPr>
+      <w:r>
+        <w:t>•</w:t>
+        <w:tab/>
       </w:r>
       <w:r>
         <w:rPr>
@@ -2603,9 +2759,15 @@
     <w:p>
       <w:pPr>
         <w:pStyle w:val="Normal-noindent"/>
-      </w:pPr>
-      <w:r>
-        <w:t xml:space="preserve">• </w:t>
+        <w:tabs>
+          <w:tab w:pos="300" w:val="left"/>
+        </w:tabs>
+        <w:ind w:left="300" w:hanging="300"/>
+        <w:jc w:val="left"/>
+      </w:pPr>
+      <w:r>
+        <w:t>•</w:t>
+        <w:tab/>
       </w:r>
       <w:r>
         <w:rPr>
@@ -2626,9 +2788,15 @@
     <w:p>
       <w:pPr>
         <w:pStyle w:val="Normal-noindent"/>
-      </w:pPr>
-      <w:r>
-        <w:t xml:space="preserve">• </w:t>
+        <w:tabs>
+          <w:tab w:pos="300" w:val="left"/>
+        </w:tabs>
+        <w:ind w:left="300" w:hanging="300"/>
+        <w:jc w:val="left"/>
+      </w:pPr>
+      <w:r>
+        <w:t>•</w:t>
+        <w:tab/>
       </w:r>
       <w:r>
         <w:rPr>
@@ -2950,12 +3118,18 @@
     <w:p>
       <w:pPr>
         <w:pStyle w:val="Normal-noindent"/>
-      </w:pPr>
-      <w:r>
-        <w:rPr>
-          <w:b/>
-        </w:rPr>
-        <w:t xml:space="preserve">1. </w:t>
+        <w:tabs>
+          <w:tab w:pos="300" w:val="left"/>
+        </w:tabs>
+        <w:ind w:left="300" w:hanging="300"/>
+        <w:jc w:val="left"/>
+      </w:pPr>
+      <w:r>
+        <w:rPr>
+          <w:b/>
+        </w:rPr>
+        <w:t>1.</w:t>
+        <w:tab/>
       </w:r>
       <w:r>
         <w:rPr>
@@ -2988,12 +3162,18 @@
     <w:p>
       <w:pPr>
         <w:pStyle w:val="Normal-noindent"/>
-      </w:pPr>
-      <w:r>
-        <w:rPr>
-          <w:b/>
-        </w:rPr>
-        <w:t xml:space="preserve">2. </w:t>
+        <w:tabs>
+          <w:tab w:pos="300" w:val="left"/>
+        </w:tabs>
+        <w:ind w:left="300" w:hanging="300"/>
+        <w:jc w:val="left"/>
+      </w:pPr>
+      <w:r>
+        <w:rPr>
+          <w:b/>
+        </w:rPr>
+        <w:t>2.</w:t>
+        <w:tab/>
       </w:r>
       <w:r>
         <w:rPr>
@@ -3005,12 +3185,18 @@
     <w:p>
       <w:pPr>
         <w:pStyle w:val="Normal-noindent"/>
-      </w:pPr>
-      <w:r>
-        <w:rPr>
-          <w:b/>
-        </w:rPr>
-        <w:t xml:space="preserve">3. </w:t>
+        <w:tabs>
+          <w:tab w:pos="300" w:val="left"/>
+        </w:tabs>
+        <w:ind w:left="300" w:hanging="300"/>
+        <w:jc w:val="left"/>
+      </w:pPr>
+      <w:r>
+        <w:rPr>
+          <w:b/>
+        </w:rPr>
+        <w:t>3.</w:t>
+        <w:tab/>
       </w:r>
       <w:r>
         <w:rPr>
@@ -3025,12 +3211,18 @@
     <w:p>
       <w:pPr>
         <w:pStyle w:val="Normal-noindent"/>
-      </w:pPr>
-      <w:r>
-        <w:rPr>
-          <w:b/>
-        </w:rPr>
-        <w:t xml:space="preserve">4. </w:t>
+        <w:tabs>
+          <w:tab w:pos="300" w:val="left"/>
+        </w:tabs>
+        <w:ind w:left="300" w:hanging="300"/>
+        <w:jc w:val="left"/>
+      </w:pPr>
+      <w:r>
+        <w:rPr>
+          <w:b/>
+        </w:rPr>
+        <w:t>4.</w:t>
+        <w:tab/>
       </w:r>
       <w:r>
         <w:rPr>
@@ -3045,12 +3237,18 @@
     <w:p>
       <w:pPr>
         <w:pStyle w:val="Normal-noindent"/>
-      </w:pPr>
-      <w:r>
-        <w:rPr>
-          <w:b/>
-        </w:rPr>
-        <w:t xml:space="preserve">5. </w:t>
+        <w:tabs>
+          <w:tab w:pos="300" w:val="left"/>
+        </w:tabs>
+        <w:ind w:left="300" w:hanging="300"/>
+        <w:jc w:val="left"/>
+      </w:pPr>
+      <w:r>
+        <w:rPr>
+          <w:b/>
+        </w:rPr>
+        <w:t>5.</w:t>
+        <w:tab/>
       </w:r>
       <w:r>
         <w:rPr>
@@ -3261,9 +3459,15 @@
     <w:p>
       <w:pPr>
         <w:pStyle w:val="Normal-noindent"/>
-      </w:pPr>
-      <w:r>
-        <w:t xml:space="preserve">• </w:t>
+        <w:tabs>
+          <w:tab w:pos="300" w:val="left"/>
+        </w:tabs>
+        <w:ind w:left="300" w:hanging="300"/>
+        <w:jc w:val="left"/>
+      </w:pPr>
+      <w:r>
+        <w:t>•</w:t>
+        <w:tab/>
       </w:r>
       <w:r>
         <w:rPr>
@@ -3278,9 +3482,15 @@
     <w:p>
       <w:pPr>
         <w:pStyle w:val="Normal-noindent"/>
-      </w:pPr>
-      <w:r>
-        <w:t xml:space="preserve">• </w:t>
+        <w:tabs>
+          <w:tab w:pos="300" w:val="left"/>
+        </w:tabs>
+        <w:ind w:left="300" w:hanging="300"/>
+        <w:jc w:val="left"/>
+      </w:pPr>
+      <w:r>
+        <w:t>•</w:t>
+        <w:tab/>
       </w:r>
       <w:r>
         <w:rPr>
@@ -3313,9 +3523,15 @@
     <w:p>
       <w:pPr>
         <w:pStyle w:val="Normal-noindent"/>
-      </w:pPr>
-      <w:r>
-        <w:t xml:space="preserve">• </w:t>
+        <w:tabs>
+          <w:tab w:pos="300" w:val="left"/>
+        </w:tabs>
+        <w:ind w:left="300" w:hanging="300"/>
+        <w:jc w:val="left"/>
+      </w:pPr>
+      <w:r>
+        <w:t>•</w:t>
+        <w:tab/>
       </w:r>
       <w:r>
         <w:rPr>
@@ -3330,9 +3546,15 @@
     <w:p>
       <w:pPr>
         <w:pStyle w:val="Normal-noindent"/>
-      </w:pPr>
-      <w:r>
-        <w:t xml:space="preserve">• </w:t>
+        <w:tabs>
+          <w:tab w:pos="300" w:val="left"/>
+        </w:tabs>
+        <w:ind w:left="300" w:hanging="300"/>
+        <w:jc w:val="left"/>
+      </w:pPr>
+      <w:r>
+        <w:t>•</w:t>
+        <w:tab/>
       </w:r>
       <w:r>
         <w:rPr>
@@ -8450,9 +8672,15 @@
     <w:p>
       <w:pPr>
         <w:pStyle w:val="Normal-noindent"/>
-      </w:pPr>
-      <w:r>
-        <w:t xml:space="preserve">• </w:t>
+        <w:tabs>
+          <w:tab w:pos="300" w:val="left"/>
+        </w:tabs>
+        <w:ind w:left="300" w:hanging="300"/>
+        <w:jc w:val="left"/>
+      </w:pPr>
+      <w:r>
+        <w:t>•</w:t>
+        <w:tab/>
       </w:r>
       <w:r>
         <w:t xml:space="preserve">A raw-audio attacker that extracts mel-frequency cepstral coefficients from the raw 16 kHz buffer (the kind of artefact a conventional proctoring system would retain) achieves a re-identification AUC of </w:t>
@@ -8470,9 +8698,15 @@
     <w:p>
       <w:pPr>
         <w:pStyle w:val="Normal-noindent"/>
-      </w:pPr>
-      <w:r>
-        <w:t xml:space="preserve">• </w:t>
+        <w:tabs>
+          <w:tab w:pos="300" w:val="left"/>
+        </w:tabs>
+        <w:ind w:left="300" w:hanging="300"/>
+        <w:jc w:val="left"/>
+      </w:pPr>
+      <w:r>
+        <w:t>•</w:t>
+        <w:tab/>
       </w:r>
       <w:r>
         <w:t xml:space="preserve">A metadata attacker restricted to the </w:t>
@@ -8604,9 +8838,15 @@
     <w:p>
       <w:pPr>
         <w:pStyle w:val="Normal-noindent"/>
-      </w:pPr>
-      <w:r>
-        <w:t xml:space="preserve">• </w:t>
+        <w:tabs>
+          <w:tab w:pos="300" w:val="left"/>
+        </w:tabs>
+        <w:ind w:left="300" w:hanging="300"/>
+        <w:jc w:val="left"/>
+      </w:pPr>
+      <w:r>
+        <w:t>•</w:t>
+        <w:tab/>
       </w:r>
       <w:r>
         <w:rPr>
@@ -8621,9 +8861,15 @@
     <w:p>
       <w:pPr>
         <w:pStyle w:val="Normal-noindent"/>
-      </w:pPr>
-      <w:r>
-        <w:t xml:space="preserve">• </w:t>
+        <w:tabs>
+          <w:tab w:pos="300" w:val="left"/>
+        </w:tabs>
+        <w:ind w:left="300" w:hanging="300"/>
+        <w:jc w:val="left"/>
+      </w:pPr>
+      <w:r>
+        <w:t>•</w:t>
+        <w:tab/>
       </w:r>
       <w:r>
         <w:rPr>
@@ -8638,9 +8884,15 @@
     <w:p>
       <w:pPr>
         <w:pStyle w:val="Normal-noindent"/>
-      </w:pPr>
-      <w:r>
-        <w:t xml:space="preserve">• </w:t>
+        <w:tabs>
+          <w:tab w:pos="300" w:val="left"/>
+        </w:tabs>
+        <w:ind w:left="300" w:hanging="300"/>
+        <w:jc w:val="left"/>
+      </w:pPr>
+      <w:r>
+        <w:t>•</w:t>
+        <w:tab/>
       </w:r>
       <w:r>
         <w:rPr>
@@ -8655,9 +8907,15 @@
     <w:p>
       <w:pPr>
         <w:pStyle w:val="Normal-noindent"/>
-      </w:pPr>
-      <w:r>
-        <w:t xml:space="preserve">• </w:t>
+        <w:tabs>
+          <w:tab w:pos="300" w:val="left"/>
+        </w:tabs>
+        <w:ind w:left="300" w:hanging="300"/>
+        <w:jc w:val="left"/>
+      </w:pPr>
+      <w:r>
+        <w:t>•</w:t>
+        <w:tab/>
       </w:r>
       <w:r>
         <w:rPr>
@@ -8789,12 +9047,18 @@
     <w:p>
       <w:pPr>
         <w:pStyle w:val="Normal-noindent"/>
-      </w:pPr>
-      <w:r>
-        <w:rPr>
-          <w:b/>
-        </w:rPr>
-        <w:t xml:space="preserve">1. </w:t>
+        <w:tabs>
+          <w:tab w:pos="300" w:val="left"/>
+        </w:tabs>
+        <w:ind w:left="300" w:hanging="300"/>
+        <w:jc w:val="left"/>
+      </w:pPr>
+      <w:r>
+        <w:rPr>
+          <w:b/>
+        </w:rPr>
+        <w:t>1.</w:t>
+        <w:tab/>
       </w:r>
       <w:r>
         <w:rPr>
@@ -8809,12 +9073,18 @@
     <w:p>
       <w:pPr>
         <w:pStyle w:val="Normal-noindent"/>
-      </w:pPr>
-      <w:r>
-        <w:rPr>
-          <w:b/>
-        </w:rPr>
-        <w:t xml:space="preserve">2. </w:t>
+        <w:tabs>
+          <w:tab w:pos="300" w:val="left"/>
+        </w:tabs>
+        <w:ind w:left="300" w:hanging="300"/>
+        <w:jc w:val="left"/>
+      </w:pPr>
+      <w:r>
+        <w:rPr>
+          <w:b/>
+        </w:rPr>
+        <w:t>2.</w:t>
+        <w:tab/>
       </w:r>
       <w:r>
         <w:rPr>
@@ -8829,12 +9099,18 @@
     <w:p>
       <w:pPr>
         <w:pStyle w:val="Normal-noindent"/>
-      </w:pPr>
-      <w:r>
-        <w:rPr>
-          <w:b/>
-        </w:rPr>
-        <w:t xml:space="preserve">3. </w:t>
+        <w:tabs>
+          <w:tab w:pos="300" w:val="left"/>
+        </w:tabs>
+        <w:ind w:left="300" w:hanging="300"/>
+        <w:jc w:val="left"/>
+      </w:pPr>
+      <w:r>
+        <w:rPr>
+          <w:b/>
+        </w:rPr>
+        <w:t>3.</w:t>
+        <w:tab/>
       </w:r>
       <w:r>
         <w:rPr>
@@ -8849,12 +9125,18 @@
     <w:p>
       <w:pPr>
         <w:pStyle w:val="Normal-noindent"/>
-      </w:pPr>
-      <w:r>
-        <w:rPr>
-          <w:b/>
-        </w:rPr>
-        <w:t xml:space="preserve">4. </w:t>
+        <w:tabs>
+          <w:tab w:pos="300" w:val="left"/>
+        </w:tabs>
+        <w:ind w:left="300" w:hanging="300"/>
+        <w:jc w:val="left"/>
+      </w:pPr>
+      <w:r>
+        <w:rPr>
+          <w:b/>
+        </w:rPr>
+        <w:t>4.</w:t>
+        <w:tab/>
       </w:r>
       <w:r>
         <w:rPr>
@@ -8869,12 +9151,18 @@
     <w:p>
       <w:pPr>
         <w:pStyle w:val="Normal-noindent"/>
-      </w:pPr>
-      <w:r>
-        <w:rPr>
-          <w:b/>
-        </w:rPr>
-        <w:t xml:space="preserve">5. </w:t>
+        <w:tabs>
+          <w:tab w:pos="300" w:val="left"/>
+        </w:tabs>
+        <w:ind w:left="300" w:hanging="300"/>
+        <w:jc w:val="left"/>
+      </w:pPr>
+      <w:r>
+        <w:rPr>
+          <w:b/>
+        </w:rPr>
+        <w:t>5.</w:t>
+        <w:tab/>
       </w:r>
       <w:r>
         <w:rPr>
@@ -8895,9 +9183,15 @@
     <w:p>
       <w:pPr>
         <w:pStyle w:val="Normal-noindent"/>
-      </w:pPr>
-      <w:r>
-        <w:t xml:space="preserve">• </w:t>
+        <w:tabs>
+          <w:tab w:pos="300" w:val="left"/>
+        </w:tabs>
+        <w:ind w:left="300" w:hanging="300"/>
+        <w:jc w:val="left"/>
+      </w:pPr>
+      <w:r>
+        <w:t>•</w:t>
+        <w:tab/>
       </w:r>
       <w:r>
         <w:t>Differentially private gaze and lip-movement signals to bound information leakage to a configurable ε budget.</w:t>
@@ -8906,9 +9200,15 @@
     <w:p>
       <w:pPr>
         <w:pStyle w:val="Normal-noindent"/>
-      </w:pPr>
-      <w:r>
-        <w:t xml:space="preserve">• </w:t>
+        <w:tabs>
+          <w:tab w:pos="300" w:val="left"/>
+        </w:tabs>
+        <w:ind w:left="300" w:hanging="300"/>
+        <w:jc w:val="left"/>
+      </w:pPr>
+      <w:r>
+        <w:t>•</w:t>
+        <w:tab/>
       </w:r>
       <w:r>
         <w:t>A tighter privacy-utility analysis of the differentially-private metadata layer, including formal (epsilon, delta) accounting across a full session and extension of the mechanism to the visual and behavioural metadata channels.</w:t>
@@ -8917,9 +9217,15 @@
     <w:p>
       <w:pPr>
         <w:pStyle w:val="Normal-noindent"/>
-      </w:pPr>
-      <w:r>
-        <w:t xml:space="preserve">• </w:t>
+        <w:tabs>
+          <w:tab w:pos="300" w:val="left"/>
+        </w:tabs>
+        <w:ind w:left="300" w:hanging="300"/>
+        <w:jc w:val="left"/>
+      </w:pPr>
+      <w:r>
+        <w:t>•</w:t>
+        <w:tab/>
       </w:r>
       <w:r>
         <w:t>A longitudinal study across at least three Moroccan universities to validate cross-cohort generalisation and gather examiner feedback for the active-learning loop.</w:t>
@@ -9834,6 +10140,7 @@
   <w:p>
     <w:pPr>
       <w:pStyle w:val="Header"/>
+      <w:suppressAutoHyphens w:val="true"/>
       <w:tabs>
         <w:tab w:val="left" w:pos="567"/>
       </w:tabs>
@@ -9928,6 +10235,7 @@
   <w:p>
     <w:pPr>
       <w:pStyle w:val="Header"/>
+      <w:suppressAutoHyphens w:val="true"/>
     </w:pPr>
     <w:r>
       <w:rPr>
@@ -9994,6 +10302,7 @@
   <w:p>
     <w:pPr>
       <w:pStyle w:val="Header"/>
+      <w:suppressAutoHyphens w:val="true"/>
       <w:tabs>
         <w:tab w:val="right" w:pos="9524"/>
       </w:tabs>

</xml_diff>

<commit_message>
Prose-flow proofread fixes from a 12-agent review
Objective fixes only (the dash and AI-tell sweeps came back clean; en-dashes are
all numeric ranges and there are zero em-dashes):
- Section 2.1: rewrite a garbled doubly-nested clause into two clean sentences and
  fold in the CNDP reference, removing the near-duplicate restatement that followed.
- Section 4.3: correct a cross-reference (the fusion model is identified in Section
  6.4, not 6.3).
- Section 4.2: drop the 'Crucially,' sentence-opener.
- Section 6.6: add the missing comma before 'so' joining two independent clauses.
- Section 6.7: remove a sentence that restated the preceding one.
- Section 8: drop a dangling definite article ('the secure-aggregation primitives').
- Consistency: 'Whisper-Base encoder (5-second buffer)' in Table 7 to match the prose;
  spell 'epsilon' in Section 8 to match the rest of the paper.
</commit_message>
<xml_diff>
--- a/manuscript/Article_Informatica.docx
+++ b/manuscript/Article_Informatica.docx
@@ -542,13 +542,7 @@
         <w:pStyle w:val="Normal-noindent"/>
       </w:pPr>
       <w:r>
-        <w:t>Early proctoring solutions rely heavily on computer vision pipelines that authenticate the candidate's identity and monitor behavioural irregularities, typically built on top of mature face-recognition technology [35] and general-purpose object detectors trained on large labelled corpora such as COCO and its extensions [49]. Atoum et al. [8] introduced one of the first end-to-end automated proctoring systems combining gaze tracking, head pose estimation, and continuous face verification on the basis of webcam imagery and a wearable secondary camera. The systematic review of Nigam et al. [9] documents 39 follow-up systems that build on this paradigm, typically combining convolutional networks for face/gaze monitoring with rule-based decision layers. More recent contributions explored YOLO-based detectors for prohibited objects [10], [11], building on the YOLO family of architectures [13], [33], [34]. Singh et al. [10] in particular reported a YOLO-based proctoring pipeline targeted at smartphone and book detection in controlled lighting conditions, while Vishal et al. [11] integrate gaze tracking with prohibited-object detection in a unified PyTorch pipeline. A central limitation of these vision-based pipelines is the dependence on persistent face templates and raw-video archives, which, where the templates are used to verify or identify the candidate, engage the GDPR Article 9 special-category regime [4].</w:t>
-      </w:r>
-    </w:p>
-    <w:p>
-      <w:pPr/>
-      <w:r>
-        <w:t>These approaches share an important limitation: they require either persistent biometric templates (face embeddings) or extensive raw-video retention, both of which raise significant GDPR Article 9 and CNDP Law 09-08 exposure once used for identification.</w:t>
+        <w:t>Early proctoring solutions rely heavily on computer vision pipelines that authenticate the candidate's identity and monitor behavioural irregularities, typically built on top of mature face-recognition technology [35] and general-purpose object detectors trained on large labelled corpora such as COCO and its extensions [49]. Atoum et al. [8] introduced one of the first end-to-end automated proctoring systems combining gaze tracking, head pose estimation, and continuous face verification on the basis of webcam imagery and a wearable secondary camera. The systematic review of Nigam et al. [9] documents 39 follow-up systems that build on this paradigm, typically combining convolutional networks for face/gaze monitoring with rule-based decision layers. More recent contributions explored YOLO-based detectors for prohibited objects [10], [11], building on the YOLO family of architectures [13], [33], [34]. Singh et al. [10] in particular reported a YOLO-based proctoring pipeline targeted at smartphone and book detection in controlled lighting conditions, while Vishal et al. [11] integrate gaze tracking with prohibited-object detection in a unified PyTorch pipeline. A central limitation of these vision-based pipelines is their dependence on persistent face templates and raw-video archives. When those templates are used to verify or identify the candidate, they engage the GDPR Article 9 special-category regime [4] and the analogous CNDP Law 09-08 provisions [5].</w:t>
       </w:r>
     </w:p>
     <w:p>
@@ -2874,7 +2868,7 @@
         <w:t>gate(a)</w:t>
       </w:r>
       <w:r>
-        <w:t xml:space="preserve"> is an activity gate that is near zero for silent buffers (built from a clipped function of the RMS in dBFS and VAR). Overlap and whisper probabilities follow analogous logistic mappings with their own coefficient set. Crucially, no decoder is ever called, so the linguistic content of the audio cannot be recovered.</w:t>
+        <w:t xml:space="preserve"> is an activity gate that is near zero for silent buffers (built from a clipped function of the RMS in dBFS and VAR). Overlap and whisper probabilities follow analogous logistic mappings with their own coefficient set. No decoder is ever called, so the linguistic content of the audio cannot be recovered.</w:t>
       </w:r>
     </w:p>
     <w:p>
@@ -3112,7 +3106,7 @@
         <w:t>(x)</w:t>
       </w:r>
       <w:r>
-        <w:t xml:space="preserve"> identified empirically (Section 6.3) among five candidates:</w:t>
+        <w:t xml:space="preserve"> identified empirically (Section 6.4) among five candidates:</w:t>
       </w:r>
     </w:p>
     <w:p>
@@ -7721,7 +7715,7 @@
             </w:pPr>
             <w:r/>
             <w:r>
-              <w:t>Whisper-Base encoder (5-s buffer)</w:t>
+              <w:t>Whisper-Base encoder (5-second buffer)</w:t>
             </w:r>
           </w:p>
         </w:tc>
@@ -8573,7 +8567,7 @@
         <w:pStyle w:val="Normal-noindent"/>
       </w:pPr>
       <w:r>
-        <w:t>Figure 13 shows the degradation curves. Visual class-presence recall on the COCO subset stays within 65–73% across gamma values from 0.4 (very dark) to 1.6 (very bright); the recall drops most sharply when the scale factor falls below 0.7 (≈ a more distant camera placement), reaching 61% at scale 0.5. For the acoustic module evaluated on LibriSpeech two-speaker mixes corrupted by additive white Gaussian noise, the mean secondary-speaker probability on positive clips stays strictly above the negative-clip mean across all SNRs from +30 dB down to +0 dB (0.69 vs 0.61 at SNR = 30 dB and 0.43 vs 0.40 at 0 dB), and the F1 at the calibrated operational threshold of 0.02 stays in the range 0.66–0.68. At SNR = −5 dB the positive and negative score distributions overlap (0.17 vs 0.20) and the detector should be considered unreliable. The recommended operating envelope is therefore gamma ∈ [0.6, 1.4], scale ≥ 0.7, and ambient SNR ≥ 0 dB. The fact that ROC AUC on noisy speech is close to chance even when F1 is well-defined indicates that the score distribution becomes bimodal under heavy noise (a few real two-speaker clips lose pitch fluctuation entirely while a few single-speaker clips are perturbed enough to exceed the threshold) so we recommend reading the F1 column rather than AUC under noisy conditions; the divergence between ROC and PR behaviour under class skew is itself well documented [46].</w:t>
+        <w:t>Figure 13 shows the degradation curves. Visual class-presence recall on the COCO subset stays within 65–73% across gamma values from 0.4 (very dark) to 1.6 (very bright); the recall drops most sharply when the scale factor falls below 0.7 (≈ a more distant camera placement), reaching 61% at scale 0.5. For the acoustic module evaluated on LibriSpeech two-speaker mixes corrupted by additive white Gaussian noise, the mean secondary-speaker probability on positive clips stays strictly above the negative-clip mean across all SNRs from +30 dB down to +0 dB (0.69 vs 0.61 at SNR = 30 dB and 0.43 vs 0.40 at 0 dB), and the F1 at the calibrated operational threshold of 0.02 stays in the range 0.66–0.68. At SNR = −5 dB the positive and negative score distributions overlap (0.17 vs 0.20) and the detector should be considered unreliable. The recommended operating envelope is therefore gamma ∈ [0.6, 1.4], scale ≥ 0.7, and ambient SNR ≥ 0 dB. The fact that ROC AUC on noisy speech is close to chance even when F1 is well-defined indicates that the score distribution becomes bimodal under heavy noise (a few real two-speaker clips lose pitch fluctuation entirely while a few single-speaker clips are perturbed enough to exceed the threshold), so we recommend reading the F1 column rather than AUC under noisy conditions; the divergence between ROC and PR behaviour under class skew is itself well documented [46].</w:t>
       </w:r>
     </w:p>
     <w:p>
@@ -8748,7 +8742,7 @@
     <w:p>
       <w:pPr/>
       <w:r>
-        <w:t>This grounds the privacy claim in measurable evidence rather than design assertions. The honest reading is that the undefended metadata is privacy-reducing relative to raw audio (0.816 versus 0.994) but not privacy-preserving on its own, and that a differentially-private emission layer is required to reach near-chance re-identifiability, at a quantified cost in detection power. The verification covers the acoustic channel only; LibriSpeech is audio-only, so the visual and behavioural metadata are not exercised here, and re-identifiability of the geometric descriptors is left to future work (Section 8).</w:t>
+        <w:t>The honest reading is that the undefended metadata is privacy-reducing relative to raw audio (0.816 versus 0.994) but not privacy-preserving on its own, and that a differentially-private emission layer is required to reach near-chance re-identifiability, at a quantified cost in detection power. The verification covers the acoustic channel only; LibriSpeech is audio-only, so the visual and behavioural metadata are not exercised here, and re-identifiability of the geometric descriptors is left to future work (Section 8).</w:t>
       </w:r>
     </w:p>
     <w:p>
@@ -9067,7 +9061,7 @@
         <w:t>No human user study yet.</w:t>
       </w:r>
       <w:r>
-        <w:t xml:space="preserve"> The visual evaluation uses real COCO data, the acoustic evaluation uses real LibriSpeech utterances, and the behavioural evaluation uses real MediaPipe FaceMesh trajectories computed from real face photographs. However, the fusion model and threshold calibration have not yet been validated on real recordings of students taking actual exams. A multi-site pilot study with informed consent and institutional ethics review is in preparation and is intentionally scoped as future work rather than embedded in the present feasibility-and-privacy-architecture paper. Federated training across multiple institutions [25], [26], coupled with the secure-aggregation primitives, will allow the model to be refined on decentralised real-exam data without aggregating biometric content.</w:t>
+        <w:t xml:space="preserve"> The visual evaluation uses real COCO data, the acoustic evaluation uses real LibriSpeech utterances, and the behavioural evaluation uses real MediaPipe FaceMesh trajectories computed from real face photographs. However, the fusion model and threshold calibration have not yet been validated on real recordings of students taking actual exams. A multi-site pilot study with informed consent and institutional ethics review is in preparation and is intentionally scoped as future work rather than embedded in the present feasibility-and-privacy-architecture paper. Federated training across multiple institutions [25], [26], coupled with secure-aggregation primitives, will allow the model to be refined on decentralised real-exam data without aggregating biometric content.</w:t>
       </w:r>
     </w:p>
     <w:p>
@@ -9194,7 +9188,7 @@
         <w:tab/>
       </w:r>
       <w:r>
-        <w:t>Differentially private gaze and lip-movement signals to bound information leakage to a configurable ε budget.</w:t>
+        <w:t>Differentially private gaze and lip-movement signals to bound information leakage to a configurable epsilon budget.</w:t>
       </w:r>
     </w:p>
     <w:p>

</xml_diff>